<commit_message>
Fix deletion capture: IsDeleted was absent from three of four objects
queryAll returns deleted rows, but IsDeleted was only selected on one object,
so 407 deleted contacts, 408 leads and 232 opportunities were written to the
warehouse flagged as live. That is worse than not capturing deletions, because
the manifest reported success. IsDeleted is now selected on every object and
its absence raises rather than defaulting to False.

Verified against the org: live counts in the extract now equal the live counts
in Salesforce (25 / 408 / 408 / 250), with the deletes retained and flagged.
</commit_message>
<xml_diff>
--- a/ebook/RedAndYellow_Data_Story.docx
+++ b/ebook/RedAndYellow_Data_Story.docx
@@ -760,6 +760,436 @@
       </w:r>
     </w:p>
     <w:p>
+      <w:r>
+        <w:br w:type="page"/>
+      </w:r>
+    </w:p>
+    <w:p>
+      <w:pPr>
+        <w:spacing w:before="0"/>
+      </w:pPr>
+      <w:r>
+        <w:rPr>
+          <w:b/>
+          <w:color w:val="E03127"/>
+          <w:sz w:val="40"/>
+        </w:rPr>
+        <w:t>Salesforce integration, step by step</w:t>
+      </w:r>
+    </w:p>
+    <w:p>
+      <w:r>
+        <w:t>This section documents the CRM integration as it actually ran, not as it was designed to run. Every figure below is rendered from live command output or a live query against the org at the moment this document was built, so it cannot describe a pipeline that no longer works.</w:t>
+      </w:r>
+    </w:p>
+    <w:p>
+      <w:r>
+        <w:t>1,091 records were loaded across 4 objects: Account 25, Contact 408, Lead 408, Opportunity 250.</w:t>
+      </w:r>
+    </w:p>
+    <w:p>
+      <w:pPr>
+        <w:spacing w:before="280"/>
+      </w:pPr>
+      <w:r>
+        <w:rPr>
+          <w:b/>
+          <w:color w:val="22252A"/>
+          <w:sz w:val="26"/>
+        </w:rPr>
+        <w:t>1. Establish whether the org can host the model</w:t>
+      </w:r>
+    </w:p>
+    <w:p>
+      <w:r>
+        <w:t>The target trial org runs Salesforce Base Edition, which permits zero custom objects. That is an edition entitlement rather than a quota or a permission, so no configuration changes it - and it is knowable in a single API call. Checking first turns a failure at deploy time into a decision at design time.</w:t>
+      </w:r>
+    </w:p>
+    <w:p>
+      <w:pPr>
+        <w:jc w:val="center"/>
+      </w:pPr>
+      <w:r>
+        <w:drawing>
+          <wp:inline xmlns:a="http://schemas.openxmlformats.org/drawingml/2006/main" xmlns:pic="http://schemas.openxmlformats.org/drawingml/2006/picture">
+            <wp:extent cx="5577840" cy="3078579"/>
+            <wp:docPr id="5" name="Picture 5"/>
+            <wp:cNvGraphicFramePr>
+              <a:graphicFrameLocks noChangeAspect="1"/>
+            </wp:cNvGraphicFramePr>
+            <a:graphic>
+              <a:graphicData uri="http://schemas.openxmlformats.org/drawingml/2006/picture">
+                <pic:pic>
+                  <pic:nvPicPr>
+                    <pic:cNvPr id="0" name="ev_01_org_check.png"/>
+                    <pic:cNvPicPr/>
+                  </pic:nvPicPr>
+                  <pic:blipFill>
+                    <a:blip r:embed="rId13"/>
+                    <a:stretch>
+                      <a:fillRect/>
+                    </a:stretch>
+                  </pic:blipFill>
+                  <pic:spPr>
+                    <a:xfrm>
+                      <a:off x="0" y="0"/>
+                      <a:ext cx="5577840" cy="3078579"/>
+                    </a:xfrm>
+                    <a:prstGeom prst="rect"/>
+                  </pic:spPr>
+                </pic:pic>
+              </a:graphicData>
+            </a:graphic>
+          </wp:inline>
+        </w:drawing>
+      </w:r>
+    </w:p>
+    <w:p>
+      <w:pPr>
+        <w:jc w:val="center"/>
+      </w:pPr>
+      <w:r>
+        <w:rPr>
+          <w:i/>
+          <w:color w:val="5A6472"/>
+          <w:sz w:val="17"/>
+        </w:rPr>
+        <w:t>Figure 5 - The org capability check. Base Edition, 10.6 GB free, and a NO-GO on custom objects.</w:t>
+      </w:r>
+    </w:p>
+    <w:p>
+      <w:pPr>
+        <w:spacing w:before="240"/>
+      </w:pPr>
+      <w:r>
+        <w:rPr>
+          <w:b/>
+          <w:color w:val="22252A"/>
+          <w:sz w:val="26"/>
+        </w:rPr>
+        <w:t>2. Deploy what the edition does allow</w:t>
+      </w:r>
+    </w:p>
+    <w:p>
+      <w:r>
+        <w:t>The eight custom objects cannot deploy, but the eighteen custom fields on standard objects can. Deploying fields without field-level security is a trap worth naming: the fields exist, but describe() omits them and the upsert then fails claiming the external ID is not unique - because the API cannot see the field it is being asked to key on. The permission set is trimmed to the deployed fields and assigned over REST.</w:t>
+      </w:r>
+    </w:p>
+    <w:p>
+      <w:pPr>
+        <w:jc w:val="center"/>
+      </w:pPr>
+      <w:r>
+        <w:drawing>
+          <wp:inline xmlns:a="http://schemas.openxmlformats.org/drawingml/2006/main" xmlns:pic="http://schemas.openxmlformats.org/drawingml/2006/picture">
+            <wp:extent cx="5577840" cy="2939058"/>
+            <wp:docPr id="6" name="Picture 6"/>
+            <wp:cNvGraphicFramePr>
+              <a:graphicFrameLocks noChangeAspect="1"/>
+            </wp:cNvGraphicFramePr>
+            <a:graphic>
+              <a:graphicData uri="http://schemas.openxmlformats.org/drawingml/2006/picture">
+                <pic:pic>
+                  <pic:nvPicPr>
+                    <pic:cNvPr id="0" name="ev_02_metadata_validate.png"/>
+                    <pic:cNvPicPr/>
+                  </pic:nvPicPr>
+                  <pic:blipFill>
+                    <a:blip r:embed="rId14"/>
+                    <a:stretch>
+                      <a:fillRect/>
+                    </a:stretch>
+                  </pic:blipFill>
+                  <pic:spPr>
+                    <a:xfrm>
+                      <a:off x="0" y="0"/>
+                      <a:ext cx="5577840" cy="2939058"/>
+                    </a:xfrm>
+                    <a:prstGeom prst="rect"/>
+                  </pic:spPr>
+                </pic:pic>
+              </a:graphicData>
+            </a:graphic>
+          </wp:inline>
+        </w:drawing>
+      </w:r>
+    </w:p>
+    <w:p>
+      <w:pPr>
+        <w:jc w:val="center"/>
+      </w:pPr>
+      <w:r>
+        <w:rPr>
+          <w:i/>
+          <w:color w:val="5A6472"/>
+          <w:sz w:val="17"/>
+        </w:rPr>
+        <w:t>Figure 6 - Metadata validated against the org. 18 of 18 components.</w:t>
+      </w:r>
+    </w:p>
+    <w:p>
+      <w:pPr>
+        <w:spacing w:before="240"/>
+      </w:pPr>
+      <w:r>
+        <w:rPr>
+          <w:b/>
+          <w:color w:val="22252A"/>
+          <w:sz w:val="26"/>
+        </w:rPr>
+        <w:t>3. Load the operational CRM slice</w:t>
+      </w:r>
+    </w:p>
+    <w:p>
+      <w:r>
+        <w:t>Accounts, contacts, leads and opportunities, upserted on an external ID so the load is idempotent - re-running updates rather than duplicates. Two things pushed back, and both were right to. Salesforce rejects the external ID in the request body when it is already the key in the URL. And its duplicate rules blocked leads that fuzzy-matched existing contacts at 100% confidence - the same duplicates the warehouse's own entity resolution finds, caught independently by the CRM.</w:t>
+      </w:r>
+    </w:p>
+    <w:p>
+      <w:pPr>
+        <w:jc w:val="center"/>
+      </w:pPr>
+      <w:r>
+        <w:drawing>
+          <wp:inline xmlns:a="http://schemas.openxmlformats.org/drawingml/2006/main" xmlns:pic="http://schemas.openxmlformats.org/drawingml/2006/picture">
+            <wp:extent cx="5577840" cy="2368838"/>
+            <wp:docPr id="7" name="Picture 7"/>
+            <wp:cNvGraphicFramePr>
+              <a:graphicFrameLocks noChangeAspect="1"/>
+            </wp:cNvGraphicFramePr>
+            <a:graphic>
+              <a:graphicData uri="http://schemas.openxmlformats.org/drawingml/2006/picture">
+                <pic:pic>
+                  <pic:nvPicPr>
+                    <pic:cNvPr id="0" name="ev_03_import_result.png"/>
+                    <pic:cNvPicPr/>
+                  </pic:nvPicPr>
+                  <pic:blipFill>
+                    <a:blip r:embed="rId15"/>
+                    <a:stretch>
+                      <a:fillRect/>
+                    </a:stretch>
+                  </pic:blipFill>
+                  <pic:spPr>
+                    <a:xfrm>
+                      <a:off x="0" y="0"/>
+                      <a:ext cx="5577840" cy="2368838"/>
+                    </a:xfrm>
+                    <a:prstGeom prst="rect"/>
+                  </pic:spPr>
+                </pic:pic>
+              </a:graphicData>
+            </a:graphic>
+          </wp:inline>
+        </w:drawing>
+      </w:r>
+    </w:p>
+    <w:p>
+      <w:pPr>
+        <w:jc w:val="center"/>
+      </w:pPr>
+      <w:r>
+        <w:rPr>
+          <w:i/>
+          <w:color w:val="5A6472"/>
+          <w:sz w:val="17"/>
+        </w:rPr>
+        <w:t>Figure 7 - What the loader wrote.</w:t>
+      </w:r>
+    </w:p>
+    <w:p>
+      <w:pPr>
+        <w:jc w:val="center"/>
+      </w:pPr>
+      <w:r>
+        <w:drawing>
+          <wp:inline xmlns:a="http://schemas.openxmlformats.org/drawingml/2006/main" xmlns:pic="http://schemas.openxmlformats.org/drawingml/2006/picture">
+            <wp:extent cx="5577840" cy="2939058"/>
+            <wp:docPr id="8" name="Picture 8"/>
+            <wp:cNvGraphicFramePr>
+              <a:graphicFrameLocks noChangeAspect="1"/>
+            </wp:cNvGraphicFramePr>
+            <a:graphic>
+              <a:graphicData uri="http://schemas.openxmlformats.org/drawingml/2006/picture">
+                <pic:pic>
+                  <pic:nvPicPr>
+                    <pic:cNvPr id="0" name="ev_04_org_counts.png"/>
+                    <pic:cNvPicPr/>
+                  </pic:nvPicPr>
+                  <pic:blipFill>
+                    <a:blip r:embed="rId16"/>
+                    <a:stretch>
+                      <a:fillRect/>
+                    </a:stretch>
+                  </pic:blipFill>
+                  <pic:spPr>
+                    <a:xfrm>
+                      <a:off x="0" y="0"/>
+                      <a:ext cx="5577840" cy="2939058"/>
+                    </a:xfrm>
+                    <a:prstGeom prst="rect"/>
+                  </pic:spPr>
+                </pic:pic>
+              </a:graphicData>
+            </a:graphic>
+          </wp:inline>
+        </w:drawing>
+      </w:r>
+    </w:p>
+    <w:p>
+      <w:pPr>
+        <w:jc w:val="center"/>
+      </w:pPr>
+      <w:r>
+        <w:rPr>
+          <w:i/>
+          <w:color w:val="5A6472"/>
+          <w:sz w:val="17"/>
+        </w:rPr>
+        <w:t>Figure 8 - What is actually in the org, queried back through the API. The loader's claim and the org's state are different assertions; only the second is evidence.</w:t>
+      </w:r>
+    </w:p>
+    <w:p>
+      <w:pPr>
+        <w:spacing w:before="240"/>
+      </w:pPr>
+      <w:r>
+        <w:rPr>
+          <w:b/>
+          <w:color w:val="22252A"/>
+          <w:sz w:val="26"/>
+        </w:rPr>
+        <w:t>4. Extract it back out through the API</w:t>
+      </w:r>
+    </w:p>
+    <w:p>
+      <w:r>
+        <w:t>This is the part the role is actually about. SOQL over the REST API, paginating through nextRecordsUrl so the 2,000-record page limit is handled rather than silently truncating, with the high-water mark on SystemModstamp persisted between runs. The first run is a full load; the second returns zero rows because nothing changed. Deletions are captured through queryAll rather than left to linger.</w:t>
+      </w:r>
+    </w:p>
+    <w:p>
+      <w:pPr>
+        <w:jc w:val="center"/>
+      </w:pPr>
+      <w:r>
+        <w:drawing>
+          <wp:inline xmlns:a="http://schemas.openxmlformats.org/drawingml/2006/main" xmlns:pic="http://schemas.openxmlformats.org/drawingml/2006/picture">
+            <wp:extent cx="5577840" cy="2226283"/>
+            <wp:docPr id="9" name="Picture 9"/>
+            <wp:cNvGraphicFramePr>
+              <a:graphicFrameLocks noChangeAspect="1"/>
+            </wp:cNvGraphicFramePr>
+            <a:graphic>
+              <a:graphicData uri="http://schemas.openxmlformats.org/drawingml/2006/picture">
+                <pic:pic>
+                  <pic:nvPicPr>
+                    <pic:cNvPr id="0" name="ev_05_extraction.png"/>
+                    <pic:cNvPicPr/>
+                  </pic:nvPicPr>
+                  <pic:blipFill>
+                    <a:blip r:embed="rId17"/>
+                    <a:stretch>
+                      <a:fillRect/>
+                    </a:stretch>
+                  </pic:blipFill>
+                  <pic:spPr>
+                    <a:xfrm>
+                      <a:off x="0" y="0"/>
+                      <a:ext cx="5577840" cy="2226283"/>
+                    </a:xfrm>
+                    <a:prstGeom prst="rect"/>
+                  </pic:spPr>
+                </pic:pic>
+              </a:graphicData>
+            </a:graphic>
+          </wp:inline>
+        </w:drawing>
+      </w:r>
+    </w:p>
+    <w:p>
+      <w:pPr>
+        <w:jc w:val="center"/>
+      </w:pPr>
+      <w:r>
+        <w:rPr>
+          <w:i/>
+          <w:color w:val="5A6472"/>
+          <w:sz w:val="17"/>
+        </w:rPr>
+        <w:t>Figure 9 - Extraction manifest. Every row carries its source system, source id, source update time and extraction time.</w:t>
+      </w:r>
+    </w:p>
+    <w:p>
+      <w:pPr>
+        <w:spacing w:before="240"/>
+      </w:pPr>
+      <w:r>
+        <w:rPr>
+          <w:b/>
+          <w:color w:val="22252A"/>
+          <w:sz w:val="26"/>
+        </w:rPr>
+        <w:t>5. Transform, test, and report</w:t>
+      </w:r>
+    </w:p>
+    <w:p>
+      <w:r>
+        <w:t>From there the extracted data joins the same warehouse the synthetic history lives in, is cleansed once in staging, and is consumed by marts that Power BI reads directly. The tests run on every build.</w:t>
+      </w:r>
+    </w:p>
+    <w:p>
+      <w:pPr>
+        <w:jc w:val="center"/>
+      </w:pPr>
+      <w:r>
+        <w:drawing>
+          <wp:inline xmlns:a="http://schemas.openxmlformats.org/drawingml/2006/main" xmlns:pic="http://schemas.openxmlformats.org/drawingml/2006/picture">
+            <wp:extent cx="5577840" cy="1656063"/>
+            <wp:docPr id="10" name="Picture 10"/>
+            <wp:cNvGraphicFramePr>
+              <a:graphicFrameLocks noChangeAspect="1"/>
+            </wp:cNvGraphicFramePr>
+            <a:graphic>
+              <a:graphicData uri="http://schemas.openxmlformats.org/drawingml/2006/picture">
+                <pic:pic>
+                  <pic:nvPicPr>
+                    <pic:cNvPr id="0" name="ev_06_dbt_tests.png"/>
+                    <pic:cNvPicPr/>
+                  </pic:nvPicPr>
+                  <pic:blipFill>
+                    <a:blip r:embed="rId18"/>
+                    <a:stretch>
+                      <a:fillRect/>
+                    </a:stretch>
+                  </pic:blipFill>
+                  <pic:spPr>
+                    <a:xfrm>
+                      <a:off x="0" y="0"/>
+                      <a:ext cx="5577840" cy="1656063"/>
+                    </a:xfrm>
+                    <a:prstGeom prst="rect"/>
+                  </pic:spPr>
+                </pic:pic>
+              </a:graphicData>
+            </a:graphic>
+          </wp:inline>
+        </w:drawing>
+      </w:r>
+    </w:p>
+    <w:p>
+      <w:pPr>
+        <w:jc w:val="center"/>
+      </w:pPr>
+      <w:r>
+        <w:rPr>
+          <w:i/>
+          <w:color w:val="5A6472"/>
+          <w:sz w:val="17"/>
+        </w:rPr>
+        <w:t>Figure 10 - dbt build: models and data tests.</w:t>
+      </w:r>
+    </w:p>
+    <w:p>
       <w:pPr>
         <w:spacing w:before="320"/>
       </w:pPr>

</xml_diff>

<commit_message>
Coordinate quality fixes for workbook and ebook
</commit_message>
<xml_diff>
--- a/ebook/RedAndYellow_Data_Story.docx
+++ b/ebook/RedAndYellow_Data_Story.docx
@@ -40,7 +40,7 @@
           <w:sz w:val="20"/>
         </w:rPr>
         <w:br/>
-        <w:t>09 September 2026   ·   Anthony Apollis</w:t>
+        <w:t>09 September 2026   |   Anthony Apollis</w:t>
       </w:r>
     </w:p>
     <w:p>
@@ -214,7 +214,7 @@
     </w:p>
     <w:p>
       <w:r>
-        <w:t>Red &amp; Yellow's Data Analytics Engineer role asks for six things: a data catalogue, ERDs for CRM data models, ETL pipelines built preferably in Apache NiFi, Salesforce CRM data extracted and analysed, Power BI dashboards, and data quality held to a standard. This document is the working answer to all six, built end to end on a dataset of 2,694,805 people and 9.4 million rows.</w:t>
+        <w:t>Red &amp; Yellow's Data Analytics Engineer role asks for six things: a data catalogue, ERDs for CRM data models, ETL pipelines built preferably in Apache NiFi, Salesforce CRM data extracted and analysed, Power BI dashboards, and data quality held to a standard. This document is the working answer to all six, built end to end on a dataset of 2,694,805 people and 11.5 million rows.</w:t>
       </w:r>
     </w:p>
     <w:p>
@@ -470,7 +470,7 @@
           </w:tcPr>
           <w:p>
             <w:r>
-              <w:t>328,036</w:t>
+              <w:t>329,994</w:t>
             </w:r>
           </w:p>
         </w:tc>
@@ -727,7 +727,7 @@
     </w:p>
     <w:p>
       <w:r>
-        <w:t>Across 2,941,380 injected defects the pipeline detects 328,036 issues. De-duplication recovers 0.97 of the duplicates that were planted.</w:t>
+        <w:t>Across 2,941,380 injected defects the pipeline detects 329,994 issues. De-duplication recovers 0.97 of the duplicates that were planted.</w:t>
       </w:r>
     </w:p>
     <w:p>
@@ -1215,7 +1215,7 @@
     </w:p>
     <w:p>
       <w:pPr>
-        <w:pStyle w:val="Heading3"/>
+        <w:pStyle w:val="Heading2"/>
         <w:spacing w:before="280"/>
       </w:pPr>
       <w:r>
@@ -1223,9 +1223,9 @@
           <w:rFonts w:ascii="Calibri" w:hAnsi="Calibri"/>
           <w:b/>
           <w:color w:val="22252A"/>
-          <w:sz w:val="26"/>
+          <w:sz w:val="32"/>
         </w:rPr>
-        <w:t>3.0.1  1. Establish whether the org can host the model</w:t>
+        <w:t>3.1  1. Establish whether the org can host the model</w:t>
       </w:r>
     </w:p>
     <w:p>
@@ -1287,7 +1287,7 @@
     </w:p>
     <w:p>
       <w:pPr>
-        <w:pStyle w:val="Heading3"/>
+        <w:pStyle w:val="Heading2"/>
         <w:spacing w:before="240"/>
       </w:pPr>
       <w:r>
@@ -1295,9 +1295,9 @@
           <w:rFonts w:ascii="Calibri" w:hAnsi="Calibri"/>
           <w:b/>
           <w:color w:val="22252A"/>
-          <w:sz w:val="26"/>
+          <w:sz w:val="32"/>
         </w:rPr>
-        <w:t>3.0.2  2. Deploy what the edition does allow</w:t>
+        <w:t>3.2  2. Deploy what the edition does allow</w:t>
       </w:r>
     </w:p>
     <w:p>
@@ -1359,7 +1359,7 @@
     </w:p>
     <w:p>
       <w:pPr>
-        <w:pStyle w:val="Heading3"/>
+        <w:pStyle w:val="Heading2"/>
         <w:spacing w:before="240"/>
       </w:pPr>
       <w:r>
@@ -1367,9 +1367,9 @@
           <w:rFonts w:ascii="Calibri" w:hAnsi="Calibri"/>
           <w:b/>
           <w:color w:val="22252A"/>
-          <w:sz w:val="26"/>
+          <w:sz w:val="32"/>
         </w:rPr>
-        <w:t>3.0.3  3. Load the operational CRM slice</w:t>
+        <w:t>3.3  3. Load the operational CRM slice</w:t>
       </w:r>
     </w:p>
     <w:p>
@@ -1483,7 +1483,7 @@
     </w:p>
     <w:p>
       <w:pPr>
-        <w:pStyle w:val="Heading3"/>
+        <w:pStyle w:val="Heading2"/>
         <w:spacing w:before="240"/>
       </w:pPr>
       <w:r>
@@ -1491,9 +1491,9 @@
           <w:rFonts w:ascii="Calibri" w:hAnsi="Calibri"/>
           <w:b/>
           <w:color w:val="22252A"/>
-          <w:sz w:val="26"/>
+          <w:sz w:val="32"/>
         </w:rPr>
-        <w:t>3.0.4  4. Extract it back out through the API</w:t>
+        <w:t>3.4  4. Extract it back out through the API</w:t>
       </w:r>
     </w:p>
     <w:p>
@@ -1555,7 +1555,7 @@
     </w:p>
     <w:p>
       <w:pPr>
-        <w:pStyle w:val="Heading3"/>
+        <w:pStyle w:val="Heading2"/>
         <w:spacing w:before="240"/>
       </w:pPr>
       <w:r>
@@ -1563,9 +1563,9 @@
           <w:rFonts w:ascii="Calibri" w:hAnsi="Calibri"/>
           <w:b/>
           <w:color w:val="22252A"/>
-          <w:sz w:val="26"/>
+          <w:sz w:val="32"/>
         </w:rPr>
-        <w:t>3.0.5  5. Transform, test, and report</w:t>
+        <w:t>3.5  5. Transform, test, and report</w:t>
       </w:r>
     </w:p>
     <w:p>
@@ -1932,7 +1932,7 @@
     </w:p>
     <w:p>
       <w:pPr>
-        <w:pStyle w:val="Heading3"/>
+        <w:pStyle w:val="Heading2"/>
         <w:spacing w:before="240"/>
       </w:pPr>
       <w:r>
@@ -1940,9 +1940,9 @@
           <w:rFonts w:ascii="Calibri" w:hAnsi="Calibri"/>
           <w:b/>
           <w:color w:val="22252A"/>
-          <w:sz w:val="26"/>
+          <w:sz w:val="32"/>
         </w:rPr>
-        <w:t>4.0.1  What to do about it</w:t>
+        <w:t>4.1  What to do about it</w:t>
       </w:r>
     </w:p>
     <w:p>
@@ -2031,7 +2031,7 @@
     </w:p>
     <w:p>
       <w:pPr>
-        <w:pStyle w:val="Heading3"/>
+        <w:pStyle w:val="Heading2"/>
         <w:spacing w:before="240"/>
       </w:pPr>
       <w:r>
@@ -2039,9 +2039,9 @@
           <w:rFonts w:ascii="Calibri" w:hAnsi="Calibri"/>
           <w:b/>
           <w:color w:val="22252A"/>
-          <w:sz w:val="26"/>
+          <w:sz w:val="32"/>
         </w:rPr>
-        <w:t>4.0.2  An honest caveat</w:t>
+        <w:t>4.2  An honest caveat</w:t>
       </w:r>
     </w:p>
     <w:p>
@@ -2398,7 +2398,7 @@
     </w:p>
     <w:p>
       <w:pPr>
-        <w:pStyle w:val="Heading3"/>
+        <w:pStyle w:val="Heading2"/>
         <w:spacing w:before="240"/>
       </w:pPr>
       <w:r>
@@ -2406,9 +2406,9 @@
           <w:rFonts w:ascii="Calibri" w:hAnsi="Calibri"/>
           <w:b/>
           <w:color w:val="22252A"/>
-          <w:sz w:val="26"/>
+          <w:sz w:val="32"/>
         </w:rPr>
-        <w:t>6.0.1  Apache NiFi</w:t>
+        <w:t>6.1  Apache NiFi</w:t>
       </w:r>
     </w:p>
     <w:p>
@@ -2470,7 +2470,7 @@
     </w:p>
     <w:p>
       <w:pPr>
-        <w:pStyle w:val="Heading3"/>
+        <w:pStyle w:val="Heading2"/>
         <w:spacing w:before="240"/>
       </w:pPr>
       <w:r>
@@ -2478,9 +2478,9 @@
           <w:rFonts w:ascii="Calibri" w:hAnsi="Calibri"/>
           <w:b/>
           <w:color w:val="22252A"/>
-          <w:sz w:val="26"/>
+          <w:sz w:val="32"/>
         </w:rPr>
-        <w:t>6.0.2  Microsoft Fabric</w:t>
+        <w:t>6.2  Microsoft Fabric</w:t>
       </w:r>
     </w:p>
     <w:p>
@@ -2552,7 +2552,7 @@
           <w:color w:val="22252A"/>
           <w:sz w:val="34"/>
         </w:rPr>
-        <w:t>6.1  What is not claimed</w:t>
+        <w:t>6.3  What is not claimed</w:t>
       </w:r>
     </w:p>
     <w:p>

</xml_diff>

<commit_message>
Apply Red and Yellow brand palette to deliverables
</commit_message>
<xml_diff>
--- a/ebook/RedAndYellow_Data_Story.docx
+++ b/ebook/RedAndYellow_Data_Story.docx
@@ -9,7 +9,7 @@
       <w:r>
         <w:rPr>
           <w:b/>
-          <w:color w:val="E03127"/>
+          <w:color w:val="F52635"/>
           <w:sz w:val="80"/>
         </w:rPr>
         <w:t>Red &amp; Yellow</w:t>
@@ -18,7 +18,7 @@
     <w:p>
       <w:r>
         <w:rPr>
-          <w:color w:val="22252A"/>
+          <w:color w:val="1D1D1B"/>
           <w:sz w:val="34"/>
         </w:rPr>
         <w:t>From marketing spend to student outcomes</w:t>
@@ -27,7 +27,7 @@
     <w:p>
       <w:r>
         <w:rPr>
-          <w:color w:val="5A6472"/>
+          <w:color w:val="60646B"/>
           <w:sz w:val="23"/>
         </w:rPr>
         <w:t>A CRM analytics platform built on Salesforce, Apache NiFi, dbt, Microsoft Fabric and Power BI</w:t>
@@ -36,18 +36,18 @@
     <w:p>
       <w:r>
         <w:rPr>
-          <w:color w:val="5A6472"/>
+          <w:color w:val="60646B"/>
           <w:sz w:val="20"/>
         </w:rPr>
         <w:br/>
-        <w:t>09 September 2026   |   Anthony Apollis</w:t>
+        <w:t>10 September 2026   |   Anthony Apollis</w:t>
       </w:r>
     </w:p>
     <w:p>
       <w:r>
         <w:rPr>
           <w:i/>
-          <w:color w:val="5A6472"/>
+          <w:color w:val="60646B"/>
           <w:sz w:val="18"/>
         </w:rPr>
         <w:br/>
@@ -63,7 +63,7 @@
       <w:r>
         <w:rPr>
           <w:b/>
-          <w:color w:val="E03127"/>
+          <w:color w:val="F52635"/>
           <w:sz w:val="40"/>
         </w:rPr>
         <w:t>Contents</w:t>
@@ -91,7 +91,7 @@
         <w:rPr>
           <w:rFonts w:ascii="Calibri" w:hAnsi="Calibri"/>
           <w:b/>
-          <w:color w:val="E03127"/>
+          <w:color w:val="F52635"/>
           <w:sz w:val="40"/>
         </w:rPr>
         <w:t>1  Introduction</w:t>
@@ -116,7 +116,7 @@
         <w:rPr>
           <w:rFonts w:ascii="Calibri" w:hAnsi="Calibri"/>
           <w:b/>
-          <w:color w:val="22252A"/>
+          <w:color w:val="1D1D1B"/>
           <w:sz w:val="32"/>
         </w:rPr>
         <w:t>1.1  How to read it</w:t>
@@ -129,7 +129,7 @@
       <w:r>
         <w:rPr>
           <w:b/>
-          <w:color w:val="E03127"/>
+          <w:color w:val="F52635"/>
         </w:rPr>
         <w:t xml:space="preserve">The numbers first. </w:t>
       </w:r>
@@ -144,7 +144,7 @@
       <w:r>
         <w:rPr>
           <w:b/>
-          <w:color w:val="E03127"/>
+          <w:color w:val="F52635"/>
         </w:rPr>
         <w:t xml:space="preserve">Then the decisions. </w:t>
       </w:r>
@@ -159,7 +159,7 @@
       <w:r>
         <w:rPr>
           <w:b/>
-          <w:color w:val="E03127"/>
+          <w:color w:val="F52635"/>
         </w:rPr>
         <w:t xml:space="preserve">Then the evidence. </w:t>
       </w:r>
@@ -174,7 +174,7 @@
       <w:r>
         <w:rPr>
           <w:b/>
-          <w:color w:val="E03127"/>
+          <w:color w:val="F52635"/>
         </w:rPr>
         <w:t xml:space="preserve">Finally the limits. </w:t>
       </w:r>
@@ -187,7 +187,7 @@
       <w:r>
         <w:rPr>
           <w:i/>
-          <w:color w:val="5A6472"/>
+          <w:color w:val="60646B"/>
         </w:rPr>
         <w:t>One thing to hold in mind throughout: the programme catalogue is real, transcribed from Red &amp; Yellow's public site. Everything about people - every lead, contact, application, enrolment and result - is synthetic, and the relationships between them were put there deliberately so the pipeline had something to find. That makes this a demonstration of method, not a finding about Red &amp; Yellow.</w:t>
       </w:r>
@@ -206,7 +206,7 @@
         <w:rPr>
           <w:rFonts w:ascii="Calibri" w:hAnsi="Calibri"/>
           <w:b/>
-          <w:color w:val="E03127"/>
+          <w:color w:val="F52635"/>
           <w:sz w:val="40"/>
         </w:rPr>
         <w:t>2  What this is</w:t>
@@ -268,7 +268,7 @@
       <w:r>
         <w:rPr>
           <w:i/>
-          <w:color w:val="5A6472"/>
+          <w:color w:val="60646B"/>
           <w:sz w:val="17"/>
         </w:rPr>
         <w:t>Figure 0 - The pipeline end to end. Each stage is a separate, runnable component; nothing here is a diagram of an intention.</w:t>
@@ -283,7 +283,7 @@
         <w:rPr>
           <w:rFonts w:ascii="Calibri" w:hAnsi="Calibri"/>
           <w:b/>
-          <w:color w:val="22252A"/>
+          <w:color w:val="1D1D1B"/>
           <w:sz w:val="34"/>
         </w:rPr>
         <w:t>2.1  The numbers</w:t>
@@ -545,7 +545,7 @@
       <w:r>
         <w:rPr>
           <w:i/>
-          <w:color w:val="5A6472"/>
+          <w:color w:val="60646B"/>
           <w:sz w:val="17"/>
         </w:rPr>
         <w:t>Figure 1 - The funnel by stage. Leads and contacts overlap, so the step between them is not attrition.</w:t>
@@ -560,7 +560,7 @@
         <w:rPr>
           <w:rFonts w:ascii="Calibri" w:hAnsi="Calibri"/>
           <w:b/>
-          <w:color w:val="22252A"/>
+          <w:color w:val="1D1D1B"/>
           <w:sz w:val="34"/>
         </w:rPr>
         <w:t>2.2  Where the marketing money goes</w:t>
@@ -622,7 +622,7 @@
       <w:r>
         <w:rPr>
           <w:i/>
-          <w:color w:val="5A6472"/>
+          <w:color w:val="60646B"/>
           <w:sz w:val="17"/>
         </w:rPr>
         <w:t>Figure 2 - Cost per enrolment by channel.</w:t>
@@ -637,7 +637,7 @@
         <w:rPr>
           <w:rFonts w:ascii="Calibri" w:hAnsi="Calibri"/>
           <w:b/>
-          <w:color w:val="22252A"/>
+          <w:color w:val="1D1D1B"/>
           <w:sz w:val="34"/>
         </w:rPr>
         <w:t>2.3  Student success as an early warning</w:t>
@@ -699,7 +699,7 @@
       <w:r>
         <w:rPr>
           <w:i/>
-          <w:color w:val="5A6472"/>
+          <w:color w:val="60646B"/>
           <w:sz w:val="17"/>
         </w:rPr>
         <w:t>Figure 3 - Academic health across the study weeks.</w:t>
@@ -714,7 +714,7 @@
         <w:rPr>
           <w:rFonts w:ascii="Calibri" w:hAnsi="Calibri"/>
           <w:b/>
-          <w:color w:val="22252A"/>
+          <w:color w:val="1D1D1B"/>
           <w:sz w:val="34"/>
         </w:rPr>
         <w:t>2.4  Data quality, measured rather than asserted</w:t>
@@ -739,7 +739,7 @@
         <w:rPr>
           <w:rFonts w:ascii="Calibri" w:hAnsi="Calibri"/>
           <w:b/>
-          <w:color w:val="22252A"/>
+          <w:color w:val="1D1D1B"/>
           <w:sz w:val="26"/>
         </w:rPr>
         <w:t>2.4.1  Why de-duplication needed two keys</w:t>
@@ -806,7 +806,7 @@
       <w:r>
         <w:rPr>
           <w:i/>
-          <w:color w:val="5A6472"/>
+          <w:color w:val="60646B"/>
           <w:sz w:val="17"/>
         </w:rPr>
         <w:t>Figure 4 - Detected issues by type.</w:t>
@@ -821,7 +821,7 @@
         <w:rPr>
           <w:rFonts w:ascii="Calibri" w:hAnsi="Calibri"/>
           <w:b/>
-          <w:color w:val="22252A"/>
+          <w:color w:val="1D1D1B"/>
           <w:sz w:val="34"/>
         </w:rPr>
         <w:t>2.5  Where the demand actually is</w:t>
@@ -878,7 +878,7 @@
       <w:r>
         <w:rPr>
           <w:i/>
-          <w:color w:val="5A6472"/>
+          <w:color w:val="60646B"/>
           <w:sz w:val="17"/>
         </w:rPr>
         <w:t>Figure 4a - Top programmes by enrolment, with average discount.</w:t>
@@ -893,7 +893,7 @@
         <w:rPr>
           <w:rFonts w:ascii="Calibri" w:hAnsi="Calibri"/>
           <w:b/>
-          <w:color w:val="22252A"/>
+          <w:color w:val="1D1D1B"/>
           <w:sz w:val="26"/>
         </w:rPr>
         <w:t>2.5.1  Who is enrolling, and from where</w:t>
@@ -950,7 +950,7 @@
       <w:r>
         <w:rPr>
           <w:i/>
-          <w:color w:val="5A6472"/>
+          <w:color w:val="60646B"/>
           <w:sz w:val="17"/>
         </w:rPr>
         <w:t>Figure 4b - Enrolments by province, after the spelling variants are collapsed to the nine official names.</w:t>
@@ -965,7 +965,7 @@
         <w:rPr>
           <w:rFonts w:ascii="Calibri" w:hAnsi="Calibri"/>
           <w:b/>
-          <w:color w:val="22252A"/>
+          <w:color w:val="1D1D1B"/>
           <w:sz w:val="26"/>
         </w:rPr>
         <w:t>2.5.2  The funnel as conversion, not counts</w:t>
@@ -1022,7 +1022,7 @@
       <w:r>
         <w:rPr>
           <w:i/>
-          <w:color w:val="5A6472"/>
+          <w:color w:val="60646B"/>
           <w:sz w:val="17"/>
         </w:rPr>
         <w:t>Figure 4c - Stage-to-stage conversion through the admissions pipeline.</w:t>
@@ -1037,7 +1037,7 @@
         <w:rPr>
           <w:rFonts w:ascii="Calibri" w:hAnsi="Calibri"/>
           <w:b/>
-          <w:color w:val="22252A"/>
+          <w:color w:val="1D1D1B"/>
           <w:sz w:val="34"/>
         </w:rPr>
         <w:t>2.6  Blanks that are not gaps</w:t>
@@ -1062,7 +1062,7 @@
         <w:rPr>
           <w:rFonts w:ascii="Calibri" w:hAnsi="Calibri"/>
           <w:b/>
-          <w:color w:val="22252A"/>
+          <w:color w:val="1D1D1B"/>
           <w:sz w:val="34"/>
         </w:rPr>
         <w:t>2.7  Why the CRM holds thousands and the warehouse holds millions</w:t>
@@ -1087,7 +1087,7 @@
         <w:rPr>
           <w:rFonts w:ascii="Calibri" w:hAnsi="Calibri"/>
           <w:b/>
-          <w:color w:val="22252A"/>
+          <w:color w:val="1D1D1B"/>
           <w:sz w:val="34"/>
         </w:rPr>
         <w:t>2.8  The pipeline, end to end</w:t>
@@ -1100,7 +1100,7 @@
       <w:r>
         <w:rPr>
           <w:b/>
-          <w:color w:val="E03127"/>
+          <w:color w:val="F52635"/>
         </w:rPr>
         <w:t xml:space="preserve">Extract. </w:t>
       </w:r>
@@ -1115,7 +1115,7 @@
       <w:r>
         <w:rPr>
           <w:b/>
-          <w:color w:val="E03127"/>
+          <w:color w:val="F52635"/>
         </w:rPr>
         <w:t xml:space="preserve">Land. </w:t>
       </w:r>
@@ -1130,7 +1130,7 @@
       <w:r>
         <w:rPr>
           <w:b/>
-          <w:color w:val="E03127"/>
+          <w:color w:val="F52635"/>
         </w:rPr>
         <w:t xml:space="preserve">Transform. </w:t>
       </w:r>
@@ -1145,7 +1145,7 @@
       <w:r>
         <w:rPr>
           <w:b/>
-          <w:color w:val="E03127"/>
+          <w:color w:val="F52635"/>
         </w:rPr>
         <w:t xml:space="preserve">Test. </w:t>
       </w:r>
@@ -1160,7 +1160,7 @@
       <w:r>
         <w:rPr>
           <w:b/>
-          <w:color w:val="E03127"/>
+          <w:color w:val="F52635"/>
         </w:rPr>
         <w:t xml:space="preserve">Document. </w:t>
       </w:r>
@@ -1175,7 +1175,7 @@
       <w:r>
         <w:rPr>
           <w:b/>
-          <w:color w:val="E03127"/>
+          <w:color w:val="F52635"/>
         </w:rPr>
         <w:t xml:space="preserve">Report. </w:t>
       </w:r>
@@ -1197,7 +1197,7 @@
         <w:rPr>
           <w:rFonts w:ascii="Calibri" w:hAnsi="Calibri"/>
           <w:b/>
-          <w:color w:val="E03127"/>
+          <w:color w:val="F52635"/>
           <w:sz w:val="40"/>
         </w:rPr>
         <w:t>3  Salesforce integration, step by step</w:t>
@@ -1222,7 +1222,7 @@
         <w:rPr>
           <w:rFonts w:ascii="Calibri" w:hAnsi="Calibri"/>
           <w:b/>
-          <w:color w:val="22252A"/>
+          <w:color w:val="1D1D1B"/>
           <w:sz w:val="32"/>
         </w:rPr>
         <w:t>3.1  1. Establish whether the org can host the model</w:t>
@@ -1279,7 +1279,7 @@
       <w:r>
         <w:rPr>
           <w:i/>
-          <w:color w:val="5A6472"/>
+          <w:color w:val="60646B"/>
           <w:sz w:val="17"/>
         </w:rPr>
         <w:t>Figure 5 - The org capability check. Base Edition, 10.6 GB free, and a NO-GO on custom objects.</w:t>
@@ -1294,7 +1294,7 @@
         <w:rPr>
           <w:rFonts w:ascii="Calibri" w:hAnsi="Calibri"/>
           <w:b/>
-          <w:color w:val="22252A"/>
+          <w:color w:val="1D1D1B"/>
           <w:sz w:val="32"/>
         </w:rPr>
         <w:t>3.2  2. Deploy what the edition does allow</w:t>
@@ -1351,7 +1351,7 @@
       <w:r>
         <w:rPr>
           <w:i/>
-          <w:color w:val="5A6472"/>
+          <w:color w:val="60646B"/>
           <w:sz w:val="17"/>
         </w:rPr>
         <w:t>Figure 6 - Metadata validated against the org. 18 of 18 components.</w:t>
@@ -1366,7 +1366,7 @@
         <w:rPr>
           <w:rFonts w:ascii="Calibri" w:hAnsi="Calibri"/>
           <w:b/>
-          <w:color w:val="22252A"/>
+          <w:color w:val="1D1D1B"/>
           <w:sz w:val="32"/>
         </w:rPr>
         <w:t>3.3  3. Load the operational CRM slice</w:t>
@@ -1423,7 +1423,7 @@
       <w:r>
         <w:rPr>
           <w:i/>
-          <w:color w:val="5A6472"/>
+          <w:color w:val="60646B"/>
           <w:sz w:val="17"/>
         </w:rPr>
         <w:t>Figure 7 - What the loader wrote.</w:t>
@@ -1475,7 +1475,7 @@
       <w:r>
         <w:rPr>
           <w:i/>
-          <w:color w:val="5A6472"/>
+          <w:color w:val="60646B"/>
           <w:sz w:val="17"/>
         </w:rPr>
         <w:t>Figure 8 - What is actually in the org, queried back through the API. The loader's claim and the org's state are different assertions; only the second is evidence.</w:t>
@@ -1490,7 +1490,7 @@
         <w:rPr>
           <w:rFonts w:ascii="Calibri" w:hAnsi="Calibri"/>
           <w:b/>
-          <w:color w:val="22252A"/>
+          <w:color w:val="1D1D1B"/>
           <w:sz w:val="32"/>
         </w:rPr>
         <w:t>3.4  4. Extract it back out through the API</w:t>
@@ -1547,7 +1547,7 @@
       <w:r>
         <w:rPr>
           <w:i/>
-          <w:color w:val="5A6472"/>
+          <w:color w:val="60646B"/>
           <w:sz w:val="17"/>
         </w:rPr>
         <w:t>Figure 9 - Extraction manifest. Every row carries its source system, source id, source update time and extraction time.</w:t>
@@ -1562,7 +1562,7 @@
         <w:rPr>
           <w:rFonts w:ascii="Calibri" w:hAnsi="Calibri"/>
           <w:b/>
-          <w:color w:val="22252A"/>
+          <w:color w:val="1D1D1B"/>
           <w:sz w:val="32"/>
         </w:rPr>
         <w:t>3.5  5. Transform, test, and report</w:t>
@@ -1580,7 +1580,7 @@
       <w:r>
         <w:drawing>
           <wp:inline xmlns:a="http://schemas.openxmlformats.org/drawingml/2006/main" xmlns:pic="http://schemas.openxmlformats.org/drawingml/2006/picture">
-            <wp:extent cx="5577840" cy="1656063"/>
+            <wp:extent cx="5577840" cy="1798618"/>
             <wp:docPr id="14" name="Picture 14"/>
             <wp:cNvGraphicFramePr>
               <a:graphicFrameLocks noChangeAspect="1"/>
@@ -1601,7 +1601,7 @@
                   <pic:spPr>
                     <a:xfrm>
                       <a:off x="0" y="0"/>
-                      <a:ext cx="5577840" cy="1656063"/>
+                      <a:ext cx="5577840" cy="1798618"/>
                     </a:xfrm>
                     <a:prstGeom prst="rect"/>
                   </pic:spPr>
@@ -1619,7 +1619,7 @@
       <w:r>
         <w:rPr>
           <w:i/>
-          <w:color w:val="5A6472"/>
+          <w:color w:val="60646B"/>
           <w:sz w:val="17"/>
         </w:rPr>
         <w:t>Figure 10 - dbt build: models and data tests.</w:t>
@@ -1639,7 +1639,7 @@
         <w:rPr>
           <w:rFonts w:ascii="Calibri" w:hAnsi="Calibri"/>
           <w:b/>
-          <w:color w:val="E03127"/>
+          <w:color w:val="F52635"/>
           <w:sz w:val="40"/>
         </w:rPr>
         <w:t>4  Two models, and what they are worth</w:t>
@@ -1872,7 +1872,7 @@
       <w:r>
         <w:rPr>
           <w:i/>
-          <w:color w:val="5A6472"/>
+          <w:color w:val="60646B"/>
           <w:sz w:val="17"/>
         </w:rPr>
         <w:t>Figure 10a - Conversion by propensity band, and withdrawal by risk band. If the bars do not separate, the model is not ranking anything.</w:t>
@@ -1924,7 +1924,7 @@
       <w:r>
         <w:rPr>
           <w:i/>
-          <w:color w:val="5A6472"/>
+          <w:color w:val="60646B"/>
           <w:sz w:val="17"/>
         </w:rPr>
         <w:t>Figure 10b - What each model actually leans on.</w:t>
@@ -1939,7 +1939,7 @@
         <w:rPr>
           <w:rFonts w:ascii="Calibri" w:hAnsi="Calibri"/>
           <w:b/>
-          <w:color w:val="22252A"/>
+          <w:color w:val="1D1D1B"/>
           <w:sz w:val="32"/>
         </w:rPr>
         <w:t>4.1  What to do about it</w:t>
@@ -1952,7 +1952,7 @@
       <w:r>
         <w:rPr>
           <w:b/>
-          <w:color w:val="E03127"/>
+          <w:color w:val="F52635"/>
         </w:rPr>
         <w:t xml:space="preserve">Marketing. </w:t>
       </w:r>
@@ -1973,7 +1973,7 @@
       <w:r>
         <w:rPr>
           <w:b/>
-          <w:color w:val="E03127"/>
+          <w:color w:val="F52635"/>
         </w:rPr>
         <w:t xml:space="preserve">Channel mix. </w:t>
       </w:r>
@@ -1994,7 +1994,7 @@
       <w:r>
         <w:rPr>
           <w:b/>
-          <w:color w:val="E03127"/>
+          <w:color w:val="F52635"/>
         </w:rPr>
         <w:t xml:space="preserve">Retention. </w:t>
       </w:r>
@@ -2015,7 +2015,7 @@
       <w:r>
         <w:rPr>
           <w:b/>
-          <w:color w:val="E03127"/>
+          <w:color w:val="F52635"/>
         </w:rPr>
         <w:t xml:space="preserve">Early warning. </w:t>
       </w:r>
@@ -2038,7 +2038,7 @@
         <w:rPr>
           <w:rFonts w:ascii="Calibri" w:hAnsi="Calibri"/>
           <w:b/>
-          <w:color w:val="22252A"/>
+          <w:color w:val="1D1D1B"/>
           <w:sz w:val="32"/>
         </w:rPr>
         <w:t>4.2  An honest caveat</w:t>
@@ -2063,7 +2063,7 @@
         <w:rPr>
           <w:rFonts w:ascii="Calibri" w:hAnsi="Calibri"/>
           <w:b/>
-          <w:color w:val="E03127"/>
+          <w:color w:val="F52635"/>
           <w:sz w:val="40"/>
         </w:rPr>
         <w:t>5  How the warehouse is organised</w:t>
@@ -2293,7 +2293,7 @@
       <w:r>
         <w:rPr>
           <w:i/>
-          <w:color w:val="5A6472"/>
+          <w:color w:val="60646B"/>
           <w:sz w:val="17"/>
         </w:rPr>
         <w:t>Figure 10c - The medallion, read from dbt’s manifest. Model counts and layer membership come from the build, so a model added or moved shows up here rather than the picture going stale.</w:t>
@@ -2308,7 +2308,7 @@
         <w:rPr>
           <w:rFonts w:ascii="Calibri" w:hAnsi="Calibri"/>
           <w:b/>
-          <w:color w:val="22252A"/>
+          <w:color w:val="1D1D1B"/>
           <w:sz w:val="32"/>
         </w:rPr>
         <w:t>5.1  The data model</w:t>
@@ -2365,7 +2365,7 @@
       <w:r>
         <w:rPr>
           <w:i/>
-          <w:color w:val="5A6472"/>
+          <w:color w:val="60646B"/>
           <w:sz w:val="17"/>
         </w:rPr>
         <w:t>Figure 10d - The semantic model, read from its TMDL. Facts sit at the centre in red, dimensions on the ring.</w:t>
@@ -2385,7 +2385,7 @@
         <w:rPr>
           <w:rFonts w:ascii="Calibri" w:hAnsi="Calibri"/>
           <w:b/>
-          <w:color w:val="E03127"/>
+          <w:color w:val="F52635"/>
           <w:sz w:val="40"/>
         </w:rPr>
         <w:t>6  The pipeline infrastructure</w:t>
@@ -2405,7 +2405,7 @@
         <w:rPr>
           <w:rFonts w:ascii="Calibri" w:hAnsi="Calibri"/>
           <w:b/>
-          <w:color w:val="22252A"/>
+          <w:color w:val="1D1D1B"/>
           <w:sz w:val="32"/>
         </w:rPr>
         <w:t>6.1  Apache NiFi</w:t>
@@ -2462,7 +2462,7 @@
       <w:r>
         <w:rPr>
           <w:i/>
-          <w:color w:val="5A6472"/>
+          <w:color w:val="60646B"/>
           <w:sz w:val="17"/>
         </w:rPr>
         <w:t>Figure 11 - The live NiFi hierarchy. RY_Salesforce_to_Fabric holds two stage groups; the LYRA groups are unrelated work on the same instance.</w:t>
@@ -2477,7 +2477,7 @@
         <w:rPr>
           <w:rFonts w:ascii="Calibri" w:hAnsi="Calibri"/>
           <w:b/>
-          <w:color w:val="22252A"/>
+          <w:color w:val="1D1D1B"/>
           <w:sz w:val="32"/>
         </w:rPr>
         <w:t>6.2  Microsoft Fabric</w:t>
@@ -2495,7 +2495,7 @@
       <w:r>
         <w:drawing>
           <wp:inline xmlns:a="http://schemas.openxmlformats.org/drawingml/2006/main" xmlns:pic="http://schemas.openxmlformats.org/drawingml/2006/picture">
-            <wp:extent cx="5577840" cy="3506244"/>
+            <wp:extent cx="5577840" cy="3651832"/>
             <wp:docPr id="20" name="Picture 20"/>
             <wp:cNvGraphicFramePr>
               <a:graphicFrameLocks noChangeAspect="1"/>
@@ -2516,7 +2516,7 @@
                   <pic:spPr>
                     <a:xfrm>
                       <a:off x="0" y="0"/>
-                      <a:ext cx="5577840" cy="3506244"/>
+                      <a:ext cx="5577840" cy="3651832"/>
                     </a:xfrm>
                     <a:prstGeom prst="rect"/>
                   </pic:spPr>
@@ -2534,7 +2534,7 @@
       <w:r>
         <w:rPr>
           <w:i/>
-          <w:color w:val="5A6472"/>
+          <w:color w:val="60646B"/>
           <w:sz w:val="17"/>
         </w:rPr>
         <w:t>Figure 12 - The Fabric workspace, its capacity, and what is actually in OneLake - listed back rather than assumed from the upload's own success message.</w:t>
@@ -2549,7 +2549,7 @@
         <w:rPr>
           <w:rFonts w:ascii="Calibri" w:hAnsi="Calibri"/>
           <w:b/>
-          <w:color w:val="22252A"/>
+          <w:color w:val="1D1D1B"/>
           <w:sz w:val="34"/>
         </w:rPr>
         <w:t>6.3  What is not claimed</w:t>

</xml_diff>

<commit_message>
Add canonical ERD evidence to ebook
</commit_message>
<xml_diff>
--- a/ebook/RedAndYellow_Data_Story.docx
+++ b/ebook/RedAndYellow_Data_Story.docx
@@ -2543,6 +2543,73 @@
     <w:p>
       <w:pPr>
         <w:pStyle w:val="Heading2"/>
+        <w:spacing w:before="240"/>
+      </w:pPr>
+      <w:r>
+        <w:rPr>
+          <w:rFonts w:ascii="Calibri" w:hAnsi="Calibri"/>
+          <w:b/>
+          <w:color w:val="1D1D1B"/>
+          <w:sz w:val="32"/>
+        </w:rPr>
+        <w:t>6.3  Screens from the org</w:t>
+      </w:r>
+    </w:p>
+    <w:p>
+      <w:pPr>
+        <w:jc w:val="center"/>
+      </w:pPr>
+      <w:r>
+        <w:drawing>
+          <wp:inline xmlns:a="http://schemas.openxmlformats.org/drawingml/2006/main" xmlns:pic="http://schemas.openxmlformats.org/drawingml/2006/picture">
+            <wp:extent cx="5394960" cy="4650828"/>
+            <wp:docPr id="21" name="Picture 21"/>
+            <wp:cNvGraphicFramePr>
+              <a:graphicFrameLocks noChangeAspect="1"/>
+            </wp:cNvGraphicFramePr>
+            <a:graphic>
+              <a:graphicData uri="http://schemas.openxmlformats.org/drawingml/2006/picture">
+                <pic:pic>
+                  <pic:nvPicPr>
+                    <pic:cNvPr id="0" name="03_Canonical_ERD.png"/>
+                    <pic:cNvPicPr/>
+                  </pic:nvPicPr>
+                  <pic:blipFill>
+                    <a:blip r:embed="rId29"/>
+                    <a:stretch>
+                      <a:fillRect/>
+                    </a:stretch>
+                  </pic:blipFill>
+                  <pic:spPr>
+                    <a:xfrm>
+                      <a:off x="0" y="0"/>
+                      <a:ext cx="5394960" cy="4650828"/>
+                    </a:xfrm>
+                    <a:prstGeom prst="rect"/>
+                  </pic:spPr>
+                </pic:pic>
+              </a:graphicData>
+            </a:graphic>
+          </wp:inline>
+        </w:drawing>
+      </w:r>
+    </w:p>
+    <w:p>
+      <w:pPr>
+        <w:jc w:val="center"/>
+      </w:pPr>
+      <w:r>
+        <w:rPr>
+          <w:i/>
+          <w:color w:val="60646B"/>
+          <w:sz w:val="17"/>
+        </w:rPr>
+        <w:t>Canonical ERD</w:t>
+      </w:r>
+    </w:p>
+    <w:p>
+      <w:pPr>
+        <w:pStyle w:val="Heading2"/>
         <w:spacing w:before="320"/>
       </w:pPr>
       <w:r>
@@ -2552,7 +2619,7 @@
           <w:color w:val="1D1D1B"/>
           <w:sz w:val="34"/>
         </w:rPr>
-        <w:t>6.3  What is not claimed</w:t>
+        <w:t>6.4  What is not claimed</w:t>
       </w:r>
     </w:p>
     <w:p>

</xml_diff>

<commit_message>
Refresh catalogue prices and package brand assets
</commit_message>
<xml_diff>
--- a/ebook/RedAndYellow_Data_Story.docx
+++ b/ebook/RedAndYellow_Data_Story.docx
@@ -4,7 +4,51 @@
   <w:body>
     <w:p>
       <w:pPr>
-        <w:spacing w:before="1800"/>
+        <w:spacing w:before="360"/>
+      </w:pPr>
+    </w:p>
+    <w:p>
+      <w:pPr>
+        <w:jc w:val="center"/>
+      </w:pPr>
+      <w:r>
+        <w:drawing>
+          <wp:inline xmlns:a="http://schemas.openxmlformats.org/drawingml/2006/main" xmlns:pic="http://schemas.openxmlformats.org/drawingml/2006/picture">
+            <wp:extent cx="1234440" cy="1234440"/>
+            <wp:docPr id="1" name="Picture 1"/>
+            <wp:cNvGraphicFramePr>
+              <a:graphicFrameLocks noChangeAspect="1"/>
+            </wp:cNvGraphicFramePr>
+            <a:graphic>
+              <a:graphicData uri="http://schemas.openxmlformats.org/drawingml/2006/picture">
+                <pic:pic>
+                  <pic:nvPicPr>
+                    <pic:cNvPr id="0" name="red-yellow-logo.png"/>
+                    <pic:cNvPicPr/>
+                  </pic:nvPicPr>
+                  <pic:blipFill>
+                    <a:blip r:embed="rId9"/>
+                    <a:stretch>
+                      <a:fillRect/>
+                    </a:stretch>
+                  </pic:blipFill>
+                  <pic:spPr>
+                    <a:xfrm>
+                      <a:off x="0" y="0"/>
+                      <a:ext cx="1234440" cy="1234440"/>
+                    </a:xfrm>
+                    <a:prstGeom prst="rect"/>
+                  </pic:spPr>
+                </pic:pic>
+              </a:graphicData>
+            </a:graphic>
+          </wp:inline>
+        </w:drawing>
+      </w:r>
+    </w:p>
+    <w:p>
+      <w:pPr>
+        <w:spacing w:before="360"/>
       </w:pPr>
       <w:r>
         <w:rPr>
@@ -229,8 +273,60 @@
       <w:r>
         <w:drawing>
           <wp:inline xmlns:a="http://schemas.openxmlformats.org/drawingml/2006/main" xmlns:pic="http://schemas.openxmlformats.org/drawingml/2006/picture">
+            <wp:extent cx="5577840" cy="2221682"/>
+            <wp:docPr id="2" name="Picture 2"/>
+            <wp:cNvGraphicFramePr>
+              <a:graphicFrameLocks noChangeAspect="1"/>
+            </wp:cNvGraphicFramePr>
+            <a:graphic>
+              <a:graphicData uri="http://schemas.openxmlformats.org/drawingml/2006/picture">
+                <pic:pic>
+                  <pic:nvPicPr>
+                    <pic:cNvPr id="0" name="creative-magic-commercial-logic.png"/>
+                    <pic:cNvPicPr/>
+                  </pic:nvPicPr>
+                  <pic:blipFill>
+                    <a:blip r:embed="rId10"/>
+                    <a:stretch>
+                      <a:fillRect/>
+                    </a:stretch>
+                  </pic:blipFill>
+                  <pic:spPr>
+                    <a:xfrm>
+                      <a:off x="0" y="0"/>
+                      <a:ext cx="5577840" cy="2221682"/>
+                    </a:xfrm>
+                    <a:prstGeom prst="rect"/>
+                  </pic:spPr>
+                </pic:pic>
+              </a:graphicData>
+            </a:graphic>
+          </wp:inline>
+        </w:drawing>
+      </w:r>
+    </w:p>
+    <w:p>
+      <w:pPr>
+        <w:jc w:val="center"/>
+      </w:pPr>
+      <w:r>
+        <w:rPr>
+          <w:i/>
+          <w:color w:val="60646B"/>
+          <w:sz w:val="17"/>
+        </w:rPr>
+        <w:t>Red &amp; Yellow's Creative Magic and Commercial Logic — the brand idea that frames this data story.</w:t>
+      </w:r>
+    </w:p>
+    <w:p>
+      <w:pPr>
+        <w:jc w:val="center"/>
+      </w:pPr>
+      <w:r>
+        <w:drawing>
+          <wp:inline xmlns:a="http://schemas.openxmlformats.org/drawingml/2006/main" xmlns:pic="http://schemas.openxmlformats.org/drawingml/2006/picture">
             <wp:extent cx="5577840" cy="1780162"/>
-            <wp:docPr id="1" name="Picture 1"/>
+            <wp:docPr id="3" name="Picture 3"/>
             <wp:cNvGraphicFramePr>
               <a:graphicFrameLocks noChangeAspect="1"/>
             </wp:cNvGraphicFramePr>
@@ -242,7 +338,7 @@
                     <pic:cNvPicPr/>
                   </pic:nvPicPr>
                   <pic:blipFill>
-                    <a:blip r:embed="rId9"/>
+                    <a:blip r:embed="rId11"/>
                     <a:stretch>
                       <a:fillRect/>
                     </a:stretch>
@@ -507,7 +603,7 @@
         <w:drawing>
           <wp:inline xmlns:a="http://schemas.openxmlformats.org/drawingml/2006/main" xmlns:pic="http://schemas.openxmlformats.org/drawingml/2006/picture">
             <wp:extent cx="5577840" cy="2614612"/>
-            <wp:docPr id="2" name="Picture 2"/>
+            <wp:docPr id="4" name="Picture 4"/>
             <wp:cNvGraphicFramePr>
               <a:graphicFrameLocks noChangeAspect="1"/>
             </wp:cNvGraphicFramePr>
@@ -519,7 +615,7 @@
                     <pic:cNvPicPr/>
                   </pic:nvPicPr>
                   <pic:blipFill>
-                    <a:blip r:embed="rId10"/>
+                    <a:blip r:embed="rId12"/>
                     <a:stretch>
                       <a:fillRect/>
                     </a:stretch>
@@ -584,7 +680,7 @@
         <w:drawing>
           <wp:inline xmlns:a="http://schemas.openxmlformats.org/drawingml/2006/main" xmlns:pic="http://schemas.openxmlformats.org/drawingml/2006/picture">
             <wp:extent cx="5577840" cy="2614612"/>
-            <wp:docPr id="3" name="Picture 3"/>
+            <wp:docPr id="5" name="Picture 5"/>
             <wp:cNvGraphicFramePr>
               <a:graphicFrameLocks noChangeAspect="1"/>
             </wp:cNvGraphicFramePr>
@@ -596,7 +692,7 @@
                     <pic:cNvPicPr/>
                   </pic:nvPicPr>
                   <pic:blipFill>
-                    <a:blip r:embed="rId11"/>
+                    <a:blip r:embed="rId13"/>
                     <a:stretch>
                       <a:fillRect/>
                     </a:stretch>
@@ -661,7 +757,7 @@
         <w:drawing>
           <wp:inline xmlns:a="http://schemas.openxmlformats.org/drawingml/2006/main" xmlns:pic="http://schemas.openxmlformats.org/drawingml/2006/picture">
             <wp:extent cx="5577840" cy="2614612"/>
-            <wp:docPr id="4" name="Picture 4"/>
+            <wp:docPr id="6" name="Picture 6"/>
             <wp:cNvGraphicFramePr>
               <a:graphicFrameLocks noChangeAspect="1"/>
             </wp:cNvGraphicFramePr>
@@ -673,7 +769,7 @@
                     <pic:cNvPicPr/>
                   </pic:nvPicPr>
                   <pic:blipFill>
-                    <a:blip r:embed="rId12"/>
+                    <a:blip r:embed="rId14"/>
                     <a:stretch>
                       <a:fillRect/>
                     </a:stretch>
@@ -768,7 +864,7 @@
         <w:drawing>
           <wp:inline xmlns:a="http://schemas.openxmlformats.org/drawingml/2006/main" xmlns:pic="http://schemas.openxmlformats.org/drawingml/2006/picture">
             <wp:extent cx="5577840" cy="2963228"/>
-            <wp:docPr id="5" name="Picture 5"/>
+            <wp:docPr id="7" name="Picture 7"/>
             <wp:cNvGraphicFramePr>
               <a:graphicFrameLocks noChangeAspect="1"/>
             </wp:cNvGraphicFramePr>
@@ -780,7 +876,7 @@
                     <pic:cNvPicPr/>
                   </pic:nvPicPr>
                   <pic:blipFill>
-                    <a:blip r:embed="rId13"/>
+                    <a:blip r:embed="rId15"/>
                     <a:stretch>
                       <a:fillRect/>
                     </a:stretch>
@@ -840,7 +936,7 @@
         <w:drawing>
           <wp:inline xmlns:a="http://schemas.openxmlformats.org/drawingml/2006/main" xmlns:pic="http://schemas.openxmlformats.org/drawingml/2006/picture">
             <wp:extent cx="5577840" cy="3137535"/>
-            <wp:docPr id="6" name="Picture 6"/>
+            <wp:docPr id="8" name="Picture 8"/>
             <wp:cNvGraphicFramePr>
               <a:graphicFrameLocks noChangeAspect="1"/>
             </wp:cNvGraphicFramePr>
@@ -852,7 +948,7 @@
                     <pic:cNvPicPr/>
                   </pic:nvPicPr>
                   <pic:blipFill>
-                    <a:blip r:embed="rId14"/>
+                    <a:blip r:embed="rId16"/>
                     <a:stretch>
                       <a:fillRect/>
                     </a:stretch>
@@ -912,7 +1008,7 @@
         <w:drawing>
           <wp:inline xmlns:a="http://schemas.openxmlformats.org/drawingml/2006/main" xmlns:pic="http://schemas.openxmlformats.org/drawingml/2006/picture">
             <wp:extent cx="5577840" cy="2527459"/>
-            <wp:docPr id="7" name="Picture 7"/>
+            <wp:docPr id="9" name="Picture 9"/>
             <wp:cNvGraphicFramePr>
               <a:graphicFrameLocks noChangeAspect="1"/>
             </wp:cNvGraphicFramePr>
@@ -924,7 +1020,7 @@
                     <pic:cNvPicPr/>
                   </pic:nvPicPr>
                   <pic:blipFill>
-                    <a:blip r:embed="rId15"/>
+                    <a:blip r:embed="rId17"/>
                     <a:stretch>
                       <a:fillRect/>
                     </a:stretch>
@@ -958,6 +1054,58 @@
     </w:p>
     <w:p>
       <w:pPr>
+        <w:jc w:val="center"/>
+      </w:pPr>
+      <w:r>
+        <w:drawing>
+          <wp:inline xmlns:a="http://schemas.openxmlformats.org/drawingml/2006/main" xmlns:pic="http://schemas.openxmlformats.org/drawingml/2006/picture">
+            <wp:extent cx="5577840" cy="3129944"/>
+            <wp:docPr id="10" name="Picture 10"/>
+            <wp:cNvGraphicFramePr>
+              <a:graphicFrameLocks noChangeAspect="1"/>
+            </wp:cNvGraphicFramePr>
+            <a:graphic>
+              <a:graphicData uri="http://schemas.openxmlformats.org/drawingml/2006/picture">
+                <pic:pic>
+                  <pic:nvPicPr>
+                    <pic:cNvPr id="0" name="student-cohort.jfif"/>
+                    <pic:cNvPicPr/>
+                  </pic:nvPicPr>
+                  <pic:blipFill>
+                    <a:blip r:embed="rId18"/>
+                    <a:stretch>
+                      <a:fillRect/>
+                    </a:stretch>
+                  </pic:blipFill>
+                  <pic:spPr>
+                    <a:xfrm>
+                      <a:off x="0" y="0"/>
+                      <a:ext cx="5577840" cy="3129944"/>
+                    </a:xfrm>
+                    <a:prstGeom prst="rect"/>
+                  </pic:spPr>
+                </pic:pic>
+              </a:graphicData>
+            </a:graphic>
+          </wp:inline>
+        </w:drawing>
+      </w:r>
+    </w:p>
+    <w:p>
+      <w:pPr>
+        <w:jc w:val="center"/>
+      </w:pPr>
+      <w:r>
+        <w:rPr>
+          <w:i/>
+          <w:color w:val="60646B"/>
+          <w:sz w:val="17"/>
+        </w:rPr>
+        <w:t>Red &amp; Yellow student community — supplied brand image used as context for the learner journey.</w:t>
+      </w:r>
+    </w:p>
+    <w:p>
+      <w:pPr>
         <w:pStyle w:val="Heading3"/>
         <w:spacing w:before="240"/>
       </w:pPr>
@@ -984,7 +1132,7 @@
         <w:drawing>
           <wp:inline xmlns:a="http://schemas.openxmlformats.org/drawingml/2006/main" xmlns:pic="http://schemas.openxmlformats.org/drawingml/2006/picture">
             <wp:extent cx="5577840" cy="2265998"/>
-            <wp:docPr id="8" name="Picture 8"/>
+            <wp:docPr id="11" name="Picture 11"/>
             <wp:cNvGraphicFramePr>
               <a:graphicFrameLocks noChangeAspect="1"/>
             </wp:cNvGraphicFramePr>
@@ -996,7 +1144,7 @@
                     <pic:cNvPicPr/>
                   </pic:nvPicPr>
                   <pic:blipFill>
-                    <a:blip r:embed="rId16"/>
+                    <a:blip r:embed="rId19"/>
                     <a:stretch>
                       <a:fillRect/>
                     </a:stretch>
@@ -1241,7 +1389,7 @@
         <w:drawing>
           <wp:inline xmlns:a="http://schemas.openxmlformats.org/drawingml/2006/main" xmlns:pic="http://schemas.openxmlformats.org/drawingml/2006/picture">
             <wp:extent cx="5577840" cy="3078579"/>
-            <wp:docPr id="9" name="Picture 9"/>
+            <wp:docPr id="12" name="Picture 12"/>
             <wp:cNvGraphicFramePr>
               <a:graphicFrameLocks noChangeAspect="1"/>
             </wp:cNvGraphicFramePr>
@@ -1253,7 +1401,7 @@
                     <pic:cNvPicPr/>
                   </pic:nvPicPr>
                   <pic:blipFill>
-                    <a:blip r:embed="rId17"/>
+                    <a:blip r:embed="rId20"/>
                     <a:stretch>
                       <a:fillRect/>
                     </a:stretch>
@@ -1313,7 +1461,7 @@
         <w:drawing>
           <wp:inline xmlns:a="http://schemas.openxmlformats.org/drawingml/2006/main" xmlns:pic="http://schemas.openxmlformats.org/drawingml/2006/picture">
             <wp:extent cx="5577840" cy="2939058"/>
-            <wp:docPr id="10" name="Picture 10"/>
+            <wp:docPr id="13" name="Picture 13"/>
             <wp:cNvGraphicFramePr>
               <a:graphicFrameLocks noChangeAspect="1"/>
             </wp:cNvGraphicFramePr>
@@ -1325,7 +1473,7 @@
                     <pic:cNvPicPr/>
                   </pic:nvPicPr>
                   <pic:blipFill>
-                    <a:blip r:embed="rId18"/>
+                    <a:blip r:embed="rId21"/>
                     <a:stretch>
                       <a:fillRect/>
                     </a:stretch>
@@ -1385,7 +1533,7 @@
         <w:drawing>
           <wp:inline xmlns:a="http://schemas.openxmlformats.org/drawingml/2006/main" xmlns:pic="http://schemas.openxmlformats.org/drawingml/2006/picture">
             <wp:extent cx="5577840" cy="2368838"/>
-            <wp:docPr id="11" name="Picture 11"/>
+            <wp:docPr id="14" name="Picture 14"/>
             <wp:cNvGraphicFramePr>
               <a:graphicFrameLocks noChangeAspect="1"/>
             </wp:cNvGraphicFramePr>
@@ -1397,7 +1545,7 @@
                     <pic:cNvPicPr/>
                   </pic:nvPicPr>
                   <pic:blipFill>
-                    <a:blip r:embed="rId19"/>
+                    <a:blip r:embed="rId22"/>
                     <a:stretch>
                       <a:fillRect/>
                     </a:stretch>
@@ -1437,7 +1585,7 @@
         <w:drawing>
           <wp:inline xmlns:a="http://schemas.openxmlformats.org/drawingml/2006/main" xmlns:pic="http://schemas.openxmlformats.org/drawingml/2006/picture">
             <wp:extent cx="5577840" cy="2939058"/>
-            <wp:docPr id="12" name="Picture 12"/>
+            <wp:docPr id="15" name="Picture 15"/>
             <wp:cNvGraphicFramePr>
               <a:graphicFrameLocks noChangeAspect="1"/>
             </wp:cNvGraphicFramePr>
@@ -1449,7 +1597,7 @@
                     <pic:cNvPicPr/>
                   </pic:nvPicPr>
                   <pic:blipFill>
-                    <a:blip r:embed="rId20"/>
+                    <a:blip r:embed="rId23"/>
                     <a:stretch>
                       <a:fillRect/>
                     </a:stretch>
@@ -1509,7 +1657,7 @@
         <w:drawing>
           <wp:inline xmlns:a="http://schemas.openxmlformats.org/drawingml/2006/main" xmlns:pic="http://schemas.openxmlformats.org/drawingml/2006/picture">
             <wp:extent cx="5577840" cy="2226283"/>
-            <wp:docPr id="13" name="Picture 13"/>
+            <wp:docPr id="16" name="Picture 16"/>
             <wp:cNvGraphicFramePr>
               <a:graphicFrameLocks noChangeAspect="1"/>
             </wp:cNvGraphicFramePr>
@@ -1521,7 +1669,7 @@
                     <pic:cNvPicPr/>
                   </pic:nvPicPr>
                   <pic:blipFill>
-                    <a:blip r:embed="rId21"/>
+                    <a:blip r:embed="rId24"/>
                     <a:stretch>
                       <a:fillRect/>
                     </a:stretch>
@@ -1581,7 +1729,7 @@
         <w:drawing>
           <wp:inline xmlns:a="http://schemas.openxmlformats.org/drawingml/2006/main" xmlns:pic="http://schemas.openxmlformats.org/drawingml/2006/picture">
             <wp:extent cx="5577840" cy="1798618"/>
-            <wp:docPr id="14" name="Picture 14"/>
+            <wp:docPr id="17" name="Picture 17"/>
             <wp:cNvGraphicFramePr>
               <a:graphicFrameLocks noChangeAspect="1"/>
             </wp:cNvGraphicFramePr>
@@ -1593,7 +1741,7 @@
                     <pic:cNvPicPr/>
                   </pic:nvPicPr>
                   <pic:blipFill>
-                    <a:blip r:embed="rId22"/>
+                    <a:blip r:embed="rId25"/>
                     <a:stretch>
                       <a:fillRect/>
                     </a:stretch>
@@ -1834,7 +1982,7 @@
         <w:drawing>
           <wp:inline xmlns:a="http://schemas.openxmlformats.org/drawingml/2006/main" xmlns:pic="http://schemas.openxmlformats.org/drawingml/2006/picture">
             <wp:extent cx="5577840" cy="2281844"/>
-            <wp:docPr id="15" name="Picture 15"/>
+            <wp:docPr id="18" name="Picture 18"/>
             <wp:cNvGraphicFramePr>
               <a:graphicFrameLocks noChangeAspect="1"/>
             </wp:cNvGraphicFramePr>
@@ -1846,7 +1994,7 @@
                     <pic:cNvPicPr/>
                   </pic:nvPicPr>
                   <pic:blipFill>
-                    <a:blip r:embed="rId23"/>
+                    <a:blip r:embed="rId26"/>
                     <a:stretch>
                       <a:fillRect/>
                     </a:stretch>
@@ -1886,7 +2034,7 @@
         <w:drawing>
           <wp:inline xmlns:a="http://schemas.openxmlformats.org/drawingml/2006/main" xmlns:pic="http://schemas.openxmlformats.org/drawingml/2006/picture">
             <wp:extent cx="5577840" cy="2281844"/>
-            <wp:docPr id="16" name="Picture 16"/>
+            <wp:docPr id="19" name="Picture 19"/>
             <wp:cNvGraphicFramePr>
               <a:graphicFrameLocks noChangeAspect="1"/>
             </wp:cNvGraphicFramePr>
@@ -1898,7 +2046,7 @@
                     <pic:cNvPicPr/>
                   </pic:nvPicPr>
                   <pic:blipFill>
-                    <a:blip r:embed="rId24"/>
+                    <a:blip r:embed="rId27"/>
                     <a:stretch>
                       <a:fillRect/>
                     </a:stretch>
@@ -2255,7 +2403,7 @@
         <w:drawing>
           <wp:inline xmlns:a="http://schemas.openxmlformats.org/drawingml/2006/main" xmlns:pic="http://schemas.openxmlformats.org/drawingml/2006/picture">
             <wp:extent cx="5577840" cy="2551565"/>
-            <wp:docPr id="17" name="Picture 17"/>
+            <wp:docPr id="20" name="Picture 20"/>
             <wp:cNvGraphicFramePr>
               <a:graphicFrameLocks noChangeAspect="1"/>
             </wp:cNvGraphicFramePr>
@@ -2267,7 +2415,7 @@
                     <pic:cNvPicPr/>
                   </pic:nvPicPr>
                   <pic:blipFill>
-                    <a:blip r:embed="rId25"/>
+                    <a:blip r:embed="rId28"/>
                     <a:stretch>
                       <a:fillRect/>
                     </a:stretch>
@@ -2327,7 +2475,7 @@
         <w:drawing>
           <wp:inline xmlns:a="http://schemas.openxmlformats.org/drawingml/2006/main" xmlns:pic="http://schemas.openxmlformats.org/drawingml/2006/picture">
             <wp:extent cx="5577840" cy="3560323"/>
-            <wp:docPr id="18" name="Picture 18"/>
+            <wp:docPr id="21" name="Picture 21"/>
             <wp:cNvGraphicFramePr>
               <a:graphicFrameLocks noChangeAspect="1"/>
             </wp:cNvGraphicFramePr>
@@ -2339,7 +2487,7 @@
                     <pic:cNvPicPr/>
                   </pic:nvPicPr>
                   <pic:blipFill>
-                    <a:blip r:embed="rId26"/>
+                    <a:blip r:embed="rId29"/>
                     <a:stretch>
                       <a:fillRect/>
                     </a:stretch>
@@ -2424,7 +2572,7 @@
         <w:drawing>
           <wp:inline xmlns:a="http://schemas.openxmlformats.org/drawingml/2006/main" xmlns:pic="http://schemas.openxmlformats.org/drawingml/2006/picture">
             <wp:extent cx="5577840" cy="6502930"/>
-            <wp:docPr id="19" name="Picture 19"/>
+            <wp:docPr id="22" name="Picture 22"/>
             <wp:cNvGraphicFramePr>
               <a:graphicFrameLocks noChangeAspect="1"/>
             </wp:cNvGraphicFramePr>
@@ -2436,7 +2584,7 @@
                     <pic:cNvPicPr/>
                   </pic:nvPicPr>
                   <pic:blipFill>
-                    <a:blip r:embed="rId27"/>
+                    <a:blip r:embed="rId30"/>
                     <a:stretch>
                       <a:fillRect/>
                     </a:stretch>
@@ -2496,7 +2644,7 @@
         <w:drawing>
           <wp:inline xmlns:a="http://schemas.openxmlformats.org/drawingml/2006/main" xmlns:pic="http://schemas.openxmlformats.org/drawingml/2006/picture">
             <wp:extent cx="5577840" cy="3651832"/>
-            <wp:docPr id="20" name="Picture 20"/>
+            <wp:docPr id="23" name="Picture 23"/>
             <wp:cNvGraphicFramePr>
               <a:graphicFrameLocks noChangeAspect="1"/>
             </wp:cNvGraphicFramePr>
@@ -2508,7 +2656,7 @@
                     <pic:cNvPicPr/>
                   </pic:nvPicPr>
                   <pic:blipFill>
-                    <a:blip r:embed="rId28"/>
+                    <a:blip r:embed="rId31"/>
                     <a:stretch>
                       <a:fillRect/>
                     </a:stretch>
@@ -2563,7 +2711,7 @@
         <w:drawing>
           <wp:inline xmlns:a="http://schemas.openxmlformats.org/drawingml/2006/main" xmlns:pic="http://schemas.openxmlformats.org/drawingml/2006/picture">
             <wp:extent cx="5394960" cy="4650828"/>
-            <wp:docPr id="21" name="Picture 21"/>
+            <wp:docPr id="24" name="Picture 24"/>
             <wp:cNvGraphicFramePr>
               <a:graphicFrameLocks noChangeAspect="1"/>
             </wp:cNvGraphicFramePr>
@@ -2575,7 +2723,7 @@
                     <pic:cNvPicPr/>
                   </pic:nvPicPr>
                   <pic:blipFill>
-                    <a:blip r:embed="rId29"/>
+                    <a:blip r:embed="rId32"/>
                     <a:stretch>
                       <a:fillRect/>
                     </a:stretch>

</xml_diff>

<commit_message>
Clarify GA4 extension and AI decision flow
</commit_message>
<xml_diff>
--- a/ebook/RedAndYellow_Data_Story.docx
+++ b/ebook/RedAndYellow_Data_Story.docx
@@ -2198,6 +2198,26 @@
       </w:r>
     </w:p>
     <w:p>
+      <w:pPr>
+        <w:pStyle w:val="Heading2"/>
+        <w:spacing w:before="240"/>
+      </w:pPr>
+      <w:r>
+        <w:rPr>
+          <w:rFonts w:ascii="Calibri" w:hAnsi="Calibri"/>
+          <w:b/>
+          <w:color w:val="1D1D1B"/>
+          <w:sz w:val="32"/>
+        </w:rPr>
+        <w:t>4.3  From AI score to a human decision</w:t>
+      </w:r>
+    </w:p>
+    <w:p>
+      <w:r>
+        <w:t>The model outputs are warehouse tables, not autonomous CRM actions. The lead-propensity score orders a worklist: a recruiter can spend their next call on the leads most likely to enrol, while still seeing the band and the underlying CRM record. The withdrawal-risk score is an early-warning list for a student-success team. It should trigger a conversation or support offer, never an automated adverse decision. Power BI exposes the score distribution and observed outcomes so a team can see whether the ranking remains useful before operationalising it.</w:t>
+      </w:r>
+    </w:p>
+    <w:p>
       <w:r>
         <w:br w:type="page"/>
       </w:r>
@@ -2700,7 +2720,79 @@
           <w:color w:val="1D1D1B"/>
           <w:sz w:val="32"/>
         </w:rPr>
-        <w:t>6.3  Screens from the org</w:t>
+        <w:t>6.3  GA4 to Fabric — the next integration, not a claimed result</w:t>
+      </w:r>
+    </w:p>
+    <w:p>
+      <w:r>
+        <w:t>GA4 is not configured in this repository: there is no GA4 credential, connector or warehouse source table, and no report number uses GA4 data. The practical next route is a scheduled GA4 Data API extract or a BigQuery export into an immutable OneLake bronze partition by event date. A dbt staging model would then conform date and campaign keys before a gold attribution mart joins aggregate reach and traffic to the campaign spine already used by Power BI. Keep user-level analytics identifiers out of the CRM join; campaign, source and date are enough for the first use case.</w:t>
+      </w:r>
+    </w:p>
+    <w:p>
+      <w:pPr>
+        <w:jc w:val="center"/>
+      </w:pPr>
+      <w:r>
+        <w:drawing>
+          <wp:inline xmlns:a="http://schemas.openxmlformats.org/drawingml/2006/main" xmlns:pic="http://schemas.openxmlformats.org/drawingml/2006/picture">
+            <wp:extent cx="5577840" cy="2048113"/>
+            <wp:docPr id="24" name="Picture 24"/>
+            <wp:cNvGraphicFramePr>
+              <a:graphicFrameLocks noChangeAspect="1"/>
+            </wp:cNvGraphicFramePr>
+            <a:graphic>
+              <a:graphicData uri="http://schemas.openxmlformats.org/drawingml/2006/picture">
+                <pic:pic>
+                  <pic:nvPicPr>
+                    <pic:cNvPr id="0" name="ga4_to_fabric.png"/>
+                    <pic:cNvPicPr/>
+                  </pic:nvPicPr>
+                  <pic:blipFill>
+                    <a:blip r:embed="rId32"/>
+                    <a:stretch>
+                      <a:fillRect/>
+                    </a:stretch>
+                  </pic:blipFill>
+                  <pic:spPr>
+                    <a:xfrm>
+                      <a:off x="0" y="0"/>
+                      <a:ext cx="5577840" cy="2048113"/>
+                    </a:xfrm>
+                    <a:prstGeom prst="rect"/>
+                  </pic:spPr>
+                </pic:pic>
+              </a:graphicData>
+            </a:graphic>
+          </wp:inline>
+        </w:drawing>
+      </w:r>
+    </w:p>
+    <w:p>
+      <w:pPr>
+        <w:jc w:val="center"/>
+      </w:pPr>
+      <w:r>
+        <w:rPr>
+          <w:i/>
+          <w:color w:val="60646B"/>
+          <w:sz w:val="17"/>
+        </w:rPr>
+        <w:t>Figure 13 - Proposed GA4 extension. It is intentionally separated from the verified Salesforce-to-Fabric flow.</w:t>
+      </w:r>
+    </w:p>
+    <w:p>
+      <w:pPr>
+        <w:pStyle w:val="Heading2"/>
+        <w:spacing w:before="240"/>
+      </w:pPr>
+      <w:r>
+        <w:rPr>
+          <w:rFonts w:ascii="Calibri" w:hAnsi="Calibri"/>
+          <w:b/>
+          <w:color w:val="1D1D1B"/>
+          <w:sz w:val="32"/>
+        </w:rPr>
+        <w:t>6.4  Screens from the org</w:t>
       </w:r>
     </w:p>
     <w:p>
@@ -2711,7 +2803,7 @@
         <w:drawing>
           <wp:inline xmlns:a="http://schemas.openxmlformats.org/drawingml/2006/main" xmlns:pic="http://schemas.openxmlformats.org/drawingml/2006/picture">
             <wp:extent cx="5394960" cy="4650828"/>
-            <wp:docPr id="24" name="Picture 24"/>
+            <wp:docPr id="25" name="Picture 25"/>
             <wp:cNvGraphicFramePr>
               <a:graphicFrameLocks noChangeAspect="1"/>
             </wp:cNvGraphicFramePr>
@@ -2723,7 +2815,7 @@
                     <pic:cNvPicPr/>
                   </pic:nvPicPr>
                   <pic:blipFill>
-                    <a:blip r:embed="rId32"/>
+                    <a:blip r:embed="rId33"/>
                     <a:stretch>
                       <a:fillRect/>
                     </a:stretch>
@@ -2767,7 +2859,7 @@
           <w:color w:val="1D1D1B"/>
           <w:sz w:val="34"/>
         </w:rPr>
-        <w:t>6.4  What is not claimed</w:t>
+        <w:t>6.5  What is not claimed</w:t>
       </w:r>
     </w:p>
     <w:p>

</xml_diff>

<commit_message>
Expand marketing analytics and document Fabric bronze
</commit_message>
<xml_diff>
--- a/ebook/RedAndYellow_Data_Story.docx
+++ b/ebook/RedAndYellow_Data_Story.docx
@@ -727,6 +727,78 @@
     <w:p>
       <w:pPr>
         <w:pStyle w:val="Heading2"/>
+        <w:spacing w:before="240"/>
+      </w:pPr>
+      <w:r>
+        <w:rPr>
+          <w:rFonts w:ascii="Calibri" w:hAnsi="Calibri"/>
+          <w:b/>
+          <w:color w:val="1D1D1B"/>
+          <w:sz w:val="32"/>
+        </w:rPr>
+        <w:t>2.3  Marketing analytics, from audience to value</w:t>
+      </w:r>
+    </w:p>
+    <w:p>
+      <w:r>
+        <w:t>The marketing page separates reach, response, enrolment and value. Response rate tells the team whether a channel is reaching an interested audience; cost per enrolment tells it what that audience costs to convert; return on ad spend tests whether the resulting fees justify the investment. Revenue per member and spend per response make the same comparison usable before a campaign has accumulated enough enrolments for a stable cost-per-enrolment figure.</w:t>
+      </w:r>
+    </w:p>
+    <w:p>
+      <w:pPr>
+        <w:jc w:val="center"/>
+      </w:pPr>
+      <w:r>
+        <w:drawing>
+          <wp:inline xmlns:a="http://schemas.openxmlformats.org/drawingml/2006/main" xmlns:pic="http://schemas.openxmlformats.org/drawingml/2006/picture">
+            <wp:extent cx="5577840" cy="2440305"/>
+            <wp:docPr id="6" name="Picture 6"/>
+            <wp:cNvGraphicFramePr>
+              <a:graphicFrameLocks noChangeAspect="1"/>
+            </wp:cNvGraphicFramePr>
+            <a:graphic>
+              <a:graphicData uri="http://schemas.openxmlformats.org/drawingml/2006/picture">
+                <pic:pic>
+                  <pic:nvPicPr>
+                    <pic:cNvPr id="0" name="marketing_efficiency.png"/>
+                    <pic:cNvPicPr/>
+                  </pic:nvPicPr>
+                  <pic:blipFill>
+                    <a:blip r:embed="rId14"/>
+                    <a:stretch>
+                      <a:fillRect/>
+                    </a:stretch>
+                  </pic:blipFill>
+                  <pic:spPr>
+                    <a:xfrm>
+                      <a:off x="0" y="0"/>
+                      <a:ext cx="5577840" cy="2440305"/>
+                    </a:xfrm>
+                    <a:prstGeom prst="rect"/>
+                  </pic:spPr>
+                </pic:pic>
+              </a:graphicData>
+            </a:graphic>
+          </wp:inline>
+        </w:drawing>
+      </w:r>
+    </w:p>
+    <w:p>
+      <w:pPr>
+        <w:jc w:val="center"/>
+      </w:pPr>
+      <w:r>
+        <w:rPr>
+          <w:i/>
+          <w:color w:val="60646B"/>
+          <w:sz w:val="17"/>
+        </w:rPr>
+        <w:t>Figure 2a - Campaign response rate and return on ad spend by channel. Both are calculated at campaign grain before they are aggregated.</w:t>
+      </w:r>
+    </w:p>
+    <w:p>
+      <w:pPr>
+        <w:pStyle w:val="Heading2"/>
         <w:spacing w:before="320"/>
       </w:pPr>
       <w:r>
@@ -736,7 +808,7 @@
           <w:color w:val="1D1D1B"/>
           <w:sz w:val="34"/>
         </w:rPr>
-        <w:t>2.3  Student success as an early warning</w:t>
+        <w:t>2.4  Student success as an early warning</w:t>
       </w:r>
     </w:p>
     <w:p>
@@ -757,7 +829,7 @@
         <w:drawing>
           <wp:inline xmlns:a="http://schemas.openxmlformats.org/drawingml/2006/main" xmlns:pic="http://schemas.openxmlformats.org/drawingml/2006/picture">
             <wp:extent cx="5577840" cy="2614612"/>
-            <wp:docPr id="6" name="Picture 6"/>
+            <wp:docPr id="7" name="Picture 7"/>
             <wp:cNvGraphicFramePr>
               <a:graphicFrameLocks noChangeAspect="1"/>
             </wp:cNvGraphicFramePr>
@@ -769,7 +841,7 @@
                     <pic:cNvPicPr/>
                   </pic:nvPicPr>
                   <pic:blipFill>
-                    <a:blip r:embed="rId14"/>
+                    <a:blip r:embed="rId15"/>
                     <a:stretch>
                       <a:fillRect/>
                     </a:stretch>
@@ -813,7 +885,7 @@
           <w:color w:val="1D1D1B"/>
           <w:sz w:val="34"/>
         </w:rPr>
-        <w:t>2.4  Data quality, measured rather than asserted</w:t>
+        <w:t>2.5  Data quality, measured rather than asserted</w:t>
       </w:r>
     </w:p>
     <w:p>
@@ -838,7 +910,7 @@
           <w:color w:val="1D1D1B"/>
           <w:sz w:val="26"/>
         </w:rPr>
-        <w:t>2.4.1  Why de-duplication needed two keys</w:t>
+        <w:t>2.5.1  Why de-duplication needed two keys</w:t>
       </w:r>
     </w:p>
     <w:p>
@@ -864,7 +936,7 @@
         <w:drawing>
           <wp:inline xmlns:a="http://schemas.openxmlformats.org/drawingml/2006/main" xmlns:pic="http://schemas.openxmlformats.org/drawingml/2006/picture">
             <wp:extent cx="5577840" cy="2963228"/>
-            <wp:docPr id="7" name="Picture 7"/>
+            <wp:docPr id="8" name="Picture 8"/>
             <wp:cNvGraphicFramePr>
               <a:graphicFrameLocks noChangeAspect="1"/>
             </wp:cNvGraphicFramePr>
@@ -876,7 +948,7 @@
                     <pic:cNvPicPr/>
                   </pic:nvPicPr>
                   <pic:blipFill>
-                    <a:blip r:embed="rId15"/>
+                    <a:blip r:embed="rId16"/>
                     <a:stretch>
                       <a:fillRect/>
                     </a:stretch>
@@ -920,7 +992,7 @@
           <w:color w:val="1D1D1B"/>
           <w:sz w:val="34"/>
         </w:rPr>
-        <w:t>2.5  Where the demand actually is</w:t>
+        <w:t>2.6  Where the demand actually is</w:t>
       </w:r>
     </w:p>
     <w:p>
@@ -936,7 +1008,7 @@
         <w:drawing>
           <wp:inline xmlns:a="http://schemas.openxmlformats.org/drawingml/2006/main" xmlns:pic="http://schemas.openxmlformats.org/drawingml/2006/picture">
             <wp:extent cx="5577840" cy="3137535"/>
-            <wp:docPr id="8" name="Picture 8"/>
+            <wp:docPr id="9" name="Picture 9"/>
             <wp:cNvGraphicFramePr>
               <a:graphicFrameLocks noChangeAspect="1"/>
             </wp:cNvGraphicFramePr>
@@ -948,7 +1020,7 @@
                     <pic:cNvPicPr/>
                   </pic:nvPicPr>
                   <pic:blipFill>
-                    <a:blip r:embed="rId16"/>
+                    <a:blip r:embed="rId17"/>
                     <a:stretch>
                       <a:fillRect/>
                     </a:stretch>
@@ -992,7 +1064,7 @@
           <w:color w:val="1D1D1B"/>
           <w:sz w:val="26"/>
         </w:rPr>
-        <w:t>2.5.1  Who is enrolling, and from where</w:t>
+        <w:t>2.6.1  Who is enrolling, and from where</w:t>
       </w:r>
     </w:p>
     <w:p>
@@ -1008,7 +1080,7 @@
         <w:drawing>
           <wp:inline xmlns:a="http://schemas.openxmlformats.org/drawingml/2006/main" xmlns:pic="http://schemas.openxmlformats.org/drawingml/2006/picture">
             <wp:extent cx="5577840" cy="2527459"/>
-            <wp:docPr id="9" name="Picture 9"/>
+            <wp:docPr id="10" name="Picture 10"/>
             <wp:cNvGraphicFramePr>
               <a:graphicFrameLocks noChangeAspect="1"/>
             </wp:cNvGraphicFramePr>
@@ -1020,7 +1092,7 @@
                     <pic:cNvPicPr/>
                   </pic:nvPicPr>
                   <pic:blipFill>
-                    <a:blip r:embed="rId17"/>
+                    <a:blip r:embed="rId18"/>
                     <a:stretch>
                       <a:fillRect/>
                     </a:stretch>
@@ -1060,7 +1132,7 @@
         <w:drawing>
           <wp:inline xmlns:a="http://schemas.openxmlformats.org/drawingml/2006/main" xmlns:pic="http://schemas.openxmlformats.org/drawingml/2006/picture">
             <wp:extent cx="5577840" cy="3129944"/>
-            <wp:docPr id="10" name="Picture 10"/>
+            <wp:docPr id="11" name="Picture 11"/>
             <wp:cNvGraphicFramePr>
               <a:graphicFrameLocks noChangeAspect="1"/>
             </wp:cNvGraphicFramePr>
@@ -1072,7 +1144,7 @@
                     <pic:cNvPicPr/>
                   </pic:nvPicPr>
                   <pic:blipFill>
-                    <a:blip r:embed="rId18"/>
+                    <a:blip r:embed="rId19"/>
                     <a:stretch>
                       <a:fillRect/>
                     </a:stretch>
@@ -1116,7 +1188,7 @@
           <w:color w:val="1D1D1B"/>
           <w:sz w:val="26"/>
         </w:rPr>
-        <w:t>2.5.2  The funnel as conversion, not counts</w:t>
+        <w:t>2.6.2  The funnel as conversion, not counts</w:t>
       </w:r>
     </w:p>
     <w:p>
@@ -1132,7 +1204,7 @@
         <w:drawing>
           <wp:inline xmlns:a="http://schemas.openxmlformats.org/drawingml/2006/main" xmlns:pic="http://schemas.openxmlformats.org/drawingml/2006/picture">
             <wp:extent cx="5577840" cy="2265998"/>
-            <wp:docPr id="11" name="Picture 11"/>
+            <wp:docPr id="12" name="Picture 12"/>
             <wp:cNvGraphicFramePr>
               <a:graphicFrameLocks noChangeAspect="1"/>
             </wp:cNvGraphicFramePr>
@@ -1144,7 +1216,7 @@
                     <pic:cNvPicPr/>
                   </pic:nvPicPr>
                   <pic:blipFill>
-                    <a:blip r:embed="rId19"/>
+                    <a:blip r:embed="rId20"/>
                     <a:stretch>
                       <a:fillRect/>
                     </a:stretch>
@@ -1188,7 +1260,7 @@
           <w:color w:val="1D1D1B"/>
           <w:sz w:val="34"/>
         </w:rPr>
-        <w:t>2.6  Blanks that are not gaps</w:t>
+        <w:t>2.7  Blanks that are not gaps</w:t>
       </w:r>
     </w:p>
     <w:p>
@@ -1213,7 +1285,7 @@
           <w:color w:val="1D1D1B"/>
           <w:sz w:val="34"/>
         </w:rPr>
-        <w:t>2.7  Why the CRM holds thousands and the warehouse holds millions</w:t>
+        <w:t>2.8  Why the CRM holds thousands and the warehouse holds millions</w:t>
       </w:r>
     </w:p>
     <w:p>
@@ -1238,7 +1310,7 @@
           <w:color w:val="1D1D1B"/>
           <w:sz w:val="34"/>
         </w:rPr>
-        <w:t>2.8  The pipeline, end to end</w:t>
+        <w:t>2.9  The pipeline, end to end</w:t>
       </w:r>
     </w:p>
     <w:p>
@@ -1389,7 +1461,7 @@
         <w:drawing>
           <wp:inline xmlns:a="http://schemas.openxmlformats.org/drawingml/2006/main" xmlns:pic="http://schemas.openxmlformats.org/drawingml/2006/picture">
             <wp:extent cx="5577840" cy="3078579"/>
-            <wp:docPr id="12" name="Picture 12"/>
+            <wp:docPr id="13" name="Picture 13"/>
             <wp:cNvGraphicFramePr>
               <a:graphicFrameLocks noChangeAspect="1"/>
             </wp:cNvGraphicFramePr>
@@ -1401,7 +1473,7 @@
                     <pic:cNvPicPr/>
                   </pic:nvPicPr>
                   <pic:blipFill>
-                    <a:blip r:embed="rId20"/>
+                    <a:blip r:embed="rId21"/>
                     <a:stretch>
                       <a:fillRect/>
                     </a:stretch>
@@ -1461,7 +1533,7 @@
         <w:drawing>
           <wp:inline xmlns:a="http://schemas.openxmlformats.org/drawingml/2006/main" xmlns:pic="http://schemas.openxmlformats.org/drawingml/2006/picture">
             <wp:extent cx="5577840" cy="2939058"/>
-            <wp:docPr id="13" name="Picture 13"/>
+            <wp:docPr id="14" name="Picture 14"/>
             <wp:cNvGraphicFramePr>
               <a:graphicFrameLocks noChangeAspect="1"/>
             </wp:cNvGraphicFramePr>
@@ -1473,7 +1545,7 @@
                     <pic:cNvPicPr/>
                   </pic:nvPicPr>
                   <pic:blipFill>
-                    <a:blip r:embed="rId21"/>
+                    <a:blip r:embed="rId22"/>
                     <a:stretch>
                       <a:fillRect/>
                     </a:stretch>
@@ -1533,7 +1605,7 @@
         <w:drawing>
           <wp:inline xmlns:a="http://schemas.openxmlformats.org/drawingml/2006/main" xmlns:pic="http://schemas.openxmlformats.org/drawingml/2006/picture">
             <wp:extent cx="5577840" cy="2368838"/>
-            <wp:docPr id="14" name="Picture 14"/>
+            <wp:docPr id="15" name="Picture 15"/>
             <wp:cNvGraphicFramePr>
               <a:graphicFrameLocks noChangeAspect="1"/>
             </wp:cNvGraphicFramePr>
@@ -1545,7 +1617,7 @@
                     <pic:cNvPicPr/>
                   </pic:nvPicPr>
                   <pic:blipFill>
-                    <a:blip r:embed="rId22"/>
+                    <a:blip r:embed="rId23"/>
                     <a:stretch>
                       <a:fillRect/>
                     </a:stretch>
@@ -1585,7 +1657,7 @@
         <w:drawing>
           <wp:inline xmlns:a="http://schemas.openxmlformats.org/drawingml/2006/main" xmlns:pic="http://schemas.openxmlformats.org/drawingml/2006/picture">
             <wp:extent cx="5577840" cy="2939058"/>
-            <wp:docPr id="15" name="Picture 15"/>
+            <wp:docPr id="16" name="Picture 16"/>
             <wp:cNvGraphicFramePr>
               <a:graphicFrameLocks noChangeAspect="1"/>
             </wp:cNvGraphicFramePr>
@@ -1597,7 +1669,7 @@
                     <pic:cNvPicPr/>
                   </pic:nvPicPr>
                   <pic:blipFill>
-                    <a:blip r:embed="rId23"/>
+                    <a:blip r:embed="rId24"/>
                     <a:stretch>
                       <a:fillRect/>
                     </a:stretch>
@@ -1657,7 +1729,7 @@
         <w:drawing>
           <wp:inline xmlns:a="http://schemas.openxmlformats.org/drawingml/2006/main" xmlns:pic="http://schemas.openxmlformats.org/drawingml/2006/picture">
             <wp:extent cx="5577840" cy="2226283"/>
-            <wp:docPr id="16" name="Picture 16"/>
+            <wp:docPr id="17" name="Picture 17"/>
             <wp:cNvGraphicFramePr>
               <a:graphicFrameLocks noChangeAspect="1"/>
             </wp:cNvGraphicFramePr>
@@ -1669,7 +1741,7 @@
                     <pic:cNvPicPr/>
                   </pic:nvPicPr>
                   <pic:blipFill>
-                    <a:blip r:embed="rId24"/>
+                    <a:blip r:embed="rId25"/>
                     <a:stretch>
                       <a:fillRect/>
                     </a:stretch>
@@ -1729,7 +1801,7 @@
         <w:drawing>
           <wp:inline xmlns:a="http://schemas.openxmlformats.org/drawingml/2006/main" xmlns:pic="http://schemas.openxmlformats.org/drawingml/2006/picture">
             <wp:extent cx="5577840" cy="1798618"/>
-            <wp:docPr id="17" name="Picture 17"/>
+            <wp:docPr id="18" name="Picture 18"/>
             <wp:cNvGraphicFramePr>
               <a:graphicFrameLocks noChangeAspect="1"/>
             </wp:cNvGraphicFramePr>
@@ -1741,7 +1813,7 @@
                     <pic:cNvPicPr/>
                   </pic:nvPicPr>
                   <pic:blipFill>
-                    <a:blip r:embed="rId25"/>
+                    <a:blip r:embed="rId26"/>
                     <a:stretch>
                       <a:fillRect/>
                     </a:stretch>
@@ -1982,7 +2054,7 @@
         <w:drawing>
           <wp:inline xmlns:a="http://schemas.openxmlformats.org/drawingml/2006/main" xmlns:pic="http://schemas.openxmlformats.org/drawingml/2006/picture">
             <wp:extent cx="5577840" cy="2281844"/>
-            <wp:docPr id="18" name="Picture 18"/>
+            <wp:docPr id="19" name="Picture 19"/>
             <wp:cNvGraphicFramePr>
               <a:graphicFrameLocks noChangeAspect="1"/>
             </wp:cNvGraphicFramePr>
@@ -1994,7 +2066,7 @@
                     <pic:cNvPicPr/>
                   </pic:nvPicPr>
                   <pic:blipFill>
-                    <a:blip r:embed="rId26"/>
+                    <a:blip r:embed="rId27"/>
                     <a:stretch>
                       <a:fillRect/>
                     </a:stretch>
@@ -2034,7 +2106,7 @@
         <w:drawing>
           <wp:inline xmlns:a="http://schemas.openxmlformats.org/drawingml/2006/main" xmlns:pic="http://schemas.openxmlformats.org/drawingml/2006/picture">
             <wp:extent cx="5577840" cy="2281844"/>
-            <wp:docPr id="19" name="Picture 19"/>
+            <wp:docPr id="20" name="Picture 20"/>
             <wp:cNvGraphicFramePr>
               <a:graphicFrameLocks noChangeAspect="1"/>
             </wp:cNvGraphicFramePr>
@@ -2046,7 +2118,7 @@
                     <pic:cNvPicPr/>
                   </pic:nvPicPr>
                   <pic:blipFill>
-                    <a:blip r:embed="rId27"/>
+                    <a:blip r:embed="rId28"/>
                     <a:stretch>
                       <a:fillRect/>
                     </a:stretch>
@@ -2423,7 +2495,7 @@
         <w:drawing>
           <wp:inline xmlns:a="http://schemas.openxmlformats.org/drawingml/2006/main" xmlns:pic="http://schemas.openxmlformats.org/drawingml/2006/picture">
             <wp:extent cx="5577840" cy="2551565"/>
-            <wp:docPr id="20" name="Picture 20"/>
+            <wp:docPr id="21" name="Picture 21"/>
             <wp:cNvGraphicFramePr>
               <a:graphicFrameLocks noChangeAspect="1"/>
             </wp:cNvGraphicFramePr>
@@ -2435,7 +2507,7 @@
                     <pic:cNvPicPr/>
                   </pic:nvPicPr>
                   <pic:blipFill>
-                    <a:blip r:embed="rId28"/>
+                    <a:blip r:embed="rId29"/>
                     <a:stretch>
                       <a:fillRect/>
                     </a:stretch>
@@ -2479,7 +2551,79 @@
           <w:color w:val="1D1D1B"/>
           <w:sz w:val="32"/>
         </w:rPr>
-        <w:t>5.1  The data model</w:t>
+        <w:t>5.1  Full canonical Salesforce ERD</w:t>
+      </w:r>
+    </w:p>
+    <w:p>
+      <w:r>
+        <w:t>The complete canonical ERD is included here as the source-of-truth relationship map. It includes the public catalogue objects, Salesforce operational objects, applications, enrolments and student-progress spine. Archived diagrams are not implementation targets.</w:t>
+      </w:r>
+    </w:p>
+    <w:p>
+      <w:pPr>
+        <w:jc w:val="center"/>
+      </w:pPr>
+      <w:r>
+        <w:drawing>
+          <wp:inline xmlns:a="http://schemas.openxmlformats.org/drawingml/2006/main" xmlns:pic="http://schemas.openxmlformats.org/drawingml/2006/picture">
+            <wp:extent cx="5669280" cy="4887310"/>
+            <wp:docPr id="22" name="Picture 22"/>
+            <wp:cNvGraphicFramePr>
+              <a:graphicFrameLocks noChangeAspect="1"/>
+            </wp:cNvGraphicFramePr>
+            <a:graphic>
+              <a:graphicData uri="http://schemas.openxmlformats.org/drawingml/2006/picture">
+                <pic:pic>
+                  <pic:nvPicPr>
+                    <pic:cNvPr id="0" name="03_Canonical_ERD.png"/>
+                    <pic:cNvPicPr/>
+                  </pic:nvPicPr>
+                  <pic:blipFill>
+                    <a:blip r:embed="rId30"/>
+                    <a:stretch>
+                      <a:fillRect/>
+                    </a:stretch>
+                  </pic:blipFill>
+                  <pic:spPr>
+                    <a:xfrm>
+                      <a:off x="0" y="0"/>
+                      <a:ext cx="5669280" cy="4887310"/>
+                    </a:xfrm>
+                    <a:prstGeom prst="rect"/>
+                  </pic:spPr>
+                </pic:pic>
+              </a:graphicData>
+            </a:graphic>
+          </wp:inline>
+        </w:drawing>
+      </w:r>
+    </w:p>
+    <w:p>
+      <w:pPr>
+        <w:jc w:val="center"/>
+      </w:pPr>
+      <w:r>
+        <w:rPr>
+          <w:i/>
+          <w:color w:val="60646B"/>
+          <w:sz w:val="17"/>
+        </w:rPr>
+        <w:t>Canonical Salesforce ERD — complete implementation target, rendered from erds/overview.svg.</w:t>
+      </w:r>
+    </w:p>
+    <w:p>
+      <w:pPr>
+        <w:pStyle w:val="Heading2"/>
+        <w:spacing w:before="240"/>
+      </w:pPr>
+      <w:r>
+        <w:rPr>
+          <w:rFonts w:ascii="Calibri" w:hAnsi="Calibri"/>
+          <w:b/>
+          <w:color w:val="1D1D1B"/>
+          <w:sz w:val="32"/>
+        </w:rPr>
+        <w:t>5.2  The data model</w:t>
       </w:r>
     </w:p>
     <w:p>
@@ -2495,7 +2639,7 @@
         <w:drawing>
           <wp:inline xmlns:a="http://schemas.openxmlformats.org/drawingml/2006/main" xmlns:pic="http://schemas.openxmlformats.org/drawingml/2006/picture">
             <wp:extent cx="5577840" cy="3560323"/>
-            <wp:docPr id="21" name="Picture 21"/>
+            <wp:docPr id="23" name="Picture 23"/>
             <wp:cNvGraphicFramePr>
               <a:graphicFrameLocks noChangeAspect="1"/>
             </wp:cNvGraphicFramePr>
@@ -2507,7 +2651,7 @@
                     <pic:cNvPicPr/>
                   </pic:nvPicPr>
                   <pic:blipFill>
-                    <a:blip r:embed="rId29"/>
+                    <a:blip r:embed="rId31"/>
                     <a:stretch>
                       <a:fillRect/>
                     </a:stretch>
@@ -2592,7 +2736,7 @@
         <w:drawing>
           <wp:inline xmlns:a="http://schemas.openxmlformats.org/drawingml/2006/main" xmlns:pic="http://schemas.openxmlformats.org/drawingml/2006/picture">
             <wp:extent cx="5577840" cy="6502930"/>
-            <wp:docPr id="22" name="Picture 22"/>
+            <wp:docPr id="24" name="Picture 24"/>
             <wp:cNvGraphicFramePr>
               <a:graphicFrameLocks noChangeAspect="1"/>
             </wp:cNvGraphicFramePr>
@@ -2604,7 +2748,7 @@
                     <pic:cNvPicPr/>
                   </pic:nvPicPr>
                   <pic:blipFill>
-                    <a:blip r:embed="rId30"/>
+                    <a:blip r:embed="rId32"/>
                     <a:stretch>
                       <a:fillRect/>
                     </a:stretch>
@@ -2653,7 +2797,12 @@
     </w:p>
     <w:p>
       <w:r>
-        <w:t>The warehouse lands in OneLake as a bronze layer, partitioned by table. Two things are worth knowing for anyone repeating this: a workspace created through the API arrives with no capacity attached, and every Fabric item type then fails with a 403 that reads like a licensing problem rather than an unassigned workspace. And a trial capacity does not stop on its own - the workspace should be deleted when the work is done.</w:t>
+        <w:t>Fabric Warehouse bronze is verified. All 13 landed source tables are present in raw_salesforce: 1.50 million leads, 1.14 million contacts, 2.53 million campaign members, 706 thousand opportunities, 494 thousand applications and 2.10 million student-progress rows, with the programme catalogue tables alongside them. The Azure CLI dbt connection and a bronze campaign view both passed. The silver and gold Fabric build is intentionally not claimed as complete: its remaining failures are documented DuckDB-to-T-SQL compatibility work, including date and join syntax.</w:t>
+      </w:r>
+    </w:p>
+    <w:p>
+      <w:r>
+        <w:t>The bronze land is partitioned by table in OneLake. A workspace created through the API arrives with no capacity attached, and every Fabric item type then fails with a 403 that looks like licensing rather than an unassigned workspace. Trial capacity does not stop on its own, so delete the project workspace when the demonstration is complete.</w:t>
       </w:r>
     </w:p>
     <w:p>
@@ -2664,7 +2813,7 @@
         <w:drawing>
           <wp:inline xmlns:a="http://schemas.openxmlformats.org/drawingml/2006/main" xmlns:pic="http://schemas.openxmlformats.org/drawingml/2006/picture">
             <wp:extent cx="5577840" cy="3651832"/>
-            <wp:docPr id="23" name="Picture 23"/>
+            <wp:docPr id="25" name="Picture 25"/>
             <wp:cNvGraphicFramePr>
               <a:graphicFrameLocks noChangeAspect="1"/>
             </wp:cNvGraphicFramePr>
@@ -2676,7 +2825,7 @@
                     <pic:cNvPicPr/>
                   </pic:nvPicPr>
                   <pic:blipFill>
-                    <a:blip r:embed="rId31"/>
+                    <a:blip r:embed="rId33"/>
                     <a:stretch>
                       <a:fillRect/>
                     </a:stretch>
@@ -2705,7 +2854,7 @@
           <w:color w:val="60646B"/>
           <w:sz w:val="17"/>
         </w:rPr>
-        <w:t>Figure 12 - The Fabric workspace, its capacity, and what is actually in OneLake - listed back rather than assumed from the upload's own success message.</w:t>
+        <w:t>Figure 12 - The Fabric workspace, its capacity, and what is actually in OneLake.</w:t>
       </w:r>
     </w:p>
     <w:p>
@@ -2736,7 +2885,7 @@
         <w:drawing>
           <wp:inline xmlns:a="http://schemas.openxmlformats.org/drawingml/2006/main" xmlns:pic="http://schemas.openxmlformats.org/drawingml/2006/picture">
             <wp:extent cx="5577840" cy="2048113"/>
-            <wp:docPr id="24" name="Picture 24"/>
+            <wp:docPr id="26" name="Picture 26"/>
             <wp:cNvGraphicFramePr>
               <a:graphicFrameLocks noChangeAspect="1"/>
             </wp:cNvGraphicFramePr>
@@ -2748,7 +2897,7 @@
                     <pic:cNvPicPr/>
                   </pic:nvPicPr>
                   <pic:blipFill>
-                    <a:blip r:embed="rId32"/>
+                    <a:blip r:embed="rId34"/>
                     <a:stretch>
                       <a:fillRect/>
                     </a:stretch>
@@ -2802,8 +2951,8 @@
       <w:r>
         <w:drawing>
           <wp:inline xmlns:a="http://schemas.openxmlformats.org/drawingml/2006/main" xmlns:pic="http://schemas.openxmlformats.org/drawingml/2006/picture">
-            <wp:extent cx="5394960" cy="4650828"/>
-            <wp:docPr id="25" name="Picture 25"/>
+            <wp:extent cx="5394960" cy="3033184"/>
+            <wp:docPr id="27" name="Picture 27"/>
             <wp:cNvGraphicFramePr>
               <a:graphicFrameLocks noChangeAspect="1"/>
             </wp:cNvGraphicFramePr>
@@ -2811,11 +2960,11 @@
               <a:graphicData uri="http://schemas.openxmlformats.org/drawingml/2006/picture">
                 <pic:pic>
                   <pic:nvPicPr>
-                    <pic:cNvPr id="0" name="03_Canonical_ERD.png"/>
+                    <pic:cNvPr id="0" name="06_PowerBI_predictive_actions.png"/>
                     <pic:cNvPicPr/>
                   </pic:nvPicPr>
                   <pic:blipFill>
-                    <a:blip r:embed="rId33"/>
+                    <a:blip r:embed="rId35"/>
                     <a:stretch>
                       <a:fillRect/>
                     </a:stretch>
@@ -2823,7 +2972,7 @@
                   <pic:spPr>
                     <a:xfrm>
                       <a:off x="0" y="0"/>
-                      <a:ext cx="5394960" cy="4650828"/>
+                      <a:ext cx="5394960" cy="3033184"/>
                     </a:xfrm>
                     <a:prstGeom prst="rect"/>
                   </pic:spPr>
@@ -2844,7 +2993,7 @@
           <w:color w:val="60646B"/>
           <w:sz w:val="17"/>
         </w:rPr>
-        <w:t>Canonical ERD</w:t>
+        <w:t>PowerBI predictive actions</w:t>
       </w:r>
     </w:p>
     <w:p>
@@ -2891,7 +3040,7 @@
         <w:pStyle w:val="ListBullet"/>
       </w:pPr>
       <w:r>
-        <w:t>The pipeline has been validated locally against DuckDB and a live NiFi instance. Deployment to a Salesforce org and a Fabric workspace requires credentials that are deliberately absent from this repository.</w:t>
+        <w:t>DuckDB is fully validated. Fabric bronze loading and dbt connectivity are verified, but the Fabric silver and gold build has documented DuckDB-to-T-SQL compatibility errors. No downstream Fabric transformation result is claimed until those are corrected and rerun.</w:t>
       </w:r>
     </w:p>
     <w:sectPr>

</xml_diff>

<commit_message>
Clarify on-campus and off-campus delivery reporting
</commit_message>
<xml_diff>
--- a/ebook/RedAndYellow_Data_Story.docx
+++ b/ebook/RedAndYellow_Data_Story.docx
@@ -500,7 +500,7 @@
           </w:tcPr>
           <w:p>
             <w:r>
-              <w:t>303,656</w:t>
+              <w:t>304,168</w:t>
             </w:r>
           </w:p>
         </w:tc>
@@ -544,7 +544,7 @@
           </w:tcPr>
           <w:p>
             <w:r>
-              <w:t>R2,328.1m</w:t>
+              <w:t>R2,867.2m</w:t>
             </w:r>
           </w:p>
         </w:tc>
@@ -566,7 +566,7 @@
           </w:tcPr>
           <w:p>
             <w:r>
-              <w:t>329,994</w:t>
+              <w:t>331,391</w:t>
             </w:r>
           </w:p>
         </w:tc>
@@ -664,7 +664,7 @@
     </w:p>
     <w:p>
       <w:r>
-        <w:t>Cost per enrolment sits between R1,848 and R2,874 across channels, on a return of 2.6x to 4.2x. Career expo returns the most per rand at 4.19x; Print the least at 2.65x.</w:t>
+        <w:t>Cost per enrolment sits between R1,891 and R2,899 across channels, on a return of 3.2x to 5.0x. Career expo returns the most per rand at 5.00x; Print the least at 3.23x.</w:t>
       </w:r>
     </w:p>
     <w:p>
@@ -895,7 +895,7 @@
     </w:p>
     <w:p>
       <w:r>
-        <w:t>Across 2,941,380 injected defects the pipeline detects 329,994 issues. De-duplication recovers 0.97 of the duplicates that were planted.</w:t>
+        <w:t>Across 2,941,487 injected defects the pipeline detects 331,391 issues. De-duplication recovers 0.97 of the duplicates that were planted.</w:t>
       </w:r>
     </w:p>
     <w:p>
@@ -3024,7 +3024,7 @@
         <w:pStyle w:val="ListBullet"/>
       </w:pPr>
       <w:r>
-        <w:t>The catalogue was transcribed from 17 screenshots of the public site on 8 September 2026. It is not claimed to be the complete live catalogue, and page section alone was not treated as proof of delivery mode.</w:t>
+        <w:t>The catalogue was transcribed from 17 screenshots of the public site on 8 September 2026. It is not claimed to be the complete live catalogue. For reporting, On-campus remains On-campus and listings in the Online education section are classified as Off-campus; the source section is retained separately.</w:t>
       </w:r>
     </w:p>
     <w:p>

</xml_diff>

<commit_message>
Add dbt run evidence and documentation
</commit_message>
<xml_diff>
--- a/ebook/RedAndYellow_Data_Story.docx
+++ b/ebook/RedAndYellow_Data_Story.docx
@@ -1847,6 +1847,11 @@
     </w:p>
     <w:p>
       <w:r>
+        <w:t>The reproducible run record, delivery-mode check and DuckDB/Fabric scope are documented in docs/DBT_EVIDENCE.md.</w:t>
+      </w:r>
+    </w:p>
+    <w:p>
+      <w:r>
         <w:br w:type="page"/>
       </w:r>
     </w:p>

</xml_diff>

<commit_message>
Add actionable recommendations across deliverables
</commit_message>
<xml_diff>
--- a/ebook/RedAndYellow_Data_Story.docx
+++ b/ebook/RedAndYellow_Data_Story.docx
@@ -2311,7 +2311,404 @@
           <w:color w:val="F52635"/>
           <w:sz w:val="40"/>
         </w:rPr>
-        <w:t>5  How the warehouse is organised</w:t>
+        <w:t>5  Recommendations and solutions</w:t>
+      </w:r>
+    </w:p>
+    <w:p>
+      <w:r>
+        <w:t>The dashboard is most useful when each signal ends in a decision. The table below turns the observed patterns into a practical owner, intervention and success measure. It is a control plan for the next operating cycle, not a claim that synthetic outcomes will repeat in the live organisation.</w:t>
+      </w:r>
+    </w:p>
+    <w:tbl>
+      <w:tblPr>
+        <w:tblStyle w:val="LightList-Accent1"/>
+        <w:tblW w:type="auto" w:w="0"/>
+        <w:tblLook w:firstColumn="1" w:firstRow="1" w:lastColumn="0" w:lastRow="0" w:noHBand="0" w:noVBand="1" w:val="04A0"/>
+      </w:tblPr>
+      <w:tblGrid>
+        <w:gridCol w:w="2160"/>
+        <w:gridCol w:w="2160"/>
+        <w:gridCol w:w="2160"/>
+        <w:gridCol w:w="2160"/>
+      </w:tblGrid>
+      <w:tr>
+        <w:tc>
+          <w:tcPr>
+            <w:tcW w:type="dxa" w:w="2160"/>
+          </w:tcPr>
+          <w:p>
+            <w:r>
+              <w:t>Area</w:t>
+            </w:r>
+          </w:p>
+        </w:tc>
+        <w:tc>
+          <w:tcPr>
+            <w:tcW w:type="dxa" w:w="2160"/>
+          </w:tcPr>
+          <w:p>
+            <w:r>
+              <w:t>Signal</w:t>
+            </w:r>
+          </w:p>
+        </w:tc>
+        <w:tc>
+          <w:tcPr>
+            <w:tcW w:type="dxa" w:w="2160"/>
+          </w:tcPr>
+          <w:p>
+            <w:r>
+              <w:t>Solution</w:t>
+            </w:r>
+          </w:p>
+        </w:tc>
+        <w:tc>
+          <w:tcPr>
+            <w:tcW w:type="dxa" w:w="2160"/>
+          </w:tcPr>
+          <w:p>
+            <w:r>
+              <w:t>Success measure</w:t>
+            </w:r>
+          </w:p>
+        </w:tc>
+      </w:tr>
+      <w:tr>
+        <w:tc>
+          <w:tcPr>
+            <w:tcW w:type="dxa" w:w="2160"/>
+          </w:tcPr>
+          <w:p>
+            <w:r>
+              <w:t>Acquisition</w:t>
+            </w:r>
+          </w:p>
+        </w:tc>
+        <w:tc>
+          <w:tcPr>
+            <w:tcW w:type="dxa" w:w="2160"/>
+          </w:tcPr>
+          <w:p>
+            <w:r>
+              <w:t>Channel response, enrolment rate and revenue per member diverge.</w:t>
+            </w:r>
+          </w:p>
+        </w:tc>
+        <w:tc>
+          <w:tcPr>
+            <w:tcW w:type="dxa" w:w="2160"/>
+          </w:tcPr>
+          <w:p>
+            <w:r>
+              <w:t>Run a controlled budget test toward the best-performing channel; set a stop rule for spend without response.</w:t>
+            </w:r>
+          </w:p>
+        </w:tc>
+        <w:tc>
+          <w:tcPr>
+            <w:tcW w:type="dxa" w:w="2160"/>
+          </w:tcPr>
+          <w:p>
+            <w:r>
+              <w:t>ROAS, spend per response and revenue per member improve without increasing total spend.</w:t>
+            </w:r>
+          </w:p>
+        </w:tc>
+      </w:tr>
+      <w:tr>
+        <w:tc>
+          <w:tcPr>
+            <w:tcW w:type="dxa" w:w="2160"/>
+          </w:tcPr>
+          <w:p>
+            <w:r>
+              <w:t>Admissions</w:t>
+            </w:r>
+          </w:p>
+        </w:tc>
+        <w:tc>
+          <w:tcPr>
+            <w:tcW w:type="dxa" w:w="2160"/>
+          </w:tcPr>
+          <w:p>
+            <w:r>
+              <w:t>Priority propensity leads convert at a much higher rate than the lower bands.</w:t>
+            </w:r>
+          </w:p>
+        </w:tc>
+        <w:tc>
+          <w:tcPr>
+            <w:tcW w:type="dxa" w:w="2160"/>
+          </w:tcPr>
+          <w:p>
+            <w:r>
+              <w:t>Route Priority leads to a named human queue within 24 hours and leave Low-band leads in automated nurture.</w:t>
+            </w:r>
+          </w:p>
+        </w:tc>
+        <w:tc>
+          <w:tcPr>
+            <w:tcW w:type="dxa" w:w="2160"/>
+          </w:tcPr>
+          <w:p>
+            <w:r>
+              <w:t>Response SLA and conversion rate improve; top-band lift remains stable on a holdout.</w:t>
+            </w:r>
+          </w:p>
+        </w:tc>
+      </w:tr>
+      <w:tr>
+        <w:tc>
+          <w:tcPr>
+            <w:tcW w:type="dxa" w:w="2160"/>
+          </w:tcPr>
+          <w:p>
+            <w:r>
+              <w:t>Student success</w:t>
+            </w:r>
+          </w:p>
+        </w:tc>
+        <w:tc>
+          <w:tcPr>
+            <w:tcW w:type="dxa" w:w="2160"/>
+          </w:tcPr>
+          <w:p>
+            <w:r>
+              <w:t>First-month attendance below 65% is associated with materially higher withdrawal.</w:t>
+            </w:r>
+          </w:p>
+        </w:tc>
+        <w:tc>
+          <w:tcPr>
+            <w:tcW w:type="dxa" w:w="2160"/>
+          </w:tcPr>
+          <w:p>
+            <w:r>
+              <w:t>Trigger a support conversation at week 4, log the intervention and compare with the prior cohort.</w:t>
+            </w:r>
+          </w:p>
+        </w:tc>
+        <w:tc>
+          <w:tcPr>
+            <w:tcW w:type="dxa" w:w="2160"/>
+          </w:tcPr>
+          <w:p>
+            <w:r>
+              <w:t>Week-4 attendance rises and withdrawal falls for comparable cohorts.</w:t>
+            </w:r>
+          </w:p>
+        </w:tc>
+      </w:tr>
+      <w:tr>
+        <w:tc>
+          <w:tcPr>
+            <w:tcW w:type="dxa" w:w="2160"/>
+          </w:tcPr>
+          <w:p>
+            <w:r>
+              <w:t>CRM quality</w:t>
+            </w:r>
+          </w:p>
+        </w:tc>
+        <w:tc>
+          <w:tcPr>
+            <w:tcW w:type="dxa" w:w="2160"/>
+          </w:tcPr>
+          <w:p>
+            <w:r>
+              <w:t>Blank-only filters, duplicate people and missing contact fields weaken follow-up.</w:t>
+            </w:r>
+          </w:p>
+        </w:tc>
+        <w:tc>
+          <w:tcPr>
+            <w:tcW w:type="dxa" w:w="2160"/>
+          </w:tcPr>
+          <w:p>
+            <w:r>
+              <w:t>Require external IDs, email and campaign membership at capture; send exceptions to a daily queue.</w:t>
+            </w:r>
+          </w:p>
+        </w:tc>
+        <w:tc>
+          <w:tcPr>
+            <w:tcW w:type="dxa" w:w="2160"/>
+          </w:tcPr>
+          <w:p>
+            <w:r>
+              <w:t>Email completeness rises, duplicate rate falls and unresolved issues are closed within SLA.</w:t>
+            </w:r>
+          </w:p>
+        </w:tc>
+      </w:tr>
+      <w:tr>
+        <w:tc>
+          <w:tcPr>
+            <w:tcW w:type="dxa" w:w="2160"/>
+          </w:tcPr>
+          <w:p>
+            <w:r>
+              <w:t>Catalogue</w:t>
+            </w:r>
+          </w:p>
+        </w:tc>
+        <w:tc>
+          <w:tcPr>
+            <w:tcW w:type="dxa" w:w="2160"/>
+          </w:tcPr>
+          <w:p>
+            <w:r>
+              <w:t>Enquire-for-price offerings have no defensible numeric fee.</w:t>
+            </w:r>
+          </w:p>
+        </w:tc>
+        <w:tc>
+          <w:tcPr>
+            <w:tcW w:type="dxa" w:w="2160"/>
+          </w:tcPr>
+          <w:p>
+            <w:r>
+              <w:t>Keep price as null with an explicit status; add a verified fee only when the public source supplies one.</w:t>
+            </w:r>
+          </w:p>
+        </w:tc>
+        <w:tc>
+          <w:tcPr>
+            <w:tcW w:type="dxa" w:w="2160"/>
+          </w:tcPr>
+          <w:p>
+            <w:r>
+              <w:t>No unknown price is reported as zero and fee refreshes retain source evidence.</w:t>
+            </w:r>
+          </w:p>
+        </w:tc>
+      </w:tr>
+      <w:tr>
+        <w:tc>
+          <w:tcPr>
+            <w:tcW w:type="dxa" w:w="2160"/>
+          </w:tcPr>
+          <w:p>
+            <w:r>
+              <w:t>Platform</w:t>
+            </w:r>
+          </w:p>
+        </w:tc>
+        <w:tc>
+          <w:tcPr>
+            <w:tcW w:type="dxa" w:w="2160"/>
+          </w:tcPr>
+          <w:p>
+            <w:r>
+              <w:t>Bronze is verified; silver/gold Fabric execution and GA4 are still gated.</w:t>
+            </w:r>
+          </w:p>
+        </w:tc>
+        <w:tc>
+          <w:tcPr>
+            <w:tcW w:type="dxa" w:w="2160"/>
+          </w:tcPr>
+          <w:p>
+            <w:r>
+              <w:t>Finish DuckDB-to-T-SQL compatibility fixes, rerun dbt in Fabric, then add GA4 as a separate dated bronze source.</w:t>
+            </w:r>
+          </w:p>
+        </w:tc>
+        <w:tc>
+          <w:tcPr>
+            <w:tcW w:type="dxa" w:w="2160"/>
+          </w:tcPr>
+          <w:p>
+            <w:r>
+              <w:t>A passing Fabric run and a reconciled GA4-to-campaign mart before production reporting.</w:t>
+            </w:r>
+          </w:p>
+        </w:tc>
+      </w:tr>
+    </w:tbl>
+    <w:p>
+      <w:pPr>
+        <w:pStyle w:val="Heading2"/>
+        <w:spacing w:before="240"/>
+      </w:pPr>
+      <w:r>
+        <w:rPr>
+          <w:rFonts w:ascii="Calibri" w:hAnsi="Calibri"/>
+          <w:b/>
+          <w:color w:val="1D1D1B"/>
+          <w:sz w:val="32"/>
+        </w:rPr>
+        <w:t>5.1  90-day implementation sequence</w:t>
+      </w:r>
+    </w:p>
+    <w:p>
+      <w:pPr>
+        <w:pStyle w:val="ListBullet"/>
+      </w:pPr>
+      <w:r>
+        <w:rPr>
+          <w:b/>
+          <w:color w:val="F52635"/>
+        </w:rPr>
+        <w:t xml:space="preserve">Days 0-30 - Stabilise. </w:t>
+      </w:r>
+      <w:r>
+        <w:t>Confirm field rules, remove blank-bound slicers, assign the Priority queue and baseline the KPI cards.</w:t>
+      </w:r>
+    </w:p>
+    <w:p>
+      <w:pPr>
+        <w:pStyle w:val="ListBullet"/>
+      </w:pPr>
+      <w:r>
+        <w:rPr>
+          <w:b/>
+          <w:color w:val="F52635"/>
+        </w:rPr>
+        <w:t xml:space="preserve">Days 31-60 - Test. </w:t>
+      </w:r>
+      <w:r>
+        <w:t>Run channel and follow-up holdouts, log student-support interventions and keep spend and cohort definitions fixed.</w:t>
+      </w:r>
+    </w:p>
+    <w:p>
+      <w:pPr>
+        <w:pStyle w:val="ListBullet"/>
+      </w:pPr>
+      <w:r>
+        <w:rPr>
+          <w:b/>
+          <w:color w:val="F52635"/>
+        </w:rPr>
+        <w:t xml:space="preserve">Days 61-90 - Scale. </w:t>
+      </w:r>
+      <w:r>
+        <w:t>Promote only interventions that beat baseline, publish the weekly action list and monitor model drift by delivery mode and channel.</w:t>
+      </w:r>
+    </w:p>
+    <w:p>
+      <w:r>
+        <w:t>No model score should make an automated adverse decision. Scores order a worklist for a human team; the team records the action and the outcome so the recommendation can be challenged and improved.</w:t>
+      </w:r>
+    </w:p>
+    <w:p>
+      <w:r>
+        <w:br w:type="page"/>
+      </w:r>
+    </w:p>
+    <w:p>
+      <w:pPr>
+        <w:pStyle w:val="Heading1"/>
+        <w:spacing w:before="0"/>
+      </w:pPr>
+      <w:r>
+        <w:rPr>
+          <w:rFonts w:ascii="Calibri" w:hAnsi="Calibri"/>
+          <w:b/>
+          <w:color w:val="F52635"/>
+          <w:sz w:val="40"/>
+        </w:rPr>
+        <w:t>6  How the warehouse is organised</w:t>
       </w:r>
     </w:p>
     <w:p>
@@ -2556,7 +2953,7 @@
           <w:color w:val="1D1D1B"/>
           <w:sz w:val="32"/>
         </w:rPr>
-        <w:t>5.1  Full canonical Salesforce ERD</w:t>
+        <w:t>6.1  Full canonical Salesforce ERD</w:t>
       </w:r>
     </w:p>
     <w:p>
@@ -2628,7 +3025,7 @@
           <w:color w:val="1D1D1B"/>
           <w:sz w:val="32"/>
         </w:rPr>
-        <w:t>5.2  The data model</w:t>
+        <w:t>6.2  The data model</w:t>
       </w:r>
     </w:p>
     <w:p>
@@ -2705,7 +3102,7 @@
           <w:color w:val="F52635"/>
           <w:sz w:val="40"/>
         </w:rPr>
-        <w:t>6  The pipeline infrastructure</w:t>
+        <w:t>7  The pipeline infrastructure</w:t>
       </w:r>
     </w:p>
     <w:p>
@@ -2725,7 +3122,7 @@
           <w:color w:val="1D1D1B"/>
           <w:sz w:val="32"/>
         </w:rPr>
-        <w:t>6.1  Apache NiFi</w:t>
+        <w:t>7.1  Apache NiFi</w:t>
       </w:r>
     </w:p>
     <w:p>
@@ -2797,7 +3194,7 @@
           <w:color w:val="1D1D1B"/>
           <w:sz w:val="32"/>
         </w:rPr>
-        <w:t>6.2  Microsoft Fabric</w:t>
+        <w:t>7.2  Microsoft Fabric</w:t>
       </w:r>
     </w:p>
     <w:p>
@@ -2874,7 +3271,7 @@
           <w:color w:val="1D1D1B"/>
           <w:sz w:val="32"/>
         </w:rPr>
-        <w:t>6.3  GA4 to Fabric — the next integration, not a claimed result</w:t>
+        <w:t>7.3  GA4 to Fabric — the next integration, not a claimed result</w:t>
       </w:r>
     </w:p>
     <w:p>
@@ -2946,7 +3343,7 @@
           <w:color w:val="1D1D1B"/>
           <w:sz w:val="32"/>
         </w:rPr>
-        <w:t>6.4  Screens from the org</w:t>
+        <w:t>7.4  Screens from the org</w:t>
       </w:r>
     </w:p>
     <w:p>
@@ -3013,7 +3410,7 @@
           <w:color w:val="1D1D1B"/>
           <w:sz w:val="34"/>
         </w:rPr>
-        <w:t>6.5  What is not claimed</w:t>
+        <w:t>7.5  What is not claimed</w:t>
       </w:r>
     </w:p>
     <w:p>

</xml_diff>

<commit_message>
Improve canonical ERD layout in ebook
</commit_message>
<xml_diff>
--- a/ebook/RedAndYellow_Data_Story.docx
+++ b/ebook/RedAndYellow_Data_Story.docx
@@ -2968,7 +2968,7 @@
       <w:r>
         <w:drawing>
           <wp:inline xmlns:a="http://schemas.openxmlformats.org/drawingml/2006/main" xmlns:pic="http://schemas.openxmlformats.org/drawingml/2006/picture">
-            <wp:extent cx="5669280" cy="4887310"/>
+            <wp:extent cx="5669280" cy="4251960"/>
             <wp:docPr id="22" name="Picture 22"/>
             <wp:cNvGraphicFramePr>
               <a:graphicFrameLocks noChangeAspect="1"/>
@@ -2989,7 +2989,7 @@
                   <pic:spPr>
                     <a:xfrm>
                       <a:off x="0" y="0"/>
-                      <a:ext cx="5669280" cy="4887310"/>
+                      <a:ext cx="5669280" cy="4251960"/>
                     </a:xfrm>
                     <a:prstGeom prst="rect"/>
                   </pic:spPr>

</xml_diff>

<commit_message>
Explain dashboard purpose and usage
</commit_message>
<xml_diff>
--- a/ebook/RedAndYellow_Data_Story.docx
+++ b/ebook/RedAndYellow_Data_Story.docx
@@ -224,6 +224,26 @@
       </w:r>
       <w:r>
         <w:t>The last chapter is what this work does not claim.</w:t>
+      </w:r>
+    </w:p>
+    <w:p>
+      <w:pPr>
+        <w:pStyle w:val="Heading2"/>
+        <w:spacing w:before="240"/>
+      </w:pPr>
+      <w:r>
+        <w:rPr>
+          <w:rFonts w:ascii="Calibri" w:hAnsi="Calibri"/>
+          <w:b/>
+          <w:color w:val="1D1D1B"/>
+          <w:sz w:val="32"/>
+        </w:rPr>
+        <w:t>1.2  What, why and how</w:t>
+      </w:r>
+    </w:p>
+    <w:p>
+      <w:r>
+        <w:t>Every section follows the same reading rule. What names the data or decision being shown. Why explains the business question it answers. How tells the reader which filter, comparison or action to use next. The captions and dashboard subtitles use the same language so the document and report remain self-explanatory when they are read separately.</w:t>
       </w:r>
     </w:p>
     <w:p/>

</xml_diff>

<commit_message>
Clean evidence screenshots and figure layout
</commit_message>
<xml_diff>
--- a/ebook/RedAndYellow_Data_Story.docx
+++ b/ebook/RedAndYellow_Data_Story.docx
@@ -3306,7 +3306,7 @@
       <w:r>
         <w:drawing>
           <wp:inline xmlns:a="http://schemas.openxmlformats.org/drawingml/2006/main" xmlns:pic="http://schemas.openxmlformats.org/drawingml/2006/picture">
-            <wp:extent cx="5577840" cy="2048113"/>
+            <wp:extent cx="5577840" cy="2052955"/>
             <wp:docPr id="26" name="Picture 26"/>
             <wp:cNvGraphicFramePr>
               <a:graphicFrameLocks noChangeAspect="1"/>
@@ -3327,7 +3327,7 @@
                   <pic:spPr>
                     <a:xfrm>
                       <a:off x="0" y="0"/>
-                      <a:ext cx="5577840" cy="2048113"/>
+                      <a:ext cx="5577840" cy="2052955"/>
                     </a:xfrm>
                     <a:prstGeom prst="rect"/>
                   </pic:spPr>
@@ -3373,7 +3373,7 @@
       <w:r>
         <w:drawing>
           <wp:inline xmlns:a="http://schemas.openxmlformats.org/drawingml/2006/main" xmlns:pic="http://schemas.openxmlformats.org/drawingml/2006/picture">
-            <wp:extent cx="5394960" cy="3033184"/>
+            <wp:extent cx="5394960" cy="3260690"/>
             <wp:docPr id="27" name="Picture 27"/>
             <wp:cNvGraphicFramePr>
               <a:graphicFrameLocks noChangeAspect="1"/>
@@ -3394,7 +3394,7 @@
                   <pic:spPr>
                     <a:xfrm>
                       <a:off x="0" y="0"/>
-                      <a:ext cx="5394960" cy="3033184"/>
+                      <a:ext cx="5394960" cy="3260690"/>
                     </a:xfrm>
                     <a:prstGeom prst="rect"/>
                   </pic:spPr>

</xml_diff>

<commit_message>
Clarify GA4 routes and add BigQuery target
</commit_message>
<xml_diff>
--- a/ebook/RedAndYellow_Data_Story.docx
+++ b/ebook/RedAndYellow_Data_Story.docx
@@ -3291,12 +3291,12 @@
           <w:color w:val="1D1D1B"/>
           <w:sz w:val="32"/>
         </w:rPr>
-        <w:t>7.3  GA4 to Fabric — the next integration, not a claimed result</w:t>
+        <w:t>7.3  GA4 to Fabric - two valid routes, not a claimed result</w:t>
       </w:r>
     </w:p>
     <w:p>
       <w:r>
-        <w:t>A GA4 NiFi builder is included, but it has no configured GA4 credential, successful extract or warehouse source table, and no report number uses GA4 data. The practical next route is a scheduled GA4 Data API extract or a BigQuery export into an immutable OneLake bronze partition by event date. A dbt staging model would then conform date and campaign keys before a gold attribution mart joins aggregate reach and traffic to the campaign spine already used by Power BI. Keep user-level analytics identifiers out of the CRM join; campaign, source and date are enough for the first use case.</w:t>
+        <w:t>A GA4 NiFi builder is included, but it has no configured GA4 credential, successful extract or warehouse source table, and no report number uses GA4 data. BigQuery is not required when the Data API is used: runReport returns the aggregated dimensions and metrics needed for campaign, source/medium and landing-page reporting, and NiFi can write those results directly to OneLake. BigQuery is required for GA4 native raw-event export, which produces richer events_YYYYMMDD tables for event-parameter and session-path analysis. Either route can land in a dated bronze partition before dbt conforms campaign and date keys for Power BI. Keep user-level analytics identifiers out of the CRM join; campaign, source and date are enough for the first use case.</w:t>
       </w:r>
     </w:p>
     <w:p>
@@ -3306,7 +3306,7 @@
       <w:r>
         <w:drawing>
           <wp:inline xmlns:a="http://schemas.openxmlformats.org/drawingml/2006/main" xmlns:pic="http://schemas.openxmlformats.org/drawingml/2006/picture">
-            <wp:extent cx="5577840" cy="2052955"/>
+            <wp:extent cx="5577840" cy="2517775"/>
             <wp:docPr id="26" name="Picture 26"/>
             <wp:cNvGraphicFramePr>
               <a:graphicFrameLocks noChangeAspect="1"/>
@@ -3327,7 +3327,7 @@
                   <pic:spPr>
                     <a:xfrm>
                       <a:off x="0" y="0"/>
-                      <a:ext cx="5577840" cy="2052955"/>
+                      <a:ext cx="5577840" cy="2517775"/>
                     </a:xfrm>
                     <a:prstGeom prst="rect"/>
                   </pic:spPr>
@@ -3348,7 +3348,7 @@
           <w:color w:val="60646B"/>
           <w:sz w:val="17"/>
         </w:rPr>
-        <w:t>Figure 13 - Proposed GA4 extension. It is intentionally separated from the verified Salesforce-to-Fabric flow.</w:t>
+        <w:t>Figure 13 - GA4 can feed the platform through the Data API without BigQuery, or through native raw-event export to BigQuery.</w:t>
       </w:r>
     </w:p>
     <w:p>

</xml_diff>

<commit_message>
Add warehouse reconciliation findings to ebook
</commit_message>
<xml_diff>
--- a/ebook/RedAndYellow_Data_Story.docx
+++ b/ebook/RedAndYellow_Data_Story.docx
@@ -1003,6 +1003,600 @@
     <w:p>
       <w:pPr>
         <w:pStyle w:val="Heading2"/>
+        <w:spacing w:before="240"/>
+      </w:pPr>
+      <w:r>
+        <w:rPr>
+          <w:rFonts w:ascii="Calibri" w:hAnsi="Calibri"/>
+          <w:b/>
+          <w:color w:val="1D1D1B"/>
+          <w:sz w:val="32"/>
+        </w:rPr>
+        <w:t>2.6  Reconciliation: source to report</w:t>
+      </w:r>
+    </w:p>
+    <w:p>
+      <w:r>
+        <w:t>What: this compares every raw Parquet source count with its staging model, then checks the campaign and revenue totals that feed Power BI. Why: it distinguishes a deliberate reduction, such as de-duplicating contacts, from a dropped partition or broken join. How: rerun the same dbt build and this table is regenerated from the read-only warehouse connection; a zero delta is an exact count match.</w:t>
+      </w:r>
+    </w:p>
+    <w:tbl>
+      <w:tblPr>
+        <w:tblStyle w:val="LightList-Accent1"/>
+        <w:tblW w:type="auto" w:w="0"/>
+        <w:tblLook w:firstColumn="1" w:firstRow="1" w:lastColumn="0" w:lastRow="0" w:noHBand="0" w:noVBand="1" w:val="04A0"/>
+      </w:tblPr>
+      <w:tblGrid>
+        <w:gridCol w:w="2160"/>
+        <w:gridCol w:w="2160"/>
+        <w:gridCol w:w="2160"/>
+        <w:gridCol w:w="2160"/>
+      </w:tblGrid>
+      <w:tr>
+        <w:tc>
+          <w:tcPr>
+            <w:tcW w:type="dxa" w:w="2160"/>
+          </w:tcPr>
+          <w:p>
+            <w:r>
+              <w:t>Entity</w:t>
+            </w:r>
+          </w:p>
+        </w:tc>
+        <w:tc>
+          <w:tcPr>
+            <w:tcW w:type="dxa" w:w="2160"/>
+          </w:tcPr>
+          <w:p>
+            <w:r>
+              <w:t>Source rows</w:t>
+            </w:r>
+          </w:p>
+        </w:tc>
+        <w:tc>
+          <w:tcPr>
+            <w:tcW w:type="dxa" w:w="2160"/>
+          </w:tcPr>
+          <w:p>
+            <w:r>
+              <w:t>Staging rows</w:t>
+            </w:r>
+          </w:p>
+        </w:tc>
+        <w:tc>
+          <w:tcPr>
+            <w:tcW w:type="dxa" w:w="2160"/>
+          </w:tcPr>
+          <w:p>
+            <w:r>
+              <w:t>Delta</w:t>
+            </w:r>
+          </w:p>
+        </w:tc>
+      </w:tr>
+      <w:tr>
+        <w:tc>
+          <w:tcPr>
+            <w:tcW w:type="dxa" w:w="2160"/>
+          </w:tcPr>
+          <w:p>
+            <w:r>
+              <w:t>Lead</w:t>
+            </w:r>
+          </w:p>
+        </w:tc>
+        <w:tc>
+          <w:tcPr>
+            <w:tcW w:type="dxa" w:w="2160"/>
+          </w:tcPr>
+          <w:p>
+            <w:r>
+              <w:t>1,500,000</w:t>
+            </w:r>
+          </w:p>
+        </w:tc>
+        <w:tc>
+          <w:tcPr>
+            <w:tcW w:type="dxa" w:w="2160"/>
+          </w:tcPr>
+          <w:p>
+            <w:r>
+              <w:t>1,500,000</w:t>
+            </w:r>
+          </w:p>
+        </w:tc>
+        <w:tc>
+          <w:tcPr>
+            <w:tcW w:type="dxa" w:w="2160"/>
+          </w:tcPr>
+          <w:p>
+            <w:r>
+              <w:t>0</w:t>
+            </w:r>
+          </w:p>
+        </w:tc>
+      </w:tr>
+      <w:tr>
+        <w:tc>
+          <w:tcPr>
+            <w:tcW w:type="dxa" w:w="2160"/>
+          </w:tcPr>
+          <w:p>
+            <w:r>
+              <w:t>Contact</w:t>
+            </w:r>
+          </w:p>
+        </w:tc>
+        <w:tc>
+          <w:tcPr>
+            <w:tcW w:type="dxa" w:w="2160"/>
+          </w:tcPr>
+          <w:p>
+            <w:r>
+              <w:t>1,194,805</w:t>
+            </w:r>
+          </w:p>
+        </w:tc>
+        <w:tc>
+          <w:tcPr>
+            <w:tcW w:type="dxa" w:w="2160"/>
+          </w:tcPr>
+          <w:p>
+            <w:r>
+              <w:t>1,194,805</w:t>
+            </w:r>
+          </w:p>
+        </w:tc>
+        <w:tc>
+          <w:tcPr>
+            <w:tcW w:type="dxa" w:w="2160"/>
+          </w:tcPr>
+          <w:p>
+            <w:r>
+              <w:t>0</w:t>
+            </w:r>
+          </w:p>
+        </w:tc>
+      </w:tr>
+      <w:tr>
+        <w:tc>
+          <w:tcPr>
+            <w:tcW w:type="dxa" w:w="2160"/>
+          </w:tcPr>
+          <w:p>
+            <w:r>
+              <w:t>Opportunity</w:t>
+            </w:r>
+          </w:p>
+        </w:tc>
+        <w:tc>
+          <w:tcPr>
+            <w:tcW w:type="dxa" w:w="2160"/>
+          </w:tcPr>
+          <w:p>
+            <w:r>
+              <w:t>740,779</w:t>
+            </w:r>
+          </w:p>
+        </w:tc>
+        <w:tc>
+          <w:tcPr>
+            <w:tcW w:type="dxa" w:w="2160"/>
+          </w:tcPr>
+          <w:p>
+            <w:r>
+              <w:t>740,779</w:t>
+            </w:r>
+          </w:p>
+        </w:tc>
+        <w:tc>
+          <w:tcPr>
+            <w:tcW w:type="dxa" w:w="2160"/>
+          </w:tcPr>
+          <w:p>
+            <w:r>
+              <w:t>0</w:t>
+            </w:r>
+          </w:p>
+        </w:tc>
+      </w:tr>
+      <w:tr>
+        <w:tc>
+          <w:tcPr>
+            <w:tcW w:type="dxa" w:w="2160"/>
+          </w:tcPr>
+          <w:p>
+            <w:r>
+              <w:t>Application</w:t>
+            </w:r>
+          </w:p>
+        </w:tc>
+        <w:tc>
+          <w:tcPr>
+            <w:tcW w:type="dxa" w:w="2160"/>
+          </w:tcPr>
+          <w:p>
+            <w:r>
+              <w:t>533,360</w:t>
+            </w:r>
+          </w:p>
+        </w:tc>
+        <w:tc>
+          <w:tcPr>
+            <w:tcW w:type="dxa" w:w="2160"/>
+          </w:tcPr>
+          <w:p>
+            <w:r>
+              <w:t>533,360</w:t>
+            </w:r>
+          </w:p>
+        </w:tc>
+        <w:tc>
+          <w:tcPr>
+            <w:tcW w:type="dxa" w:w="2160"/>
+          </w:tcPr>
+          <w:p>
+            <w:r>
+              <w:t>0</w:t>
+            </w:r>
+          </w:p>
+        </w:tc>
+      </w:tr>
+      <w:tr>
+        <w:tc>
+          <w:tcPr>
+            <w:tcW w:type="dxa" w:w="2160"/>
+          </w:tcPr>
+          <w:p>
+            <w:r>
+              <w:t>Enrolment</w:t>
+            </w:r>
+          </w:p>
+        </w:tc>
+        <w:tc>
+          <w:tcPr>
+            <w:tcW w:type="dxa" w:w="2160"/>
+          </w:tcPr>
+          <w:p>
+            <w:r>
+              <w:t>304,168</w:t>
+            </w:r>
+          </w:p>
+        </w:tc>
+        <w:tc>
+          <w:tcPr>
+            <w:tcW w:type="dxa" w:w="2160"/>
+          </w:tcPr>
+          <w:p>
+            <w:r>
+              <w:t>304,168</w:t>
+            </w:r>
+          </w:p>
+        </w:tc>
+        <w:tc>
+          <w:tcPr>
+            <w:tcW w:type="dxa" w:w="2160"/>
+          </w:tcPr>
+          <w:p>
+            <w:r>
+              <w:t>0</w:t>
+            </w:r>
+          </w:p>
+        </w:tc>
+      </w:tr>
+      <w:tr>
+        <w:tc>
+          <w:tcPr>
+            <w:tcW w:type="dxa" w:w="2160"/>
+          </w:tcPr>
+          <w:p>
+            <w:r>
+              <w:t>Campaign</w:t>
+            </w:r>
+          </w:p>
+        </w:tc>
+        <w:tc>
+          <w:tcPr>
+            <w:tcW w:type="dxa" w:w="2160"/>
+          </w:tcPr>
+          <w:p>
+            <w:r>
+              <w:t>480</w:t>
+            </w:r>
+          </w:p>
+        </w:tc>
+        <w:tc>
+          <w:tcPr>
+            <w:tcW w:type="dxa" w:w="2160"/>
+          </w:tcPr>
+          <w:p>
+            <w:r>
+              <w:t>480</w:t>
+            </w:r>
+          </w:p>
+        </w:tc>
+        <w:tc>
+          <w:tcPr>
+            <w:tcW w:type="dxa" w:w="2160"/>
+          </w:tcPr>
+          <w:p>
+            <w:r>
+              <w:t>0</w:t>
+            </w:r>
+          </w:p>
+        </w:tc>
+      </w:tr>
+      <w:tr>
+        <w:tc>
+          <w:tcPr>
+            <w:tcW w:type="dxa" w:w="2160"/>
+          </w:tcPr>
+          <w:p>
+            <w:r>
+              <w:t>Campaign member</w:t>
+            </w:r>
+          </w:p>
+        </w:tc>
+        <w:tc>
+          <w:tcPr>
+            <w:tcW w:type="dxa" w:w="2160"/>
+          </w:tcPr>
+          <w:p>
+            <w:r>
+              <w:t>2,533,440</w:t>
+            </w:r>
+          </w:p>
+        </w:tc>
+        <w:tc>
+          <w:tcPr>
+            <w:tcW w:type="dxa" w:w="2160"/>
+          </w:tcPr>
+          <w:p>
+            <w:r>
+              <w:t>2,533,440</w:t>
+            </w:r>
+          </w:p>
+        </w:tc>
+        <w:tc>
+          <w:tcPr>
+            <w:tcW w:type="dxa" w:w="2160"/>
+          </w:tcPr>
+          <w:p>
+            <w:r>
+              <w:t>0</w:t>
+            </w:r>
+          </w:p>
+        </w:tc>
+      </w:tr>
+      <w:tr>
+        <w:tc>
+          <w:tcPr>
+            <w:tcW w:type="dxa" w:w="2160"/>
+          </w:tcPr>
+          <w:p>
+            <w:r>
+              <w:t>Student</w:t>
+            </w:r>
+          </w:p>
+        </w:tc>
+        <w:tc>
+          <w:tcPr>
+            <w:tcW w:type="dxa" w:w="2160"/>
+          </w:tcPr>
+          <w:p>
+            <w:r>
+              <w:t>254,931</w:t>
+            </w:r>
+          </w:p>
+        </w:tc>
+        <w:tc>
+          <w:tcPr>
+            <w:tcW w:type="dxa" w:w="2160"/>
+          </w:tcPr>
+          <w:p>
+            <w:r>
+              <w:t>254,931</w:t>
+            </w:r>
+          </w:p>
+        </w:tc>
+        <w:tc>
+          <w:tcPr>
+            <w:tcW w:type="dxa" w:w="2160"/>
+          </w:tcPr>
+          <w:p>
+            <w:r>
+              <w:t>0</w:t>
+            </w:r>
+          </w:p>
+        </w:tc>
+      </w:tr>
+      <w:tr>
+        <w:tc>
+          <w:tcPr>
+            <w:tcW w:type="dxa" w:w="2160"/>
+          </w:tcPr>
+          <w:p>
+            <w:r>
+              <w:t>Student progress</w:t>
+            </w:r>
+          </w:p>
+        </w:tc>
+        <w:tc>
+          <w:tcPr>
+            <w:tcW w:type="dxa" w:w="2160"/>
+          </w:tcPr>
+          <w:p>
+            <w:r>
+              <w:t>3,799,284</w:t>
+            </w:r>
+          </w:p>
+        </w:tc>
+        <w:tc>
+          <w:tcPr>
+            <w:tcW w:type="dxa" w:w="2160"/>
+          </w:tcPr>
+          <w:p>
+            <w:r>
+              <w:t>3,799,284</w:t>
+            </w:r>
+          </w:p>
+        </w:tc>
+        <w:tc>
+          <w:tcPr>
+            <w:tcW w:type="dxa" w:w="2160"/>
+          </w:tcPr>
+          <w:p>
+            <w:r>
+              <w:t>0</w:t>
+            </w:r>
+          </w:p>
+        </w:tc>
+      </w:tr>
+      <w:tr>
+        <w:tc>
+          <w:tcPr>
+            <w:tcW w:type="dxa" w:w="2160"/>
+          </w:tcPr>
+          <w:p>
+            <w:r>
+              <w:t>Programme</w:t>
+            </w:r>
+          </w:p>
+        </w:tc>
+        <w:tc>
+          <w:tcPr>
+            <w:tcW w:type="dxa" w:w="2160"/>
+          </w:tcPr>
+          <w:p>
+            <w:r>
+              <w:t>83</w:t>
+            </w:r>
+          </w:p>
+        </w:tc>
+        <w:tc>
+          <w:tcPr>
+            <w:tcW w:type="dxa" w:w="2160"/>
+          </w:tcPr>
+          <w:p>
+            <w:r>
+              <w:t>83</w:t>
+            </w:r>
+          </w:p>
+        </w:tc>
+        <w:tc>
+          <w:tcPr>
+            <w:tcW w:type="dxa" w:w="2160"/>
+          </w:tcPr>
+          <w:p>
+            <w:r>
+              <w:t>0</w:t>
+            </w:r>
+          </w:p>
+        </w:tc>
+      </w:tr>
+      <w:tr>
+        <w:tc>
+          <w:tcPr>
+            <w:tcW w:type="dxa" w:w="2160"/>
+          </w:tcPr>
+          <w:p>
+            <w:r>
+              <w:t>Offering</w:t>
+            </w:r>
+          </w:p>
+        </w:tc>
+        <w:tc>
+          <w:tcPr>
+            <w:tcW w:type="dxa" w:w="2160"/>
+          </w:tcPr>
+          <w:p>
+            <w:r>
+              <w:t>89</w:t>
+            </w:r>
+          </w:p>
+        </w:tc>
+        <w:tc>
+          <w:tcPr>
+            <w:tcW w:type="dxa" w:w="2160"/>
+          </w:tcPr>
+          <w:p>
+            <w:r>
+              <w:t>89</w:t>
+            </w:r>
+          </w:p>
+        </w:tc>
+        <w:tc>
+          <w:tcPr>
+            <w:tcW w:type="dxa" w:w="2160"/>
+          </w:tcPr>
+          <w:p>
+            <w:r>
+              <w:t>0</w:t>
+            </w:r>
+          </w:p>
+        </w:tc>
+      </w:tr>
+      <w:tr>
+        <w:tc>
+          <w:tcPr>
+            <w:tcW w:type="dxa" w:w="2160"/>
+          </w:tcPr>
+          <w:p>
+            <w:r>
+              <w:t>Intake</w:t>
+            </w:r>
+          </w:p>
+        </w:tc>
+        <w:tc>
+          <w:tcPr>
+            <w:tcW w:type="dxa" w:w="2160"/>
+          </w:tcPr>
+          <w:p>
+            <w:r>
+              <w:t>47</w:t>
+            </w:r>
+          </w:p>
+        </w:tc>
+        <w:tc>
+          <w:tcPr>
+            <w:tcW w:type="dxa" w:w="2160"/>
+          </w:tcPr>
+          <w:p>
+            <w:r>
+              <w:t>47</w:t>
+            </w:r>
+          </w:p>
+        </w:tc>
+        <w:tc>
+          <w:tcPr>
+            <w:tcW w:type="dxa" w:w="2160"/>
+          </w:tcPr>
+          <w:p>
+            <w:r>
+              <w:t>0</w:t>
+            </w:r>
+          </w:p>
+        </w:tc>
+      </w:tr>
+    </w:tbl>
+    <w:p>
+      <w:r>
+        <w:t>All 12 source-to-staging deltas are zero. The expected contact reduction is 1,165,332 golden people from 1,194,805 source contact records; the difference is the duplicate population resolved by the two-key entity model. The admissions fact contains 740,779 opportunity-grain rows and the campaign performance mart contains 480 campaign-grain rows.</w:t>
+      </w:r>
+    </w:p>
+    <w:p>
+      <w:r>
+        <w:t>Financial reconciliation: campaign spend dimension R471,994,991.55 versus campaign fact R471,994,991.55 (MATCH); enrolment revenue staging R2,867,214,315.80 versus campaign fact R1,896,377,742.41 (REVIEW).</w:t>
+      </w:r>
+    </w:p>
+    <w:p>
+      <w:r>
+        <w:t>The revenue REVIEW is explained by 103,218 enrolments carrying R970,836,573.39 without a primary campaign key. That amount remains in the enrolment staging total but cannot honestly be assigned to a campaign; the gap is R970,836,573.39, not a dropped record. Recommended solution: report this as an explicit unattributed segment, then improve campaign capture or backfill only from verified source evidence. Never distribute it across campaigns to force a match.</w:t>
+      </w:r>
+    </w:p>
+    <w:p>
+      <w:pPr>
+        <w:pStyle w:val="Heading2"/>
         <w:spacing w:before="320"/>
       </w:pPr>
       <w:r>
@@ -1012,7 +1606,7 @@
           <w:color w:val="1D1D1B"/>
           <w:sz w:val="34"/>
         </w:rPr>
-        <w:t>2.6  Where the demand actually is</w:t>
+        <w:t>2.7  Where the demand actually is</w:t>
       </w:r>
     </w:p>
     <w:p>
@@ -1084,7 +1678,7 @@
           <w:color w:val="1D1D1B"/>
           <w:sz w:val="26"/>
         </w:rPr>
-        <w:t>2.6.1  Who is enrolling, and from where</w:t>
+        <w:t>2.7.1  Who is enrolling, and from where</w:t>
       </w:r>
     </w:p>
     <w:p>
@@ -1208,7 +1802,7 @@
           <w:color w:val="1D1D1B"/>
           <w:sz w:val="26"/>
         </w:rPr>
-        <w:t>2.6.2  The funnel as conversion, not counts</w:t>
+        <w:t>2.7.2  The funnel as conversion, not counts</w:t>
       </w:r>
     </w:p>
     <w:p>
@@ -1280,7 +1874,7 @@
           <w:color w:val="1D1D1B"/>
           <w:sz w:val="34"/>
         </w:rPr>
-        <w:t>2.7  Blanks that are not gaps</w:t>
+        <w:t>2.8  Blanks that are not gaps</w:t>
       </w:r>
     </w:p>
     <w:p>
@@ -1305,7 +1899,7 @@
           <w:color w:val="1D1D1B"/>
           <w:sz w:val="34"/>
         </w:rPr>
-        <w:t>2.8  Why the CRM holds thousands and the warehouse holds millions</w:t>
+        <w:t>2.9  Why the CRM holds thousands and the warehouse holds millions</w:t>
       </w:r>
     </w:p>
     <w:p>
@@ -1330,7 +1924,7 @@
           <w:color w:val="1D1D1B"/>
           <w:sz w:val="34"/>
         </w:rPr>
-        <w:t>2.9  The pipeline, end to end</w:t>
+        <w:t>2.10  The pipeline, end to end</w:t>
       </w:r>
     </w:p>
     <w:p>

</xml_diff>

<commit_message>
Document live Salesforce operational slice
</commit_message>
<xml_diff>
--- a/ebook/RedAndYellow_Data_Story.docx
+++ b/ebook/RedAndYellow_Data_Story.docx
@@ -2208,7 +2208,12 @@
     </w:p>
     <w:p>
       <w:r>
-        <w:t>Accounts, contacts, leads and opportunities, upserted on an external ID so the load is idempotent - re-running updates rather than duplicates. Two things pushed back, and both were right to. Salesforce rejects the external ID in the request body when it is already the key in the URL. And its duplicate rules blocked leads that fuzzy-matched existing contacts at 100% confidence - the same duplicates the warehouse's own entity resolution finds, caught independently by the CRM.</w:t>
+        <w:t>The supplied Salesforce Data Types reference was applied at the system boundary: Accounts, Contacts, Leads and Opportunities are operational CRM records, while raw GA4/clickstream events, detailed history and ML training data stay in the warehouse. These four standard objects were upserted on an external ID so the load is idempotent - re-running updates rather than duplicates. Two things pushed back, and both were right to. Salesforce rejects the external ID in the request body when it is already the key in the URL. Its duplicate rules also blocked leads that fuzzy-matched existing contacts at 100% confidence - the same duplicates the warehouse's own entity resolution finds, caught independently by the CRM.</w:t>
+      </w:r>
+    </w:p>
+    <w:p>
+      <w:r>
+        <w:t>Live reconciliation on 10 September 2026 found 25 Accounts, 408 Contacts, 408 Leads and 250 Opportunities: 1,091 tagged records in total, with every count matching run_results/import_log.json. The Base Edition org cannot host the proposed custom Programme, Application, Student, Enrolment or Progress objects, and it does not support the campaign load in this reduced path. Those detailed objects remain in the warehouse until a Developer Edition or another edition with the required object entitlements is selected.</w:t>
       </w:r>
     </w:p>
     <w:p>

</xml_diff>

<commit_message>
Add verified Salesforce UI screenshot to ebook
</commit_message>
<xml_diff>
--- a/ebook/RedAndYellow_Data_Story.docx
+++ b/ebook/RedAndYellow_Data_Story.docx
@@ -4019,6 +4019,58 @@
     </w:p>
     <w:p>
       <w:pPr>
+        <w:jc w:val="center"/>
+      </w:pPr>
+      <w:r>
+        <w:drawing>
+          <wp:inline xmlns:a="http://schemas.openxmlformats.org/drawingml/2006/main" xmlns:pic="http://schemas.openxmlformats.org/drawingml/2006/picture">
+            <wp:extent cx="5394960" cy="2875206"/>
+            <wp:docPr id="28" name="Picture 28"/>
+            <wp:cNvGraphicFramePr>
+              <a:graphicFrameLocks noChangeAspect="1"/>
+            </wp:cNvGraphicFramePr>
+            <a:graphic>
+              <a:graphicData uri="http://schemas.openxmlformats.org/drawingml/2006/picture">
+                <pic:pic>
+                  <pic:nvPicPr>
+                    <pic:cNvPr id="0" name="07_Salesforce_contacts_live.png"/>
+                    <pic:cNvPicPr/>
+                  </pic:nvPicPr>
+                  <pic:blipFill>
+                    <a:blip r:embed="rId36"/>
+                    <a:stretch>
+                      <a:fillRect/>
+                    </a:stretch>
+                  </pic:blipFill>
+                  <pic:spPr>
+                    <a:xfrm>
+                      <a:off x="0" y="0"/>
+                      <a:ext cx="5394960" cy="2875206"/>
+                    </a:xfrm>
+                    <a:prstGeom prst="rect"/>
+                  </pic:spPr>
+                </pic:pic>
+              </a:graphicData>
+            </a:graphic>
+          </wp:inline>
+        </w:drawing>
+      </w:r>
+    </w:p>
+    <w:p>
+      <w:pPr>
+        <w:jc w:val="center"/>
+      </w:pPr>
+      <w:r>
+        <w:rPr>
+          <w:i/>
+          <w:color w:val="60646B"/>
+          <w:sz w:val="17"/>
+        </w:rPr>
+        <w:t>Salesforce contacts live</w:t>
+      </w:r>
+    </w:p>
+    <w:p>
+      <w:pPr>
         <w:pStyle w:val="Heading2"/>
         <w:spacing w:before="320"/>
       </w:pPr>

</xml_diff>

<commit_message>
Clarify CRM sample and warehouse populations
</commit_message>
<xml_diff>
--- a/ebook/RedAndYellow_Data_Story.docx
+++ b/ebook/RedAndYellow_Data_Story.docx
@@ -2217,6 +2217,11 @@
       </w:r>
     </w:p>
     <w:p>
+      <w:r>
+        <w:t>Keep the populations separate when reading this report. The staged CRM sample pack in data/crm_load contains 48 Campaigns, 74 CampaignMembers, 162 Applications, 84 Enrolments, 192 Programme Enquiries, 81 Students and 192 Student Progress rows; these are not live Salesforce records in the Base Edition org. The larger synthetic analytics population lives in warehouse/raw, Fabric raw_salesforce and the DuckDB gold model used by Power BI, Excel and this ebook.</w:t>
+      </w:r>
+    </w:p>
+    <w:p>
       <w:pPr>
         <w:jc w:val="center"/>
       </w:pPr>

</xml_diff>

<commit_message>
Add clean Salesforce count evidence to ebook
</commit_message>
<xml_diff>
--- a/ebook/RedAndYellow_Data_Story.docx
+++ b/ebook/RedAndYellow_Data_Story.docx
@@ -2337,7 +2337,67 @@
           <w:color w:val="1D1D1B"/>
           <w:sz w:val="32"/>
         </w:rPr>
-        <w:t>3.4  4. Extract it back out through the API</w:t>
+        <w:t>3.4  4. Salesforce record evidence</w:t>
+      </w:r>
+    </w:p>
+    <w:p>
+      <w:r>
+        <w:t>The following panels show the exact non-deleted record counts queried from the authenticated Salesforce extract. Browser tabs and the Windows taskbar are intentionally removed so the evidence is readable in the ebook. Each panel shows representative rows and the verified total; it is evidence of the live standard-object slice, not the staged custom-object sample pack.</w:t>
+      </w:r>
+    </w:p>
+    <w:p>
+      <w:r>
+        <w:rPr>
+          <w:i/>
+          <w:color w:val="60646B"/>
+          <w:sz w:val="17"/>
+        </w:rPr>
+        <w:t>[Figure 9 not captured - run reporting/capture_evidence.py]</w:t>
+      </w:r>
+    </w:p>
+    <w:p>
+      <w:r>
+        <w:rPr>
+          <w:i/>
+          <w:color w:val="60646B"/>
+          <w:sz w:val="17"/>
+        </w:rPr>
+        <w:t>[Figure 10 not captured - run reporting/capture_evidence.py]</w:t>
+      </w:r>
+    </w:p>
+    <w:p>
+      <w:r>
+        <w:rPr>
+          <w:i/>
+          <w:color w:val="60646B"/>
+          <w:sz w:val="17"/>
+        </w:rPr>
+        <w:t>[Figure 11 not captured - run reporting/capture_evidence.py]</w:t>
+      </w:r>
+    </w:p>
+    <w:p>
+      <w:r>
+        <w:rPr>
+          <w:i/>
+          <w:color w:val="60646B"/>
+          <w:sz w:val="17"/>
+        </w:rPr>
+        <w:t>[Figure 12 not captured - run reporting/capture_evidence.py]</w:t>
+      </w:r>
+    </w:p>
+    <w:p>
+      <w:pPr>
+        <w:pStyle w:val="Heading2"/>
+        <w:spacing w:before="240"/>
+      </w:pPr>
+      <w:r>
+        <w:rPr>
+          <w:rFonts w:ascii="Calibri" w:hAnsi="Calibri"/>
+          <w:b/>
+          <w:color w:val="1D1D1B"/>
+          <w:sz w:val="32"/>
+        </w:rPr>
+        <w:t>3.5  5. Extract it back out through the API</w:t>
       </w:r>
     </w:p>
     <w:p>
@@ -2409,7 +2469,7 @@
           <w:color w:val="1D1D1B"/>
           <w:sz w:val="32"/>
         </w:rPr>
-        <w:t>3.5  5. Transform, test, and report</w:t>
+        <w:t>3.6  6. Transform, test, and report</w:t>
       </w:r>
     </w:p>
     <w:p>
@@ -4076,6 +4136,214 @@
     </w:p>
     <w:p>
       <w:pPr>
+        <w:jc w:val="center"/>
+      </w:pPr>
+      <w:r>
+        <w:drawing>
+          <wp:inline xmlns:a="http://schemas.openxmlformats.org/drawingml/2006/main" xmlns:pic="http://schemas.openxmlformats.org/drawingml/2006/picture">
+            <wp:extent cx="5394960" cy="3034665"/>
+            <wp:docPr id="29" name="Picture 29"/>
+            <wp:cNvGraphicFramePr>
+              <a:graphicFrameLocks noChangeAspect="1"/>
+            </wp:cNvGraphicFramePr>
+            <a:graphic>
+              <a:graphicData uri="http://schemas.openxmlformats.org/drawingml/2006/picture">
+                <pic:pic>
+                  <pic:nvPicPr>
+                    <pic:cNvPr id="0" name="08_Salesforce_accounts_verified.png"/>
+                    <pic:cNvPicPr/>
+                  </pic:nvPicPr>
+                  <pic:blipFill>
+                    <a:blip r:embed="rId37"/>
+                    <a:stretch>
+                      <a:fillRect/>
+                    </a:stretch>
+                  </pic:blipFill>
+                  <pic:spPr>
+                    <a:xfrm>
+                      <a:off x="0" y="0"/>
+                      <a:ext cx="5394960" cy="3034665"/>
+                    </a:xfrm>
+                    <a:prstGeom prst="rect"/>
+                  </pic:spPr>
+                </pic:pic>
+              </a:graphicData>
+            </a:graphic>
+          </wp:inline>
+        </w:drawing>
+      </w:r>
+    </w:p>
+    <w:p>
+      <w:pPr>
+        <w:jc w:val="center"/>
+      </w:pPr>
+      <w:r>
+        <w:rPr>
+          <w:i/>
+          <w:color w:val="60646B"/>
+          <w:sz w:val="17"/>
+        </w:rPr>
+        <w:t>Salesforce accounts verified</w:t>
+      </w:r>
+    </w:p>
+    <w:p>
+      <w:pPr>
+        <w:jc w:val="center"/>
+      </w:pPr>
+      <w:r>
+        <w:drawing>
+          <wp:inline xmlns:a="http://schemas.openxmlformats.org/drawingml/2006/main" xmlns:pic="http://schemas.openxmlformats.org/drawingml/2006/picture">
+            <wp:extent cx="5394960" cy="3034665"/>
+            <wp:docPr id="30" name="Picture 30"/>
+            <wp:cNvGraphicFramePr>
+              <a:graphicFrameLocks noChangeAspect="1"/>
+            </wp:cNvGraphicFramePr>
+            <a:graphic>
+              <a:graphicData uri="http://schemas.openxmlformats.org/drawingml/2006/picture">
+                <pic:pic>
+                  <pic:nvPicPr>
+                    <pic:cNvPr id="0" name="09_Salesforce_contacts_verified.png"/>
+                    <pic:cNvPicPr/>
+                  </pic:nvPicPr>
+                  <pic:blipFill>
+                    <a:blip r:embed="rId38"/>
+                    <a:stretch>
+                      <a:fillRect/>
+                    </a:stretch>
+                  </pic:blipFill>
+                  <pic:spPr>
+                    <a:xfrm>
+                      <a:off x="0" y="0"/>
+                      <a:ext cx="5394960" cy="3034665"/>
+                    </a:xfrm>
+                    <a:prstGeom prst="rect"/>
+                  </pic:spPr>
+                </pic:pic>
+              </a:graphicData>
+            </a:graphic>
+          </wp:inline>
+        </w:drawing>
+      </w:r>
+    </w:p>
+    <w:p>
+      <w:pPr>
+        <w:jc w:val="center"/>
+      </w:pPr>
+      <w:r>
+        <w:rPr>
+          <w:i/>
+          <w:color w:val="60646B"/>
+          <w:sz w:val="17"/>
+        </w:rPr>
+        <w:t>Salesforce contacts verified</w:t>
+      </w:r>
+    </w:p>
+    <w:p>
+      <w:pPr>
+        <w:jc w:val="center"/>
+      </w:pPr>
+      <w:r>
+        <w:drawing>
+          <wp:inline xmlns:a="http://schemas.openxmlformats.org/drawingml/2006/main" xmlns:pic="http://schemas.openxmlformats.org/drawingml/2006/picture">
+            <wp:extent cx="5394960" cy="3034665"/>
+            <wp:docPr id="31" name="Picture 31"/>
+            <wp:cNvGraphicFramePr>
+              <a:graphicFrameLocks noChangeAspect="1"/>
+            </wp:cNvGraphicFramePr>
+            <a:graphic>
+              <a:graphicData uri="http://schemas.openxmlformats.org/drawingml/2006/picture">
+                <pic:pic>
+                  <pic:nvPicPr>
+                    <pic:cNvPr id="0" name="10_Salesforce_leads_verified.png"/>
+                    <pic:cNvPicPr/>
+                  </pic:nvPicPr>
+                  <pic:blipFill>
+                    <a:blip r:embed="rId39"/>
+                    <a:stretch>
+                      <a:fillRect/>
+                    </a:stretch>
+                  </pic:blipFill>
+                  <pic:spPr>
+                    <a:xfrm>
+                      <a:off x="0" y="0"/>
+                      <a:ext cx="5394960" cy="3034665"/>
+                    </a:xfrm>
+                    <a:prstGeom prst="rect"/>
+                  </pic:spPr>
+                </pic:pic>
+              </a:graphicData>
+            </a:graphic>
+          </wp:inline>
+        </w:drawing>
+      </w:r>
+    </w:p>
+    <w:p>
+      <w:pPr>
+        <w:jc w:val="center"/>
+      </w:pPr>
+      <w:r>
+        <w:rPr>
+          <w:i/>
+          <w:color w:val="60646B"/>
+          <w:sz w:val="17"/>
+        </w:rPr>
+        <w:t>Salesforce leads verified</w:t>
+      </w:r>
+    </w:p>
+    <w:p>
+      <w:pPr>
+        <w:jc w:val="center"/>
+      </w:pPr>
+      <w:r>
+        <w:drawing>
+          <wp:inline xmlns:a="http://schemas.openxmlformats.org/drawingml/2006/main" xmlns:pic="http://schemas.openxmlformats.org/drawingml/2006/picture">
+            <wp:extent cx="5394960" cy="3034665"/>
+            <wp:docPr id="32" name="Picture 32"/>
+            <wp:cNvGraphicFramePr>
+              <a:graphicFrameLocks noChangeAspect="1"/>
+            </wp:cNvGraphicFramePr>
+            <a:graphic>
+              <a:graphicData uri="http://schemas.openxmlformats.org/drawingml/2006/picture">
+                <pic:pic>
+                  <pic:nvPicPr>
+                    <pic:cNvPr id="0" name="11_Salesforce_opportunities_verified.png"/>
+                    <pic:cNvPicPr/>
+                  </pic:nvPicPr>
+                  <pic:blipFill>
+                    <a:blip r:embed="rId40"/>
+                    <a:stretch>
+                      <a:fillRect/>
+                    </a:stretch>
+                  </pic:blipFill>
+                  <pic:spPr>
+                    <a:xfrm>
+                      <a:off x="0" y="0"/>
+                      <a:ext cx="5394960" cy="3034665"/>
+                    </a:xfrm>
+                    <a:prstGeom prst="rect"/>
+                  </pic:spPr>
+                </pic:pic>
+              </a:graphicData>
+            </a:graphic>
+          </wp:inline>
+        </w:drawing>
+      </w:r>
+    </w:p>
+    <w:p>
+      <w:pPr>
+        <w:jc w:val="center"/>
+      </w:pPr>
+      <w:r>
+        <w:rPr>
+          <w:i/>
+          <w:color w:val="60646B"/>
+          <w:sz w:val="17"/>
+        </w:rPr>
+        <w:t>Salesforce opportunities verified</w:t>
+      </w:r>
+    </w:p>
+    <w:p>
+      <w:pPr>
         <w:pStyle w:val="Heading2"/>
         <w:spacing w:before="320"/>
       </w:pPr>

</xml_diff>

<commit_message>
Document GA4 to Fabric ingestion and clean NiFi capture
</commit_message>
<xml_diff>
--- a/ebook/RedAndYellow_Data_Story.docx
+++ b/ebook/RedAndYellow_Data_Story.docx
@@ -3867,6 +3867,16 @@
       </w:r>
     </w:p>
     <w:p>
+      <w:r>
+        <w:rPr>
+          <w:i/>
+          <w:color w:val="60646B"/>
+          <w:sz w:val="17"/>
+        </w:rPr>
+        <w:t>[Figure 11a not captured - run reporting/capture_evidence.py]</w:t>
+      </w:r>
+    </w:p>
+    <w:p>
       <w:pPr>
         <w:pStyle w:val="Heading2"/>
         <w:spacing w:before="240"/>
@@ -4344,6 +4354,58 @@
     </w:p>
     <w:p>
       <w:pPr>
+        <w:jc w:val="center"/>
+      </w:pPr>
+      <w:r>
+        <w:drawing>
+          <wp:inline xmlns:a="http://schemas.openxmlformats.org/drawingml/2006/main" xmlns:pic="http://schemas.openxmlformats.org/drawingml/2006/picture">
+            <wp:extent cx="5394960" cy="2567148"/>
+            <wp:docPr id="33" name="Picture 33"/>
+            <wp:cNvGraphicFramePr>
+              <a:graphicFrameLocks noChangeAspect="1"/>
+            </wp:cNvGraphicFramePr>
+            <a:graphic>
+              <a:graphicData uri="http://schemas.openxmlformats.org/drawingml/2006/picture">
+                <pic:pic>
+                  <pic:nvPicPr>
+                    <pic:cNvPr id="0" name="12_NiFi_salesforce_to_fabric_clean.png"/>
+                    <pic:cNvPicPr/>
+                  </pic:nvPicPr>
+                  <pic:blipFill>
+                    <a:blip r:embed="rId41"/>
+                    <a:stretch>
+                      <a:fillRect/>
+                    </a:stretch>
+                  </pic:blipFill>
+                  <pic:spPr>
+                    <a:xfrm>
+                      <a:off x="0" y="0"/>
+                      <a:ext cx="5394960" cy="2567148"/>
+                    </a:xfrm>
+                    <a:prstGeom prst="rect"/>
+                  </pic:spPr>
+                </pic:pic>
+              </a:graphicData>
+            </a:graphic>
+          </wp:inline>
+        </w:drawing>
+      </w:r>
+    </w:p>
+    <w:p>
+      <w:pPr>
+        <w:jc w:val="center"/>
+      </w:pPr>
+      <w:r>
+        <w:rPr>
+          <w:i/>
+          <w:color w:val="60646B"/>
+          <w:sz w:val="17"/>
+        </w:rPr>
+        <w:t>NiFi salesforce to fabric clean</w:t>
+      </w:r>
+    </w:p>
+    <w:p>
+      <w:pPr>
         <w:pStyle w:val="Heading2"/>
         <w:spacing w:before="320"/>
       </w:pPr>

</xml_diff>

<commit_message>
Complete course risk, evidence and SEO reporting
</commit_message>
<xml_diff>
--- a/ebook/RedAndYellow_Data_Story.docx
+++ b/ebook/RedAndYellow_Data_Story.docx
@@ -1678,7 +1678,84 @@
           <w:color w:val="1D1D1B"/>
           <w:sz w:val="26"/>
         </w:rPr>
-        <w:t>2.7.1  Who is enrolling, and from where</w:t>
+        <w:t>2.7.1  Course performance and early dropout risk</w:t>
+      </w:r>
+    </w:p>
+    <w:p>
+      <w:r>
+        <w:t>Courses are ranked on the same first-four-week withdrawal model used in Power BI. Among cohorts with at least 100 records, Design Thinking has the lowest observed withdrawal rate (11.6%), while Part-Time Higher Certificate in Marketing and Branding is highest (13.3%). These are modelled synthetic cohorts, so the ranking is a prioritisation signal rather than a claim about the real institution.</w:t>
+      </w:r>
+    </w:p>
+    <w:p>
+      <w:r>
+        <w:t>Use the ranking with attendance and assessment together: a course moves into early-warning review when first-month attendance falls below 65% or the predicted band is Elevated. Review cohort size, delivery mode and fee context before changing course marketing or student-support policy.</w:t>
+      </w:r>
+    </w:p>
+    <w:p>
+      <w:pPr>
+        <w:jc w:val="center"/>
+      </w:pPr>
+      <w:r>
+        <w:drawing>
+          <wp:inline xmlns:a="http://schemas.openxmlformats.org/drawingml/2006/main" xmlns:pic="http://schemas.openxmlformats.org/drawingml/2006/picture">
+            <wp:extent cx="5577840" cy="3224689"/>
+            <wp:docPr id="10" name="Picture 10"/>
+            <wp:cNvGraphicFramePr>
+              <a:graphicFrameLocks noChangeAspect="1"/>
+            </wp:cNvGraphicFramePr>
+            <a:graphic>
+              <a:graphicData uri="http://schemas.openxmlformats.org/drawingml/2006/picture">
+                <pic:pic>
+                  <pic:nvPicPr>
+                    <pic:cNvPr id="0" name="prog_risk.png"/>
+                    <pic:cNvPicPr/>
+                  </pic:nvPicPr>
+                  <pic:blipFill>
+                    <a:blip r:embed="rId18"/>
+                    <a:stretch>
+                      <a:fillRect/>
+                    </a:stretch>
+                  </pic:blipFill>
+                  <pic:spPr>
+                    <a:xfrm>
+                      <a:off x="0" y="0"/>
+                      <a:ext cx="5577840" cy="3224689"/>
+                    </a:xfrm>
+                    <a:prstGeom prst="rect"/>
+                  </pic:spPr>
+                </pic:pic>
+              </a:graphicData>
+            </a:graphic>
+          </wp:inline>
+        </w:drawing>
+      </w:r>
+    </w:p>
+    <w:p>
+      <w:pPr>
+        <w:jc w:val="center"/>
+      </w:pPr>
+      <w:r>
+        <w:rPr>
+          <w:i/>
+          <w:color w:val="60646B"/>
+          <w:sz w:val="17"/>
+        </w:rPr>
+        <w:t>Figure 4a - Lowest- and highest-withdrawal courses among modelled cohorts of at least 100 records.</w:t>
+      </w:r>
+    </w:p>
+    <w:p>
+      <w:pPr>
+        <w:pStyle w:val="Heading3"/>
+        <w:spacing w:before="240"/>
+      </w:pPr>
+      <w:r>
+        <w:rPr>
+          <w:rFonts w:ascii="Calibri" w:hAnsi="Calibri"/>
+          <w:b/>
+          <w:color w:val="1D1D1B"/>
+          <w:sz w:val="26"/>
+        </w:rPr>
+        <w:t>2.7.2  Who is enrolling, and from where</w:t>
       </w:r>
     </w:p>
     <w:p>
@@ -1694,7 +1771,7 @@
         <w:drawing>
           <wp:inline xmlns:a="http://schemas.openxmlformats.org/drawingml/2006/main" xmlns:pic="http://schemas.openxmlformats.org/drawingml/2006/picture">
             <wp:extent cx="5577840" cy="2527459"/>
-            <wp:docPr id="10" name="Picture 10"/>
+            <wp:docPr id="11" name="Picture 11"/>
             <wp:cNvGraphicFramePr>
               <a:graphicFrameLocks noChangeAspect="1"/>
             </wp:cNvGraphicFramePr>
@@ -1706,7 +1783,7 @@
                     <pic:cNvPicPr/>
                   </pic:nvPicPr>
                   <pic:blipFill>
-                    <a:blip r:embed="rId18"/>
+                    <a:blip r:embed="rId19"/>
                     <a:stretch>
                       <a:fillRect/>
                     </a:stretch>
@@ -1746,7 +1823,7 @@
         <w:drawing>
           <wp:inline xmlns:a="http://schemas.openxmlformats.org/drawingml/2006/main" xmlns:pic="http://schemas.openxmlformats.org/drawingml/2006/picture">
             <wp:extent cx="5577840" cy="3129944"/>
-            <wp:docPr id="11" name="Picture 11"/>
+            <wp:docPr id="12" name="Picture 12"/>
             <wp:cNvGraphicFramePr>
               <a:graphicFrameLocks noChangeAspect="1"/>
             </wp:cNvGraphicFramePr>
@@ -1758,7 +1835,7 @@
                     <pic:cNvPicPr/>
                   </pic:nvPicPr>
                   <pic:blipFill>
-                    <a:blip r:embed="rId19"/>
+                    <a:blip r:embed="rId20"/>
                     <a:stretch>
                       <a:fillRect/>
                     </a:stretch>
@@ -1802,7 +1879,7 @@
           <w:color w:val="1D1D1B"/>
           <w:sz w:val="26"/>
         </w:rPr>
-        <w:t>2.7.2  The funnel as conversion, not counts</w:t>
+        <w:t>2.7.3  The funnel as conversion, not counts</w:t>
       </w:r>
     </w:p>
     <w:p>
@@ -1818,7 +1895,7 @@
         <w:drawing>
           <wp:inline xmlns:a="http://schemas.openxmlformats.org/drawingml/2006/main" xmlns:pic="http://schemas.openxmlformats.org/drawingml/2006/picture">
             <wp:extent cx="5577840" cy="2265998"/>
-            <wp:docPr id="12" name="Picture 12"/>
+            <wp:docPr id="13" name="Picture 13"/>
             <wp:cNvGraphicFramePr>
               <a:graphicFrameLocks noChangeAspect="1"/>
             </wp:cNvGraphicFramePr>
@@ -1830,7 +1907,7 @@
                     <pic:cNvPicPr/>
                   </pic:nvPicPr>
                   <pic:blipFill>
-                    <a:blip r:embed="rId20"/>
+                    <a:blip r:embed="rId21"/>
                     <a:stretch>
                       <a:fillRect/>
                     </a:stretch>
@@ -2075,7 +2152,7 @@
         <w:drawing>
           <wp:inline xmlns:a="http://schemas.openxmlformats.org/drawingml/2006/main" xmlns:pic="http://schemas.openxmlformats.org/drawingml/2006/picture">
             <wp:extent cx="5577840" cy="3078579"/>
-            <wp:docPr id="13" name="Picture 13"/>
+            <wp:docPr id="14" name="Picture 14"/>
             <wp:cNvGraphicFramePr>
               <a:graphicFrameLocks noChangeAspect="1"/>
             </wp:cNvGraphicFramePr>
@@ -2087,7 +2164,7 @@
                     <pic:cNvPicPr/>
                   </pic:nvPicPr>
                   <pic:blipFill>
-                    <a:blip r:embed="rId21"/>
+                    <a:blip r:embed="rId22"/>
                     <a:stretch>
                       <a:fillRect/>
                     </a:stretch>
@@ -2147,7 +2224,7 @@
         <w:drawing>
           <wp:inline xmlns:a="http://schemas.openxmlformats.org/drawingml/2006/main" xmlns:pic="http://schemas.openxmlformats.org/drawingml/2006/picture">
             <wp:extent cx="5577840" cy="2939058"/>
-            <wp:docPr id="14" name="Picture 14"/>
+            <wp:docPr id="15" name="Picture 15"/>
             <wp:cNvGraphicFramePr>
               <a:graphicFrameLocks noChangeAspect="1"/>
             </wp:cNvGraphicFramePr>
@@ -2159,7 +2236,7 @@
                     <pic:cNvPicPr/>
                   </pic:nvPicPr>
                   <pic:blipFill>
-                    <a:blip r:embed="rId22"/>
+                    <a:blip r:embed="rId23"/>
                     <a:stretch>
                       <a:fillRect/>
                     </a:stretch>
@@ -2229,7 +2306,7 @@
         <w:drawing>
           <wp:inline xmlns:a="http://schemas.openxmlformats.org/drawingml/2006/main" xmlns:pic="http://schemas.openxmlformats.org/drawingml/2006/picture">
             <wp:extent cx="5577840" cy="2368838"/>
-            <wp:docPr id="15" name="Picture 15"/>
+            <wp:docPr id="16" name="Picture 16"/>
             <wp:cNvGraphicFramePr>
               <a:graphicFrameLocks noChangeAspect="1"/>
             </wp:cNvGraphicFramePr>
@@ -2241,7 +2318,7 @@
                     <pic:cNvPicPr/>
                   </pic:nvPicPr>
                   <pic:blipFill>
-                    <a:blip r:embed="rId23"/>
+                    <a:blip r:embed="rId24"/>
                     <a:stretch>
                       <a:fillRect/>
                     </a:stretch>
@@ -2281,7 +2358,7 @@
         <w:drawing>
           <wp:inline xmlns:a="http://schemas.openxmlformats.org/drawingml/2006/main" xmlns:pic="http://schemas.openxmlformats.org/drawingml/2006/picture">
             <wp:extent cx="5577840" cy="2939058"/>
-            <wp:docPr id="16" name="Picture 16"/>
+            <wp:docPr id="17" name="Picture 17"/>
             <wp:cNvGraphicFramePr>
               <a:graphicFrameLocks noChangeAspect="1"/>
             </wp:cNvGraphicFramePr>
@@ -2293,7 +2370,7 @@
                     <pic:cNvPicPr/>
                   </pic:nvPicPr>
                   <pic:blipFill>
-                    <a:blip r:embed="rId24"/>
+                    <a:blip r:embed="rId25"/>
                     <a:stretch>
                       <a:fillRect/>
                     </a:stretch>
@@ -2346,43 +2423,211 @@
       </w:r>
     </w:p>
     <w:p>
+      <w:pPr>
+        <w:jc w:val="center"/>
+      </w:pPr>
+      <w:r>
+        <w:drawing>
+          <wp:inline xmlns:a="http://schemas.openxmlformats.org/drawingml/2006/main" xmlns:pic="http://schemas.openxmlformats.org/drawingml/2006/picture">
+            <wp:extent cx="5577840" cy="3137535"/>
+            <wp:docPr id="18" name="Picture 18"/>
+            <wp:cNvGraphicFramePr>
+              <a:graphicFrameLocks noChangeAspect="1"/>
+            </wp:cNvGraphicFramePr>
+            <a:graphic>
+              <a:graphicData uri="http://schemas.openxmlformats.org/drawingml/2006/picture">
+                <pic:pic>
+                  <pic:nvPicPr>
+                    <pic:cNvPr id="0" name="08_Salesforce_accounts_verified.png"/>
+                    <pic:cNvPicPr/>
+                  </pic:nvPicPr>
+                  <pic:blipFill>
+                    <a:blip r:embed="rId26"/>
+                    <a:stretch>
+                      <a:fillRect/>
+                    </a:stretch>
+                  </pic:blipFill>
+                  <pic:spPr>
+                    <a:xfrm>
+                      <a:off x="0" y="0"/>
+                      <a:ext cx="5577840" cy="3137535"/>
+                    </a:xfrm>
+                    <a:prstGeom prst="rect"/>
+                  </pic:spPr>
+                </pic:pic>
+              </a:graphicData>
+            </a:graphic>
+          </wp:inline>
+        </w:drawing>
+      </w:r>
+    </w:p>
+    <w:p>
+      <w:pPr>
+        <w:jc w:val="center"/>
+      </w:pPr>
       <w:r>
         <w:rPr>
           <w:i/>
           <w:color w:val="60646B"/>
           <w:sz w:val="17"/>
         </w:rPr>
-        <w:t>[Figure 9 not captured - run reporting/capture_evidence.py]</w:t>
+        <w:t>Figure 9 - Salesforce Accounts evidence: 25 verified records.</w:t>
       </w:r>
     </w:p>
     <w:p>
+      <w:pPr>
+        <w:jc w:val="center"/>
+      </w:pPr>
+      <w:r>
+        <w:drawing>
+          <wp:inline xmlns:a="http://schemas.openxmlformats.org/drawingml/2006/main" xmlns:pic="http://schemas.openxmlformats.org/drawingml/2006/picture">
+            <wp:extent cx="5577840" cy="3137535"/>
+            <wp:docPr id="19" name="Picture 19"/>
+            <wp:cNvGraphicFramePr>
+              <a:graphicFrameLocks noChangeAspect="1"/>
+            </wp:cNvGraphicFramePr>
+            <a:graphic>
+              <a:graphicData uri="http://schemas.openxmlformats.org/drawingml/2006/picture">
+                <pic:pic>
+                  <pic:nvPicPr>
+                    <pic:cNvPr id="0" name="09_Salesforce_contacts_verified.png"/>
+                    <pic:cNvPicPr/>
+                  </pic:nvPicPr>
+                  <pic:blipFill>
+                    <a:blip r:embed="rId27"/>
+                    <a:stretch>
+                      <a:fillRect/>
+                    </a:stretch>
+                  </pic:blipFill>
+                  <pic:spPr>
+                    <a:xfrm>
+                      <a:off x="0" y="0"/>
+                      <a:ext cx="5577840" cy="3137535"/>
+                    </a:xfrm>
+                    <a:prstGeom prst="rect"/>
+                  </pic:spPr>
+                </pic:pic>
+              </a:graphicData>
+            </a:graphic>
+          </wp:inline>
+        </w:drawing>
+      </w:r>
+    </w:p>
+    <w:p>
+      <w:pPr>
+        <w:jc w:val="center"/>
+      </w:pPr>
       <w:r>
         <w:rPr>
           <w:i/>
           <w:color w:val="60646B"/>
           <w:sz w:val="17"/>
         </w:rPr>
-        <w:t>[Figure 10 not captured - run reporting/capture_evidence.py]</w:t>
+        <w:t>Figure 10 - Salesforce Contacts evidence: 408 verified records.</w:t>
       </w:r>
     </w:p>
     <w:p>
+      <w:pPr>
+        <w:jc w:val="center"/>
+      </w:pPr>
+      <w:r>
+        <w:drawing>
+          <wp:inline xmlns:a="http://schemas.openxmlformats.org/drawingml/2006/main" xmlns:pic="http://schemas.openxmlformats.org/drawingml/2006/picture">
+            <wp:extent cx="5577840" cy="3137535"/>
+            <wp:docPr id="20" name="Picture 20"/>
+            <wp:cNvGraphicFramePr>
+              <a:graphicFrameLocks noChangeAspect="1"/>
+            </wp:cNvGraphicFramePr>
+            <a:graphic>
+              <a:graphicData uri="http://schemas.openxmlformats.org/drawingml/2006/picture">
+                <pic:pic>
+                  <pic:nvPicPr>
+                    <pic:cNvPr id="0" name="10_Salesforce_leads_verified.png"/>
+                    <pic:cNvPicPr/>
+                  </pic:nvPicPr>
+                  <pic:blipFill>
+                    <a:blip r:embed="rId28"/>
+                    <a:stretch>
+                      <a:fillRect/>
+                    </a:stretch>
+                  </pic:blipFill>
+                  <pic:spPr>
+                    <a:xfrm>
+                      <a:off x="0" y="0"/>
+                      <a:ext cx="5577840" cy="3137535"/>
+                    </a:xfrm>
+                    <a:prstGeom prst="rect"/>
+                  </pic:spPr>
+                </pic:pic>
+              </a:graphicData>
+            </a:graphic>
+          </wp:inline>
+        </w:drawing>
+      </w:r>
+    </w:p>
+    <w:p>
+      <w:pPr>
+        <w:jc w:val="center"/>
+      </w:pPr>
       <w:r>
         <w:rPr>
           <w:i/>
           <w:color w:val="60646B"/>
           <w:sz w:val="17"/>
         </w:rPr>
-        <w:t>[Figure 11 not captured - run reporting/capture_evidence.py]</w:t>
+        <w:t>Figure 11 - Salesforce Leads evidence: 408 verified records.</w:t>
       </w:r>
     </w:p>
     <w:p>
+      <w:pPr>
+        <w:jc w:val="center"/>
+      </w:pPr>
+      <w:r>
+        <w:drawing>
+          <wp:inline xmlns:a="http://schemas.openxmlformats.org/drawingml/2006/main" xmlns:pic="http://schemas.openxmlformats.org/drawingml/2006/picture">
+            <wp:extent cx="5577840" cy="3137535"/>
+            <wp:docPr id="21" name="Picture 21"/>
+            <wp:cNvGraphicFramePr>
+              <a:graphicFrameLocks noChangeAspect="1"/>
+            </wp:cNvGraphicFramePr>
+            <a:graphic>
+              <a:graphicData uri="http://schemas.openxmlformats.org/drawingml/2006/picture">
+                <pic:pic>
+                  <pic:nvPicPr>
+                    <pic:cNvPr id="0" name="11_Salesforce_opportunities_verified.png"/>
+                    <pic:cNvPicPr/>
+                  </pic:nvPicPr>
+                  <pic:blipFill>
+                    <a:blip r:embed="rId29"/>
+                    <a:stretch>
+                      <a:fillRect/>
+                    </a:stretch>
+                  </pic:blipFill>
+                  <pic:spPr>
+                    <a:xfrm>
+                      <a:off x="0" y="0"/>
+                      <a:ext cx="5577840" cy="3137535"/>
+                    </a:xfrm>
+                    <a:prstGeom prst="rect"/>
+                  </pic:spPr>
+                </pic:pic>
+              </a:graphicData>
+            </a:graphic>
+          </wp:inline>
+        </w:drawing>
+      </w:r>
+    </w:p>
+    <w:p>
+      <w:pPr>
+        <w:jc w:val="center"/>
+      </w:pPr>
       <w:r>
         <w:rPr>
           <w:i/>
           <w:color w:val="60646B"/>
           <w:sz w:val="17"/>
         </w:rPr>
-        <w:t>[Figure 12 not captured - run reporting/capture_evidence.py]</w:t>
+        <w:t>Figure 12 - Salesforce Opportunities evidence: 250 verified records.</w:t>
       </w:r>
     </w:p>
     <w:p>
@@ -2413,7 +2658,7 @@
         <w:drawing>
           <wp:inline xmlns:a="http://schemas.openxmlformats.org/drawingml/2006/main" xmlns:pic="http://schemas.openxmlformats.org/drawingml/2006/picture">
             <wp:extent cx="5577840" cy="2226283"/>
-            <wp:docPr id="17" name="Picture 17"/>
+            <wp:docPr id="22" name="Picture 22"/>
             <wp:cNvGraphicFramePr>
               <a:graphicFrameLocks noChangeAspect="1"/>
             </wp:cNvGraphicFramePr>
@@ -2425,7 +2670,7 @@
                     <pic:cNvPicPr/>
                   </pic:nvPicPr>
                   <pic:blipFill>
-                    <a:blip r:embed="rId25"/>
+                    <a:blip r:embed="rId30"/>
                     <a:stretch>
                       <a:fillRect/>
                     </a:stretch>
@@ -2485,7 +2730,7 @@
         <w:drawing>
           <wp:inline xmlns:a="http://schemas.openxmlformats.org/drawingml/2006/main" xmlns:pic="http://schemas.openxmlformats.org/drawingml/2006/picture">
             <wp:extent cx="5577840" cy="1798618"/>
-            <wp:docPr id="18" name="Picture 18"/>
+            <wp:docPr id="23" name="Picture 23"/>
             <wp:cNvGraphicFramePr>
               <a:graphicFrameLocks noChangeAspect="1"/>
             </wp:cNvGraphicFramePr>
@@ -2497,7 +2742,7 @@
                     <pic:cNvPicPr/>
                   </pic:nvPicPr>
                   <pic:blipFill>
-                    <a:blip r:embed="rId26"/>
+                    <a:blip r:embed="rId31"/>
                     <a:stretch>
                       <a:fillRect/>
                     </a:stretch>
@@ -2743,7 +2988,7 @@
         <w:drawing>
           <wp:inline xmlns:a="http://schemas.openxmlformats.org/drawingml/2006/main" xmlns:pic="http://schemas.openxmlformats.org/drawingml/2006/picture">
             <wp:extent cx="5577840" cy="2281844"/>
-            <wp:docPr id="19" name="Picture 19"/>
+            <wp:docPr id="24" name="Picture 24"/>
             <wp:cNvGraphicFramePr>
               <a:graphicFrameLocks noChangeAspect="1"/>
             </wp:cNvGraphicFramePr>
@@ -2755,7 +3000,7 @@
                     <pic:cNvPicPr/>
                   </pic:nvPicPr>
                   <pic:blipFill>
-                    <a:blip r:embed="rId27"/>
+                    <a:blip r:embed="rId32"/>
                     <a:stretch>
                       <a:fillRect/>
                     </a:stretch>
@@ -2795,7 +3040,7 @@
         <w:drawing>
           <wp:inline xmlns:a="http://schemas.openxmlformats.org/drawingml/2006/main" xmlns:pic="http://schemas.openxmlformats.org/drawingml/2006/picture">
             <wp:extent cx="5577840" cy="2281844"/>
-            <wp:docPr id="20" name="Picture 20"/>
+            <wp:docPr id="25" name="Picture 25"/>
             <wp:cNvGraphicFramePr>
               <a:graphicFrameLocks noChangeAspect="1"/>
             </wp:cNvGraphicFramePr>
@@ -2807,7 +3052,7 @@
                     <pic:cNvPicPr/>
                   </pic:nvPicPr>
                   <pic:blipFill>
-                    <a:blip r:embed="rId28"/>
+                    <a:blip r:embed="rId33"/>
                     <a:stretch>
                       <a:fillRect/>
                     </a:stretch>
@@ -3581,7 +3826,7 @@
         <w:drawing>
           <wp:inline xmlns:a="http://schemas.openxmlformats.org/drawingml/2006/main" xmlns:pic="http://schemas.openxmlformats.org/drawingml/2006/picture">
             <wp:extent cx="5577840" cy="2551565"/>
-            <wp:docPr id="21" name="Picture 21"/>
+            <wp:docPr id="26" name="Picture 26"/>
             <wp:cNvGraphicFramePr>
               <a:graphicFrameLocks noChangeAspect="1"/>
             </wp:cNvGraphicFramePr>
@@ -3593,7 +3838,7 @@
                     <pic:cNvPicPr/>
                   </pic:nvPicPr>
                   <pic:blipFill>
-                    <a:blip r:embed="rId29"/>
+                    <a:blip r:embed="rId34"/>
                     <a:stretch>
                       <a:fillRect/>
                     </a:stretch>
@@ -3653,7 +3898,7 @@
         <w:drawing>
           <wp:inline xmlns:a="http://schemas.openxmlformats.org/drawingml/2006/main" xmlns:pic="http://schemas.openxmlformats.org/drawingml/2006/picture">
             <wp:extent cx="5669280" cy="4251960"/>
-            <wp:docPr id="22" name="Picture 22"/>
+            <wp:docPr id="27" name="Picture 27"/>
             <wp:cNvGraphicFramePr>
               <a:graphicFrameLocks noChangeAspect="1"/>
             </wp:cNvGraphicFramePr>
@@ -3665,7 +3910,7 @@
                     <pic:cNvPicPr/>
                   </pic:nvPicPr>
                   <pic:blipFill>
-                    <a:blip r:embed="rId30"/>
+                    <a:blip r:embed="rId35"/>
                     <a:stretch>
                       <a:fillRect/>
                     </a:stretch>
@@ -3725,7 +3970,7 @@
         <w:drawing>
           <wp:inline xmlns:a="http://schemas.openxmlformats.org/drawingml/2006/main" xmlns:pic="http://schemas.openxmlformats.org/drawingml/2006/picture">
             <wp:extent cx="5577840" cy="3560323"/>
-            <wp:docPr id="23" name="Picture 23"/>
+            <wp:docPr id="28" name="Picture 28"/>
             <wp:cNvGraphicFramePr>
               <a:graphicFrameLocks noChangeAspect="1"/>
             </wp:cNvGraphicFramePr>
@@ -3737,7 +3982,7 @@
                     <pic:cNvPicPr/>
                   </pic:nvPicPr>
                   <pic:blipFill>
-                    <a:blip r:embed="rId31"/>
+                    <a:blip r:embed="rId36"/>
                     <a:stretch>
                       <a:fillRect/>
                     </a:stretch>
@@ -3822,7 +4067,7 @@
         <w:drawing>
           <wp:inline xmlns:a="http://schemas.openxmlformats.org/drawingml/2006/main" xmlns:pic="http://schemas.openxmlformats.org/drawingml/2006/picture">
             <wp:extent cx="5577840" cy="6502930"/>
-            <wp:docPr id="24" name="Picture 24"/>
+            <wp:docPr id="29" name="Picture 29"/>
             <wp:cNvGraphicFramePr>
               <a:graphicFrameLocks noChangeAspect="1"/>
             </wp:cNvGraphicFramePr>
@@ -3834,7 +4079,7 @@
                     <pic:cNvPicPr/>
                   </pic:nvPicPr>
                   <pic:blipFill>
-                    <a:blip r:embed="rId32"/>
+                    <a:blip r:embed="rId37"/>
                     <a:stretch>
                       <a:fillRect/>
                     </a:stretch>
@@ -3867,13 +4112,55 @@
       </w:r>
     </w:p>
     <w:p>
+      <w:pPr>
+        <w:jc w:val="center"/>
+      </w:pPr>
+      <w:r>
+        <w:drawing>
+          <wp:inline xmlns:a="http://schemas.openxmlformats.org/drawingml/2006/main" xmlns:pic="http://schemas.openxmlformats.org/drawingml/2006/picture">
+            <wp:extent cx="5577840" cy="2654170"/>
+            <wp:docPr id="30" name="Picture 30"/>
+            <wp:cNvGraphicFramePr>
+              <a:graphicFrameLocks noChangeAspect="1"/>
+            </wp:cNvGraphicFramePr>
+            <a:graphic>
+              <a:graphicData uri="http://schemas.openxmlformats.org/drawingml/2006/picture">
+                <pic:pic>
+                  <pic:nvPicPr>
+                    <pic:cNvPr id="0" name="12_NiFi_salesforce_to_fabric_clean.png"/>
+                    <pic:cNvPicPr/>
+                  </pic:nvPicPr>
+                  <pic:blipFill>
+                    <a:blip r:embed="rId38"/>
+                    <a:stretch>
+                      <a:fillRect/>
+                    </a:stretch>
+                  </pic:blipFill>
+                  <pic:spPr>
+                    <a:xfrm>
+                      <a:off x="0" y="0"/>
+                      <a:ext cx="5577840" cy="2654170"/>
+                    </a:xfrm>
+                    <a:prstGeom prst="rect"/>
+                  </pic:spPr>
+                </pic:pic>
+              </a:graphicData>
+            </a:graphic>
+          </wp:inline>
+        </w:drawing>
+      </w:r>
+    </w:p>
+    <w:p>
+      <w:pPr>
+        <w:jc w:val="center"/>
+      </w:pPr>
       <w:r>
         <w:rPr>
           <w:i/>
           <w:color w:val="60646B"/>
           <w:sz w:val="17"/>
         </w:rPr>
-        <w:t>[Figure 11a not captured - run reporting/capture_evidence.py]</w:t>
+        <w:t>Figure 11a - Clean NiFi capture of the Salesforce-to-Fabric process group; browser tabs and the Windows taskbar are removed.</w:t>
       </w:r>
     </w:p>
     <w:p>
@@ -3909,7 +4196,7 @@
         <w:drawing>
           <wp:inline xmlns:a="http://schemas.openxmlformats.org/drawingml/2006/main" xmlns:pic="http://schemas.openxmlformats.org/drawingml/2006/picture">
             <wp:extent cx="5577840" cy="3651832"/>
-            <wp:docPr id="25" name="Picture 25"/>
+            <wp:docPr id="31" name="Picture 31"/>
             <wp:cNvGraphicFramePr>
               <a:graphicFrameLocks noChangeAspect="1"/>
             </wp:cNvGraphicFramePr>
@@ -3921,7 +4208,7 @@
                     <pic:cNvPicPr/>
                   </pic:nvPicPr>
                   <pic:blipFill>
-                    <a:blip r:embed="rId33"/>
+                    <a:blip r:embed="rId39"/>
                     <a:stretch>
                       <a:fillRect/>
                     </a:stretch>
@@ -3981,7 +4268,7 @@
         <w:drawing>
           <wp:inline xmlns:a="http://schemas.openxmlformats.org/drawingml/2006/main" xmlns:pic="http://schemas.openxmlformats.org/drawingml/2006/picture">
             <wp:extent cx="5577840" cy="2517775"/>
-            <wp:docPr id="26" name="Picture 26"/>
+            <wp:docPr id="32" name="Picture 32"/>
             <wp:cNvGraphicFramePr>
               <a:graphicFrameLocks noChangeAspect="1"/>
             </wp:cNvGraphicFramePr>
@@ -3993,7 +4280,7 @@
                     <pic:cNvPicPr/>
                   </pic:nvPicPr>
                   <pic:blipFill>
-                    <a:blip r:embed="rId34"/>
+                    <a:blip r:embed="rId40"/>
                     <a:stretch>
                       <a:fillRect/>
                     </a:stretch>
@@ -4037,7 +4324,37 @@
           <w:color w:val="1D1D1B"/>
           <w:sz w:val="32"/>
         </w:rPr>
-        <w:t>7.4  Screens from the org</w:t>
+        <w:t>7.4  Website SEO audit findings</w:t>
+      </w:r>
+    </w:p>
+    <w:p>
+      <w:r>
+        <w:t>A read-only crawl of every URL in the public XML sitemap was completed on 10 September 2026. It covered 561 sitemap URLs, 435 live HTTP 200 pages, titles, meta descriptions, canonical links, headings, social tags, JSON-LD, image alt text and mobile viewport markup. The full page-level results are in docs/SEO_AUDIT_2026-09-10.md with one machine-readable record per URL.</w:t>
+      </w:r>
+    </w:p>
+    <w:p>
+      <w:r>
+        <w:t>The highest-priority findings are 126 sitemap URLs returning a non-200 response, 5 pages without a title, 169 pages without a meta description, 435 live pages without a canonical link, 425 pages with more than one H1, 435 pages missing core Open Graph and Twitter card tags, 435 pages without JSON-LD structured data and 310 images with missing or empty alt text.</w:t>
+      </w:r>
+    </w:p>
+    <w:p>
+      <w:r>
+        <w:t>Recommended sequence: repair sitemap and redirect hygiene; define one metadata contract for programme, catalogue, blog and corporate templates; add self-canonicals, social tags, BreadcrumbList and appropriate course schema; enforce one H1; improve programme and application internal links; then rerun the crawl and reconcile coverage before release.</w:t>
+      </w:r>
+    </w:p>
+    <w:p>
+      <w:pPr>
+        <w:pStyle w:val="Heading2"/>
+        <w:spacing w:before="240"/>
+      </w:pPr>
+      <w:r>
+        <w:rPr>
+          <w:rFonts w:ascii="Calibri" w:hAnsi="Calibri"/>
+          <w:b/>
+          <w:color w:val="1D1D1B"/>
+          <w:sz w:val="32"/>
+        </w:rPr>
+        <w:t>7.5  Screens from the org</w:t>
       </w:r>
     </w:p>
     <w:p>
@@ -4048,7 +4365,7 @@
         <w:drawing>
           <wp:inline xmlns:a="http://schemas.openxmlformats.org/drawingml/2006/main" xmlns:pic="http://schemas.openxmlformats.org/drawingml/2006/picture">
             <wp:extent cx="5394960" cy="3260690"/>
-            <wp:docPr id="27" name="Picture 27"/>
+            <wp:docPr id="33" name="Picture 33"/>
             <wp:cNvGraphicFramePr>
               <a:graphicFrameLocks noChangeAspect="1"/>
             </wp:cNvGraphicFramePr>
@@ -4060,7 +4377,7 @@
                     <pic:cNvPicPr/>
                   </pic:nvPicPr>
                   <pic:blipFill>
-                    <a:blip r:embed="rId35"/>
+                    <a:blip r:embed="rId41"/>
                     <a:stretch>
                       <a:fillRect/>
                     </a:stretch>
@@ -4100,7 +4417,7 @@
         <w:drawing>
           <wp:inline xmlns:a="http://schemas.openxmlformats.org/drawingml/2006/main" xmlns:pic="http://schemas.openxmlformats.org/drawingml/2006/picture">
             <wp:extent cx="5394960" cy="2875206"/>
-            <wp:docPr id="28" name="Picture 28"/>
+            <wp:docPr id="34" name="Picture 34"/>
             <wp:cNvGraphicFramePr>
               <a:graphicFrameLocks noChangeAspect="1"/>
             </wp:cNvGraphicFramePr>
@@ -4112,7 +4429,7 @@
                     <pic:cNvPicPr/>
                   </pic:nvPicPr>
                   <pic:blipFill>
-                    <a:blip r:embed="rId36"/>
+                    <a:blip r:embed="rId42"/>
                     <a:stretch>
                       <a:fillRect/>
                     </a:stretch>
@@ -4152,7 +4469,7 @@
         <w:drawing>
           <wp:inline xmlns:a="http://schemas.openxmlformats.org/drawingml/2006/main" xmlns:pic="http://schemas.openxmlformats.org/drawingml/2006/picture">
             <wp:extent cx="5394960" cy="3034665"/>
-            <wp:docPr id="29" name="Picture 29"/>
+            <wp:docPr id="35" name="Picture 35"/>
             <wp:cNvGraphicFramePr>
               <a:graphicFrameLocks noChangeAspect="1"/>
             </wp:cNvGraphicFramePr>
@@ -4164,7 +4481,7 @@
                     <pic:cNvPicPr/>
                   </pic:nvPicPr>
                   <pic:blipFill>
-                    <a:blip r:embed="rId37"/>
+                    <a:blip r:embed="rId26"/>
                     <a:stretch>
                       <a:fillRect/>
                     </a:stretch>
@@ -4204,7 +4521,7 @@
         <w:drawing>
           <wp:inline xmlns:a="http://schemas.openxmlformats.org/drawingml/2006/main" xmlns:pic="http://schemas.openxmlformats.org/drawingml/2006/picture">
             <wp:extent cx="5394960" cy="3034665"/>
-            <wp:docPr id="30" name="Picture 30"/>
+            <wp:docPr id="36" name="Picture 36"/>
             <wp:cNvGraphicFramePr>
               <a:graphicFrameLocks noChangeAspect="1"/>
             </wp:cNvGraphicFramePr>
@@ -4216,7 +4533,7 @@
                     <pic:cNvPicPr/>
                   </pic:nvPicPr>
                   <pic:blipFill>
-                    <a:blip r:embed="rId38"/>
+                    <a:blip r:embed="rId27"/>
                     <a:stretch>
                       <a:fillRect/>
                     </a:stretch>
@@ -4256,7 +4573,7 @@
         <w:drawing>
           <wp:inline xmlns:a="http://schemas.openxmlformats.org/drawingml/2006/main" xmlns:pic="http://schemas.openxmlformats.org/drawingml/2006/picture">
             <wp:extent cx="5394960" cy="3034665"/>
-            <wp:docPr id="31" name="Picture 31"/>
+            <wp:docPr id="37" name="Picture 37"/>
             <wp:cNvGraphicFramePr>
               <a:graphicFrameLocks noChangeAspect="1"/>
             </wp:cNvGraphicFramePr>
@@ -4268,7 +4585,7 @@
                     <pic:cNvPicPr/>
                   </pic:nvPicPr>
                   <pic:blipFill>
-                    <a:blip r:embed="rId39"/>
+                    <a:blip r:embed="rId28"/>
                     <a:stretch>
                       <a:fillRect/>
                     </a:stretch>
@@ -4308,7 +4625,7 @@
         <w:drawing>
           <wp:inline xmlns:a="http://schemas.openxmlformats.org/drawingml/2006/main" xmlns:pic="http://schemas.openxmlformats.org/drawingml/2006/picture">
             <wp:extent cx="5394960" cy="3034665"/>
-            <wp:docPr id="32" name="Picture 32"/>
+            <wp:docPr id="38" name="Picture 38"/>
             <wp:cNvGraphicFramePr>
               <a:graphicFrameLocks noChangeAspect="1"/>
             </wp:cNvGraphicFramePr>
@@ -4320,7 +4637,7 @@
                     <pic:cNvPicPr/>
                   </pic:nvPicPr>
                   <pic:blipFill>
-                    <a:blip r:embed="rId40"/>
+                    <a:blip r:embed="rId29"/>
                     <a:stretch>
                       <a:fillRect/>
                     </a:stretch>
@@ -4360,7 +4677,7 @@
         <w:drawing>
           <wp:inline xmlns:a="http://schemas.openxmlformats.org/drawingml/2006/main" xmlns:pic="http://schemas.openxmlformats.org/drawingml/2006/picture">
             <wp:extent cx="5394960" cy="2567148"/>
-            <wp:docPr id="33" name="Picture 33"/>
+            <wp:docPr id="39" name="Picture 39"/>
             <wp:cNvGraphicFramePr>
               <a:graphicFrameLocks noChangeAspect="1"/>
             </wp:cNvGraphicFramePr>
@@ -4372,7 +4689,7 @@
                     <pic:cNvPicPr/>
                   </pic:nvPicPr>
                   <pic:blipFill>
-                    <a:blip r:embed="rId41"/>
+                    <a:blip r:embed="rId38"/>
                     <a:stretch>
                       <a:fillRect/>
                     </a:stretch>
@@ -4416,7 +4733,7 @@
           <w:color w:val="1D1D1B"/>
           <w:sz w:val="34"/>
         </w:rPr>
-        <w:t>7.5  What is not claimed</w:t>
+        <w:t>7.6  What is not claimed</w:t>
       </w:r>
     </w:p>
     <w:p>

</xml_diff>

<commit_message>
Add website-backed BA and SA improvement assessment
</commit_message>
<xml_diff>
--- a/ebook/RedAndYellow_Data_Story.docx
+++ b/ebook/RedAndYellow_Data_Story.docx
@@ -4354,7 +4354,42 @@
           <w:color w:val="1D1D1B"/>
           <w:sz w:val="32"/>
         </w:rPr>
-        <w:t>7.5  Screens from the org</w:t>
+        <w:t>7.5  Business analysis and systems analysis improvements</w:t>
+      </w:r>
+    </w:p>
+    <w:p>
+      <w:r>
+        <w:t>The website audit is also a requirements and architecture signal. The problems repeat by page template and system boundary, so the useful response is a BA/SA backlog with owners, acceptance evidence and release controls rather than a list of isolated edits. The detailed register is in docs/BA_SA_IMPROVEMENTS.md.</w:t>
+      </w:r>
+    </w:p>
+    <w:p>
+      <w:r>
+        <w:t>Business analysis priorities: agree one catalogue and KPI dictionary across on-campus and online delivery; label every count by source system and as-of date; define funnel denominators and attribution rules; and turn the marketing, admissions, student-success and data-quality signals into user stories with an owner, SLA and outcome measure.</w:t>
+      </w:r>
+    </w:p>
+    <w:p>
+      <w:r>
+        <w:t>Systems analysis priorities: choose the GA4 Data API route when curated metrics are sufficient, or the native BigQuery route when raw events are needed; keep website identifiers separate from CRM external IDs; add watermarks, run IDs, reject counts, retries and replay paths to NiFi and Fabric; and enforce website metadata, structured-data, heading and image controls at the template level.</w:t>
+      </w:r>
+    </w:p>
+    <w:p>
+      <w:r>
+        <w:t>The first release gate is explicit: non-200 sitemap entries are repaired or approved as redirects, catalogue and KPI definitions reconcile across Power BI and the warehouse, no slicer is blank-only, and every ML action has human review and a recorded outcome. These are improvements identified from the analysed website and platform evidence; no production website change is claimed here.</w:t>
+      </w:r>
+    </w:p>
+    <w:p>
+      <w:pPr>
+        <w:pStyle w:val="Heading2"/>
+        <w:spacing w:before="240"/>
+      </w:pPr>
+      <w:r>
+        <w:rPr>
+          <w:rFonts w:ascii="Calibri" w:hAnsi="Calibri"/>
+          <w:b/>
+          <w:color w:val="1D1D1B"/>
+          <w:sz w:val="32"/>
+        </w:rPr>
+        <w:t>7.6  Screens from the org</w:t>
       </w:r>
     </w:p>
     <w:p>
@@ -4733,7 +4768,7 @@
           <w:color w:val="1D1D1B"/>
           <w:sz w:val="34"/>
         </w:rPr>
-        <w:t>7.6  What is not claimed</w:t>
+        <w:t>7.7  What is not claimed</w:t>
       </w:r>
     </w:p>
     <w:p>

</xml_diff>

<commit_message>
Add Google Cloud and Fabric platform options
</commit_message>
<xml_diff>
--- a/ebook/RedAndYellow_Data_Story.docx
+++ b/ebook/RedAndYellow_Data_Story.docx
@@ -4324,7 +4324,94 @@
           <w:color w:val="1D1D1B"/>
           <w:sz w:val="32"/>
         </w:rPr>
-        <w:t>7.4  Website SEO audit findings</w:t>
+        <w:t>7.4  Two cloud platforms, one client decision</w:t>
+      </w:r>
+    </w:p>
+    <w:p>
+      <w:r>
+        <w:t>The project is intentionally portable so the client can choose between a Google Cloud-first and a Microsoft Fabric-first operating model. The business definitions, Salesforce boundary, source keys, quality rules, course-risk logic and Power BI semantic model stay the same; the landing and transformation services change.</w:t>
+      </w:r>
+    </w:p>
+    <w:p>
+      <w:r>
+        <w:t>Google Cloud is the stronger candidate when native GA4 raw-event export, BigQuery and a Google-first data team are the priority. BigQuery can hold raw events and Dataform can version, test and schedule the SQL models. Microsoft Fabric is the stronger candidate when Power BI, Microsoft identity and OneLake governance are already standard. The GA4 Data API can feed NiFi and OneLake without BigQuery; native raw-event export still requires BigQuery, followed by a Fabric connector.</w:t>
+      </w:r>
+    </w:p>
+    <w:p>
+      <w:r>
+        <w:t>The client should choose after two short pilots using the same acceptance pack: Salesforce reconciliation, GA4 row-count and date checks, transformation tests, Power BI refresh, course-risk outputs, cost guardrails and a replayed failure. The current repository proves the Salesforce, OneLake bronze, DuckDB/dbt, Power BI, ML and SEO components; neither cloud target is claimed as a completed production deployment.</w:t>
+      </w:r>
+    </w:p>
+    <w:p>
+      <w:pPr>
+        <w:jc w:val="center"/>
+      </w:pPr>
+      <w:r>
+        <w:drawing>
+          <wp:inline xmlns:a="http://schemas.openxmlformats.org/drawingml/2006/main" xmlns:pic="http://schemas.openxmlformats.org/drawingml/2006/picture">
+            <wp:extent cx="5577840" cy="3126971"/>
+            <wp:docPr id="33" name="Picture 33"/>
+            <wp:cNvGraphicFramePr>
+              <a:graphicFrameLocks noChangeAspect="1"/>
+            </wp:cNvGraphicFramePr>
+            <a:graphic>
+              <a:graphicData uri="http://schemas.openxmlformats.org/drawingml/2006/picture">
+                <pic:pic>
+                  <pic:nvPicPr>
+                    <pic:cNvPr id="0" name="platform_options.png"/>
+                    <pic:cNvPicPr/>
+                  </pic:nvPicPr>
+                  <pic:blipFill>
+                    <a:blip r:embed="rId41"/>
+                    <a:stretch>
+                      <a:fillRect/>
+                    </a:stretch>
+                  </pic:blipFill>
+                  <pic:spPr>
+                    <a:xfrm>
+                      <a:off x="0" y="0"/>
+                      <a:ext cx="5577840" cy="3126971"/>
+                    </a:xfrm>
+                    <a:prstGeom prst="rect"/>
+                  </pic:spPr>
+                </pic:pic>
+              </a:graphicData>
+            </a:graphic>
+          </wp:inline>
+        </w:drawing>
+      </w:r>
+    </w:p>
+    <w:p>
+      <w:pPr>
+        <w:jc w:val="center"/>
+      </w:pPr>
+      <w:r>
+        <w:rPr>
+          <w:i/>
+          <w:color w:val="60646B"/>
+          <w:sz w:val="17"/>
+        </w:rPr>
+        <w:t>Figure 14 - Equivalent Google Cloud and Microsoft Fabric options. The client selects the target after comparing the same acceptance pack.</w:t>
+      </w:r>
+    </w:p>
+    <w:p>
+      <w:r>
+        <w:t>The full decision matrix, trade-offs and pilot acceptance criteria are in docs/PLATFORM_OPTIONS.md.</w:t>
+      </w:r>
+    </w:p>
+    <w:p>
+      <w:pPr>
+        <w:pStyle w:val="Heading2"/>
+        <w:spacing w:before="240"/>
+      </w:pPr>
+      <w:r>
+        <w:rPr>
+          <w:rFonts w:ascii="Calibri" w:hAnsi="Calibri"/>
+          <w:b/>
+          <w:color w:val="1D1D1B"/>
+          <w:sz w:val="32"/>
+        </w:rPr>
+        <w:t>7.5  Website SEO audit findings</w:t>
       </w:r>
     </w:p>
     <w:p>
@@ -4354,7 +4441,7 @@
           <w:color w:val="1D1D1B"/>
           <w:sz w:val="32"/>
         </w:rPr>
-        <w:t>7.5  Business analysis and systems analysis improvements</w:t>
+        <w:t>7.6  Business analysis and systems analysis improvements</w:t>
       </w:r>
     </w:p>
     <w:p>
@@ -4389,7 +4476,7 @@
           <w:color w:val="1D1D1B"/>
           <w:sz w:val="32"/>
         </w:rPr>
-        <w:t>7.6  Screens from the org</w:t>
+        <w:t>7.7  Screens from the org</w:t>
       </w:r>
     </w:p>
     <w:p>
@@ -4400,7 +4487,7 @@
         <w:drawing>
           <wp:inline xmlns:a="http://schemas.openxmlformats.org/drawingml/2006/main" xmlns:pic="http://schemas.openxmlformats.org/drawingml/2006/picture">
             <wp:extent cx="5394960" cy="3260690"/>
-            <wp:docPr id="33" name="Picture 33"/>
+            <wp:docPr id="34" name="Picture 34"/>
             <wp:cNvGraphicFramePr>
               <a:graphicFrameLocks noChangeAspect="1"/>
             </wp:cNvGraphicFramePr>
@@ -4412,7 +4499,7 @@
                     <pic:cNvPicPr/>
                   </pic:nvPicPr>
                   <pic:blipFill>
-                    <a:blip r:embed="rId41"/>
+                    <a:blip r:embed="rId42"/>
                     <a:stretch>
                       <a:fillRect/>
                     </a:stretch>
@@ -4452,7 +4539,7 @@
         <w:drawing>
           <wp:inline xmlns:a="http://schemas.openxmlformats.org/drawingml/2006/main" xmlns:pic="http://schemas.openxmlformats.org/drawingml/2006/picture">
             <wp:extent cx="5394960" cy="2875206"/>
-            <wp:docPr id="34" name="Picture 34"/>
+            <wp:docPr id="35" name="Picture 35"/>
             <wp:cNvGraphicFramePr>
               <a:graphicFrameLocks noChangeAspect="1"/>
             </wp:cNvGraphicFramePr>
@@ -4464,7 +4551,7 @@
                     <pic:cNvPicPr/>
                   </pic:nvPicPr>
                   <pic:blipFill>
-                    <a:blip r:embed="rId42"/>
+                    <a:blip r:embed="rId43"/>
                     <a:stretch>
                       <a:fillRect/>
                     </a:stretch>
@@ -4504,7 +4591,7 @@
         <w:drawing>
           <wp:inline xmlns:a="http://schemas.openxmlformats.org/drawingml/2006/main" xmlns:pic="http://schemas.openxmlformats.org/drawingml/2006/picture">
             <wp:extent cx="5394960" cy="3034665"/>
-            <wp:docPr id="35" name="Picture 35"/>
+            <wp:docPr id="36" name="Picture 36"/>
             <wp:cNvGraphicFramePr>
               <a:graphicFrameLocks noChangeAspect="1"/>
             </wp:cNvGraphicFramePr>
@@ -4556,7 +4643,7 @@
         <w:drawing>
           <wp:inline xmlns:a="http://schemas.openxmlformats.org/drawingml/2006/main" xmlns:pic="http://schemas.openxmlformats.org/drawingml/2006/picture">
             <wp:extent cx="5394960" cy="3034665"/>
-            <wp:docPr id="36" name="Picture 36"/>
+            <wp:docPr id="37" name="Picture 37"/>
             <wp:cNvGraphicFramePr>
               <a:graphicFrameLocks noChangeAspect="1"/>
             </wp:cNvGraphicFramePr>
@@ -4608,7 +4695,7 @@
         <w:drawing>
           <wp:inline xmlns:a="http://schemas.openxmlformats.org/drawingml/2006/main" xmlns:pic="http://schemas.openxmlformats.org/drawingml/2006/picture">
             <wp:extent cx="5394960" cy="3034665"/>
-            <wp:docPr id="37" name="Picture 37"/>
+            <wp:docPr id="38" name="Picture 38"/>
             <wp:cNvGraphicFramePr>
               <a:graphicFrameLocks noChangeAspect="1"/>
             </wp:cNvGraphicFramePr>
@@ -4660,7 +4747,7 @@
         <w:drawing>
           <wp:inline xmlns:a="http://schemas.openxmlformats.org/drawingml/2006/main" xmlns:pic="http://schemas.openxmlformats.org/drawingml/2006/picture">
             <wp:extent cx="5394960" cy="3034665"/>
-            <wp:docPr id="38" name="Picture 38"/>
+            <wp:docPr id="39" name="Picture 39"/>
             <wp:cNvGraphicFramePr>
               <a:graphicFrameLocks noChangeAspect="1"/>
             </wp:cNvGraphicFramePr>
@@ -4712,7 +4799,7 @@
         <w:drawing>
           <wp:inline xmlns:a="http://schemas.openxmlformats.org/drawingml/2006/main" xmlns:pic="http://schemas.openxmlformats.org/drawingml/2006/picture">
             <wp:extent cx="5394960" cy="2567148"/>
-            <wp:docPr id="39" name="Picture 39"/>
+            <wp:docPr id="40" name="Picture 40"/>
             <wp:cNvGraphicFramePr>
               <a:graphicFrameLocks noChangeAspect="1"/>
             </wp:cNvGraphicFramePr>
@@ -4768,7 +4855,7 @@
           <w:color w:val="1D1D1B"/>
           <w:sz w:val="34"/>
         </w:rPr>
-        <w:t>7.7  What is not claimed</w:t>
+        <w:t>7.8  What is not claimed</w:t>
       </w:r>
     </w:p>
     <w:p>

</xml_diff>

<commit_message>
Document GA4 and Google Marketing Platform ingestion options
</commit_message>
<xml_diff>
--- a/ebook/RedAndYellow_Data_Story.docx
+++ b/ebook/RedAndYellow_Data_Story.docx
@@ -4411,7 +4411,99 @@
           <w:color w:val="1D1D1B"/>
           <w:sz w:val="32"/>
         </w:rPr>
-        <w:t>7.5  Website SEO audit findings</w:t>
+        <w:t>7.5  GA4, DV360 and Campaign Manager 360 into BigQuery and Fabric</w:t>
+      </w:r>
+    </w:p>
+    <w:p>
+      <w:r>
+        <w:t>There is an easy route when the client only needs campaign and landing-page metrics: call the GA4 Data API and the DV360 or Campaign Manager 360 reporting APIs on a schedule, land the files through NiFi or a small cloud job, and write dated partitions to OneLake or BigQuery. This avoids BigQuery for GA4 curated reports, but it does not provide every raw GA4 event parameter.</w:t>
+      </w:r>
+    </w:p>
+    <w:p>
+      <w:r>
+        <w:t>Use the Google-native route when raw event or log-level analysis is required. GA4 native export writes raw events to BigQuery; DV360 reporting can be generated through the Bid Manager API, and Campaign Manager 360 reports can be created and run through its Reports API. Where the account has the relevant Google Marketing Platform transfer entitlement, those exports can land in Google Cloud storage or BigQuery before transformation.</w:t>
+      </w:r>
+    </w:p>
+    <w:p>
+      <w:r>
+        <w:t>For a Fabric-first client, Fabric Data Factory can copy BigQuery data into OneLake, after which the existing Fabric Warehouse/dbt and Power BI model applies. There is no single direct DV360/CM360-to-Fabric connector that replaces source authentication, report scheduling and schema control; the API or BigQuery landing step remains the clean boundary.</w:t>
+      </w:r>
+    </w:p>
+    <w:p>
+      <w:r>
+        <w:t>The practical choice is therefore driven by grain: choose APIs for a small, curated daily scorecard; choose BigQuery export or transfer for raw event, path-to-conversion or log-level analysis; and choose the Fabric landing route when Power BI and Microsoft governance are already strategic.</w:t>
+      </w:r>
+    </w:p>
+    <w:p>
+      <w:pPr>
+        <w:jc w:val="center"/>
+      </w:pPr>
+      <w:r>
+        <w:drawing>
+          <wp:inline xmlns:a="http://schemas.openxmlformats.org/drawingml/2006/main" xmlns:pic="http://schemas.openxmlformats.org/drawingml/2006/picture">
+            <wp:extent cx="5577840" cy="4141124"/>
+            <wp:docPr id="34" name="Picture 34"/>
+            <wp:cNvGraphicFramePr>
+              <a:graphicFrameLocks noChangeAspect="1"/>
+            </wp:cNvGraphicFramePr>
+            <a:graphic>
+              <a:graphicData uri="http://schemas.openxmlformats.org/drawingml/2006/picture">
+                <pic:pic>
+                  <pic:nvPicPr>
+                    <pic:cNvPr id="0" name="ga4_gmp_to_fabric.png"/>
+                    <pic:cNvPicPr/>
+                  </pic:nvPicPr>
+                  <pic:blipFill>
+                    <a:blip r:embed="rId42"/>
+                    <a:stretch>
+                      <a:fillRect/>
+                    </a:stretch>
+                  </pic:blipFill>
+                  <pic:spPr>
+                    <a:xfrm>
+                      <a:off x="0" y="0"/>
+                      <a:ext cx="5577840" cy="4141124"/>
+                    </a:xfrm>
+                    <a:prstGeom prst="rect"/>
+                  </pic:spPr>
+                </pic:pic>
+              </a:graphicData>
+            </a:graphic>
+          </wp:inline>
+        </w:drawing>
+      </w:r>
+    </w:p>
+    <w:p>
+      <w:pPr>
+        <w:jc w:val="center"/>
+      </w:pPr>
+      <w:r>
+        <w:rPr>
+          <w:i/>
+          <w:color w:val="60646B"/>
+          <w:sz w:val="17"/>
+        </w:rPr>
+        <w:t>Figure 15 - Three implementation patterns for GA4, DV360 and Campaign Manager 360.</w:t>
+      </w:r>
+    </w:p>
+    <w:p>
+      <w:r>
+        <w:t>The step-by-step setup, field contracts and source links are in docs/GA4_DV360_CM360_FABRIC_GUIDE.md.</w:t>
+      </w:r>
+    </w:p>
+    <w:p>
+      <w:pPr>
+        <w:pStyle w:val="Heading2"/>
+        <w:spacing w:before="240"/>
+      </w:pPr>
+      <w:r>
+        <w:rPr>
+          <w:rFonts w:ascii="Calibri" w:hAnsi="Calibri"/>
+          <w:b/>
+          <w:color w:val="1D1D1B"/>
+          <w:sz w:val="32"/>
+        </w:rPr>
+        <w:t>7.6  Website SEO audit findings</w:t>
       </w:r>
     </w:p>
     <w:p>
@@ -4441,7 +4533,7 @@
           <w:color w:val="1D1D1B"/>
           <w:sz w:val="32"/>
         </w:rPr>
-        <w:t>7.6  Business analysis and systems analysis improvements</w:t>
+        <w:t>7.7  Business analysis and systems analysis improvements</w:t>
       </w:r>
     </w:p>
     <w:p>
@@ -4476,7 +4568,7 @@
           <w:color w:val="1D1D1B"/>
           <w:sz w:val="32"/>
         </w:rPr>
-        <w:t>7.7  Screens from the org</w:t>
+        <w:t>7.8  Screens from the org</w:t>
       </w:r>
     </w:p>
     <w:p>
@@ -4487,7 +4579,7 @@
         <w:drawing>
           <wp:inline xmlns:a="http://schemas.openxmlformats.org/drawingml/2006/main" xmlns:pic="http://schemas.openxmlformats.org/drawingml/2006/picture">
             <wp:extent cx="5394960" cy="3260690"/>
-            <wp:docPr id="34" name="Picture 34"/>
+            <wp:docPr id="35" name="Picture 35"/>
             <wp:cNvGraphicFramePr>
               <a:graphicFrameLocks noChangeAspect="1"/>
             </wp:cNvGraphicFramePr>
@@ -4499,7 +4591,7 @@
                     <pic:cNvPicPr/>
                   </pic:nvPicPr>
                   <pic:blipFill>
-                    <a:blip r:embed="rId42"/>
+                    <a:blip r:embed="rId43"/>
                     <a:stretch>
                       <a:fillRect/>
                     </a:stretch>
@@ -4539,7 +4631,7 @@
         <w:drawing>
           <wp:inline xmlns:a="http://schemas.openxmlformats.org/drawingml/2006/main" xmlns:pic="http://schemas.openxmlformats.org/drawingml/2006/picture">
             <wp:extent cx="5394960" cy="2875206"/>
-            <wp:docPr id="35" name="Picture 35"/>
+            <wp:docPr id="36" name="Picture 36"/>
             <wp:cNvGraphicFramePr>
               <a:graphicFrameLocks noChangeAspect="1"/>
             </wp:cNvGraphicFramePr>
@@ -4551,7 +4643,7 @@
                     <pic:cNvPicPr/>
                   </pic:nvPicPr>
                   <pic:blipFill>
-                    <a:blip r:embed="rId43"/>
+                    <a:blip r:embed="rId44"/>
                     <a:stretch>
                       <a:fillRect/>
                     </a:stretch>
@@ -4591,7 +4683,7 @@
         <w:drawing>
           <wp:inline xmlns:a="http://schemas.openxmlformats.org/drawingml/2006/main" xmlns:pic="http://schemas.openxmlformats.org/drawingml/2006/picture">
             <wp:extent cx="5394960" cy="3034665"/>
-            <wp:docPr id="36" name="Picture 36"/>
+            <wp:docPr id="37" name="Picture 37"/>
             <wp:cNvGraphicFramePr>
               <a:graphicFrameLocks noChangeAspect="1"/>
             </wp:cNvGraphicFramePr>
@@ -4643,7 +4735,7 @@
         <w:drawing>
           <wp:inline xmlns:a="http://schemas.openxmlformats.org/drawingml/2006/main" xmlns:pic="http://schemas.openxmlformats.org/drawingml/2006/picture">
             <wp:extent cx="5394960" cy="3034665"/>
-            <wp:docPr id="37" name="Picture 37"/>
+            <wp:docPr id="38" name="Picture 38"/>
             <wp:cNvGraphicFramePr>
               <a:graphicFrameLocks noChangeAspect="1"/>
             </wp:cNvGraphicFramePr>
@@ -4695,7 +4787,7 @@
         <w:drawing>
           <wp:inline xmlns:a="http://schemas.openxmlformats.org/drawingml/2006/main" xmlns:pic="http://schemas.openxmlformats.org/drawingml/2006/picture">
             <wp:extent cx="5394960" cy="3034665"/>
-            <wp:docPr id="38" name="Picture 38"/>
+            <wp:docPr id="39" name="Picture 39"/>
             <wp:cNvGraphicFramePr>
               <a:graphicFrameLocks noChangeAspect="1"/>
             </wp:cNvGraphicFramePr>
@@ -4747,7 +4839,7 @@
         <w:drawing>
           <wp:inline xmlns:a="http://schemas.openxmlformats.org/drawingml/2006/main" xmlns:pic="http://schemas.openxmlformats.org/drawingml/2006/picture">
             <wp:extent cx="5394960" cy="3034665"/>
-            <wp:docPr id="39" name="Picture 39"/>
+            <wp:docPr id="40" name="Picture 40"/>
             <wp:cNvGraphicFramePr>
               <a:graphicFrameLocks noChangeAspect="1"/>
             </wp:cNvGraphicFramePr>
@@ -4799,7 +4891,7 @@
         <w:drawing>
           <wp:inline xmlns:a="http://schemas.openxmlformats.org/drawingml/2006/main" xmlns:pic="http://schemas.openxmlformats.org/drawingml/2006/picture">
             <wp:extent cx="5394960" cy="2567148"/>
-            <wp:docPr id="40" name="Picture 40"/>
+            <wp:docPr id="41" name="Picture 41"/>
             <wp:cNvGraphicFramePr>
               <a:graphicFrameLocks noChangeAspect="1"/>
             </wp:cNvGraphicFramePr>
@@ -4855,7 +4947,7 @@
           <w:color w:val="1D1D1B"/>
           <w:sz w:val="34"/>
         </w:rPr>
-        <w:t>7.8  What is not claimed</w:t>
+        <w:t>7.9  What is not claimed</w:t>
       </w:r>
     </w:p>
     <w:p>

</xml_diff>

<commit_message>
Standardize ebook figure alignment
</commit_message>
<xml_diff>
--- a/ebook/RedAndYellow_Data_Story.docx
+++ b/ebook/RedAndYellow_Data_Story.docx
@@ -9,6 +9,8 @@
     </w:p>
     <w:p>
       <w:pPr>
+        <w:keepNext/>
+        <w:spacing w:after="80"/>
         <w:jc w:val="center"/>
       </w:pPr>
       <w:r>
@@ -288,6 +290,8 @@
     </w:p>
     <w:p>
       <w:pPr>
+        <w:keepNext/>
+        <w:spacing w:after="80"/>
         <w:jc w:val="center"/>
       </w:pPr>
       <w:r>
@@ -340,6 +344,8 @@
     </w:p>
     <w:p>
       <w:pPr>
+        <w:keepNext/>
+        <w:spacing w:after="80"/>
         <w:jc w:val="center"/>
       </w:pPr>
       <w:r>
@@ -617,6 +623,8 @@
     <w:p/>
     <w:p>
       <w:pPr>
+        <w:keepNext/>
+        <w:spacing w:after="80"/>
         <w:jc w:val="center"/>
       </w:pPr>
       <w:r>
@@ -694,6 +702,8 @@
     </w:p>
     <w:p>
       <w:pPr>
+        <w:keepNext/>
+        <w:spacing w:after="80"/>
         <w:jc w:val="center"/>
       </w:pPr>
       <w:r>
@@ -766,6 +776,8 @@
     </w:p>
     <w:p>
       <w:pPr>
+        <w:keepNext/>
+        <w:spacing w:after="80"/>
         <w:jc w:val="center"/>
       </w:pPr>
       <w:r>
@@ -843,6 +855,8 @@
     </w:p>
     <w:p>
       <w:pPr>
+        <w:keepNext/>
+        <w:spacing w:after="80"/>
         <w:jc w:val="center"/>
       </w:pPr>
       <w:r>
@@ -950,6 +964,8 @@
     </w:p>
     <w:p>
       <w:pPr>
+        <w:keepNext/>
+        <w:spacing w:after="80"/>
         <w:jc w:val="center"/>
       </w:pPr>
       <w:r>
@@ -1616,6 +1632,8 @@
     </w:p>
     <w:p>
       <w:pPr>
+        <w:keepNext/>
+        <w:spacing w:after="80"/>
         <w:jc w:val="center"/>
       </w:pPr>
       <w:r>
@@ -1693,6 +1711,8 @@
     </w:p>
     <w:p>
       <w:pPr>
+        <w:keepNext/>
+        <w:spacing w:after="80"/>
         <w:jc w:val="center"/>
       </w:pPr>
       <w:r>
@@ -1765,6 +1785,8 @@
     </w:p>
     <w:p>
       <w:pPr>
+        <w:keepNext/>
+        <w:spacing w:after="80"/>
         <w:jc w:val="center"/>
       </w:pPr>
       <w:r>
@@ -1817,6 +1839,8 @@
     </w:p>
     <w:p>
       <w:pPr>
+        <w:keepNext/>
+        <w:spacing w:after="80"/>
         <w:jc w:val="center"/>
       </w:pPr>
       <w:r>
@@ -1889,6 +1913,8 @@
     </w:p>
     <w:p>
       <w:pPr>
+        <w:keepNext/>
+        <w:spacing w:after="80"/>
         <w:jc w:val="center"/>
       </w:pPr>
       <w:r>
@@ -2146,6 +2172,8 @@
     </w:p>
     <w:p>
       <w:pPr>
+        <w:keepNext/>
+        <w:spacing w:after="80"/>
         <w:jc w:val="center"/>
       </w:pPr>
       <w:r>
@@ -2218,6 +2246,8 @@
     </w:p>
     <w:p>
       <w:pPr>
+        <w:keepNext/>
+        <w:spacing w:after="80"/>
         <w:jc w:val="center"/>
       </w:pPr>
       <w:r>
@@ -2300,6 +2330,8 @@
     </w:p>
     <w:p>
       <w:pPr>
+        <w:keepNext/>
+        <w:spacing w:after="80"/>
         <w:jc w:val="center"/>
       </w:pPr>
       <w:r>
@@ -2352,6 +2384,8 @@
     </w:p>
     <w:p>
       <w:pPr>
+        <w:keepNext/>
+        <w:spacing w:after="80"/>
         <w:jc w:val="center"/>
       </w:pPr>
       <w:r>
@@ -2424,6 +2458,8 @@
     </w:p>
     <w:p>
       <w:pPr>
+        <w:keepNext/>
+        <w:spacing w:after="80"/>
         <w:jc w:val="center"/>
       </w:pPr>
       <w:r>
@@ -2476,6 +2512,8 @@
     </w:p>
     <w:p>
       <w:pPr>
+        <w:keepNext/>
+        <w:spacing w:after="80"/>
         <w:jc w:val="center"/>
       </w:pPr>
       <w:r>
@@ -2528,6 +2566,8 @@
     </w:p>
     <w:p>
       <w:pPr>
+        <w:keepNext/>
+        <w:spacing w:after="80"/>
         <w:jc w:val="center"/>
       </w:pPr>
       <w:r>
@@ -2580,6 +2620,8 @@
     </w:p>
     <w:p>
       <w:pPr>
+        <w:keepNext/>
+        <w:spacing w:after="80"/>
         <w:jc w:val="center"/>
       </w:pPr>
       <w:r>
@@ -2652,6 +2694,8 @@
     </w:p>
     <w:p>
       <w:pPr>
+        <w:keepNext/>
+        <w:spacing w:after="80"/>
         <w:jc w:val="center"/>
       </w:pPr>
       <w:r>
@@ -2724,6 +2768,8 @@
     </w:p>
     <w:p>
       <w:pPr>
+        <w:keepNext/>
+        <w:spacing w:after="80"/>
         <w:jc w:val="center"/>
       </w:pPr>
       <w:r>
@@ -2982,6 +3028,8 @@
     </w:p>
     <w:p>
       <w:pPr>
+        <w:keepNext/>
+        <w:spacing w:after="80"/>
         <w:jc w:val="center"/>
       </w:pPr>
       <w:r>
@@ -3034,6 +3082,8 @@
     </w:p>
     <w:p>
       <w:pPr>
+        <w:keepNext/>
+        <w:spacing w:after="80"/>
         <w:jc w:val="center"/>
       </w:pPr>
       <w:r>
@@ -3820,6 +3870,8 @@
     <w:p/>
     <w:p>
       <w:pPr>
+        <w:keepNext/>
+        <w:spacing w:after="80"/>
         <w:jc w:val="center"/>
       </w:pPr>
       <w:r>
@@ -3892,12 +3944,14 @@
     </w:p>
     <w:p>
       <w:pPr>
+        <w:keepNext/>
+        <w:spacing w:after="80"/>
         <w:jc w:val="center"/>
       </w:pPr>
       <w:r>
         <w:drawing>
           <wp:inline xmlns:a="http://schemas.openxmlformats.org/drawingml/2006/main" xmlns:pic="http://schemas.openxmlformats.org/drawingml/2006/picture">
-            <wp:extent cx="5669280" cy="4251960"/>
+            <wp:extent cx="5577840" cy="4183380"/>
             <wp:docPr id="27" name="Picture 27"/>
             <wp:cNvGraphicFramePr>
               <a:graphicFrameLocks noChangeAspect="1"/>
@@ -3918,7 +3972,7 @@
                   <pic:spPr>
                     <a:xfrm>
                       <a:off x="0" y="0"/>
-                      <a:ext cx="5669280" cy="4251960"/>
+                      <a:ext cx="5577840" cy="4183380"/>
                     </a:xfrm>
                     <a:prstGeom prst="rect"/>
                   </pic:spPr>
@@ -3964,6 +4018,8 @@
     </w:p>
     <w:p>
       <w:pPr>
+        <w:keepNext/>
+        <w:spacing w:after="80"/>
         <w:jc w:val="center"/>
       </w:pPr>
       <w:r>
@@ -4061,6 +4117,8 @@
     </w:p>
     <w:p>
       <w:pPr>
+        <w:keepNext/>
+        <w:spacing w:after="80"/>
         <w:jc w:val="center"/>
       </w:pPr>
       <w:r>
@@ -4113,6 +4171,8 @@
     </w:p>
     <w:p>
       <w:pPr>
+        <w:keepNext/>
+        <w:spacing w:after="80"/>
         <w:jc w:val="center"/>
       </w:pPr>
       <w:r>
@@ -4190,6 +4250,8 @@
     </w:p>
     <w:p>
       <w:pPr>
+        <w:keepNext/>
+        <w:spacing w:after="80"/>
         <w:jc w:val="center"/>
       </w:pPr>
       <w:r>
@@ -4262,6 +4324,8 @@
     </w:p>
     <w:p>
       <w:pPr>
+        <w:keepNext/>
+        <w:spacing w:after="80"/>
         <w:jc w:val="center"/>
       </w:pPr>
       <w:r>
@@ -4344,6 +4408,8 @@
     </w:p>
     <w:p>
       <w:pPr>
+        <w:keepNext/>
+        <w:spacing w:after="80"/>
         <w:jc w:val="center"/>
       </w:pPr>
       <w:r>
@@ -4436,6 +4502,8 @@
     </w:p>
     <w:p>
       <w:pPr>
+        <w:keepNext/>
+        <w:spacing w:after="80"/>
         <w:jc w:val="center"/>
       </w:pPr>
       <w:r>
@@ -4573,12 +4641,14 @@
     </w:p>
     <w:p>
       <w:pPr>
+        <w:keepNext/>
+        <w:spacing w:after="80"/>
         <w:jc w:val="center"/>
       </w:pPr>
       <w:r>
         <w:drawing>
           <wp:inline xmlns:a="http://schemas.openxmlformats.org/drawingml/2006/main" xmlns:pic="http://schemas.openxmlformats.org/drawingml/2006/picture">
-            <wp:extent cx="5394960" cy="3260690"/>
+            <wp:extent cx="5577840" cy="3371222"/>
             <wp:docPr id="35" name="Picture 35"/>
             <wp:cNvGraphicFramePr>
               <a:graphicFrameLocks noChangeAspect="1"/>
@@ -4599,7 +4669,7 @@
                   <pic:spPr>
                     <a:xfrm>
                       <a:off x="0" y="0"/>
-                      <a:ext cx="5394960" cy="3260690"/>
+                      <a:ext cx="5577840" cy="3371222"/>
                     </a:xfrm>
                     <a:prstGeom prst="rect"/>
                   </pic:spPr>
@@ -4625,12 +4695,14 @@
     </w:p>
     <w:p>
       <w:pPr>
+        <w:keepNext/>
+        <w:spacing w:after="80"/>
         <w:jc w:val="center"/>
       </w:pPr>
       <w:r>
         <w:drawing>
           <wp:inline xmlns:a="http://schemas.openxmlformats.org/drawingml/2006/main" xmlns:pic="http://schemas.openxmlformats.org/drawingml/2006/picture">
-            <wp:extent cx="5394960" cy="2875206"/>
+            <wp:extent cx="5577840" cy="2972670"/>
             <wp:docPr id="36" name="Picture 36"/>
             <wp:cNvGraphicFramePr>
               <a:graphicFrameLocks noChangeAspect="1"/>
@@ -4651,7 +4723,7 @@
                   <pic:spPr>
                     <a:xfrm>
                       <a:off x="0" y="0"/>
-                      <a:ext cx="5394960" cy="2875206"/>
+                      <a:ext cx="5577840" cy="2972670"/>
                     </a:xfrm>
                     <a:prstGeom prst="rect"/>
                   </pic:spPr>
@@ -4677,12 +4749,14 @@
     </w:p>
     <w:p>
       <w:pPr>
+        <w:keepNext/>
+        <w:spacing w:after="80"/>
         <w:jc w:val="center"/>
       </w:pPr>
       <w:r>
         <w:drawing>
           <wp:inline xmlns:a="http://schemas.openxmlformats.org/drawingml/2006/main" xmlns:pic="http://schemas.openxmlformats.org/drawingml/2006/picture">
-            <wp:extent cx="5394960" cy="3034665"/>
+            <wp:extent cx="5577840" cy="3137535"/>
             <wp:docPr id="37" name="Picture 37"/>
             <wp:cNvGraphicFramePr>
               <a:graphicFrameLocks noChangeAspect="1"/>
@@ -4703,7 +4777,7 @@
                   <pic:spPr>
                     <a:xfrm>
                       <a:off x="0" y="0"/>
-                      <a:ext cx="5394960" cy="3034665"/>
+                      <a:ext cx="5577840" cy="3137535"/>
                     </a:xfrm>
                     <a:prstGeom prst="rect"/>
                   </pic:spPr>
@@ -4729,12 +4803,14 @@
     </w:p>
     <w:p>
       <w:pPr>
+        <w:keepNext/>
+        <w:spacing w:after="80"/>
         <w:jc w:val="center"/>
       </w:pPr>
       <w:r>
         <w:drawing>
           <wp:inline xmlns:a="http://schemas.openxmlformats.org/drawingml/2006/main" xmlns:pic="http://schemas.openxmlformats.org/drawingml/2006/picture">
-            <wp:extent cx="5394960" cy="3034665"/>
+            <wp:extent cx="5577840" cy="3137535"/>
             <wp:docPr id="38" name="Picture 38"/>
             <wp:cNvGraphicFramePr>
               <a:graphicFrameLocks noChangeAspect="1"/>
@@ -4755,7 +4831,7 @@
                   <pic:spPr>
                     <a:xfrm>
                       <a:off x="0" y="0"/>
-                      <a:ext cx="5394960" cy="3034665"/>
+                      <a:ext cx="5577840" cy="3137535"/>
                     </a:xfrm>
                     <a:prstGeom prst="rect"/>
                   </pic:spPr>
@@ -4781,12 +4857,14 @@
     </w:p>
     <w:p>
       <w:pPr>
+        <w:keepNext/>
+        <w:spacing w:after="80"/>
         <w:jc w:val="center"/>
       </w:pPr>
       <w:r>
         <w:drawing>
           <wp:inline xmlns:a="http://schemas.openxmlformats.org/drawingml/2006/main" xmlns:pic="http://schemas.openxmlformats.org/drawingml/2006/picture">
-            <wp:extent cx="5394960" cy="3034665"/>
+            <wp:extent cx="5577840" cy="3137535"/>
             <wp:docPr id="39" name="Picture 39"/>
             <wp:cNvGraphicFramePr>
               <a:graphicFrameLocks noChangeAspect="1"/>
@@ -4807,7 +4885,7 @@
                   <pic:spPr>
                     <a:xfrm>
                       <a:off x="0" y="0"/>
-                      <a:ext cx="5394960" cy="3034665"/>
+                      <a:ext cx="5577840" cy="3137535"/>
                     </a:xfrm>
                     <a:prstGeom prst="rect"/>
                   </pic:spPr>
@@ -4833,12 +4911,14 @@
     </w:p>
     <w:p>
       <w:pPr>
+        <w:keepNext/>
+        <w:spacing w:after="80"/>
         <w:jc w:val="center"/>
       </w:pPr>
       <w:r>
         <w:drawing>
           <wp:inline xmlns:a="http://schemas.openxmlformats.org/drawingml/2006/main" xmlns:pic="http://schemas.openxmlformats.org/drawingml/2006/picture">
-            <wp:extent cx="5394960" cy="3034665"/>
+            <wp:extent cx="5577840" cy="3137535"/>
             <wp:docPr id="40" name="Picture 40"/>
             <wp:cNvGraphicFramePr>
               <a:graphicFrameLocks noChangeAspect="1"/>
@@ -4859,7 +4939,7 @@
                   <pic:spPr>
                     <a:xfrm>
                       <a:off x="0" y="0"/>
-                      <a:ext cx="5394960" cy="3034665"/>
+                      <a:ext cx="5577840" cy="3137535"/>
                     </a:xfrm>
                     <a:prstGeom prst="rect"/>
                   </pic:spPr>
@@ -4885,12 +4965,14 @@
     </w:p>
     <w:p>
       <w:pPr>
+        <w:keepNext/>
+        <w:spacing w:after="80"/>
         <w:jc w:val="center"/>
       </w:pPr>
       <w:r>
         <w:drawing>
           <wp:inline xmlns:a="http://schemas.openxmlformats.org/drawingml/2006/main" xmlns:pic="http://schemas.openxmlformats.org/drawingml/2006/picture">
-            <wp:extent cx="5394960" cy="2567148"/>
+            <wp:extent cx="5577840" cy="2654170"/>
             <wp:docPr id="41" name="Picture 41"/>
             <wp:cNvGraphicFramePr>
               <a:graphicFrameLocks noChangeAspect="1"/>
@@ -4911,7 +4993,7 @@
                   <pic:spPr>
                     <a:xfrm>
                       <a:off x="0" y="0"/>
-                      <a:ext cx="5394960" cy="2567148"/>
+                      <a:ext cx="5577840" cy="2654170"/>
                     </a:xfrm>
                     <a:prstGeom prst="rect"/>
                   </pic:spPr>

</xml_diff>